<commit_message>
Added summary for experts
</commit_message>
<xml_diff>
--- a/BoardTesting/FireFly_installation_for_TF.docx
+++ b/BoardTesting/FireFly_installation_for_TF.docx
@@ -8,13 +8,8 @@
       </w:pPr>
       <w:bookmarkStart w:id="0" w:name="_Hlk114559237"/>
       <w:bookmarkEnd w:id="0"/>
-      <w:proofErr w:type="spellStart"/>
-      <w:r>
-        <w:t>FireFly</w:t>
-      </w:r>
-      <w:proofErr w:type="spellEnd"/>
-      <w:r>
-        <w:t xml:space="preserve"> Installation for TF on CMv3 (</w:t>
+      <w:r>
+        <w:t>FireFly Installation for TF on CMv3 (</w:t>
       </w:r>
       <w:r>
         <w:t>6089-</w:t>
@@ -30,28 +25,110 @@
       </w:r>
       <w:r>
         <w:t>A)</w:t>
+      </w:r>
+    </w:p>
+    <w:p/>
+    <w:p>
+      <w:pPr>
+        <w:pStyle w:val="Heading3"/>
+      </w:pPr>
+      <w:r>
+        <w:t>Summary</w:t>
       </w:r>
     </w:p>
     <w:p>
       <w:pPr>
-        <w:pStyle w:val="NoSpacing"/>
-        <w:ind w:left="1440"/>
-      </w:pPr>
+        <w:pStyle w:val="ListParagraph"/>
+        <w:numPr>
+          <w:ilvl w:val="0"/>
+          <w:numId w:val="39"/>
+        </w:numPr>
+      </w:pPr>
+      <w:r>
+        <w:t>Set FireFly transmitter voltage slide switches</w:t>
+      </w:r>
     </w:p>
     <w:p>
       <w:pPr>
+        <w:pStyle w:val="ListParagraph"/>
+        <w:numPr>
+          <w:ilvl w:val="0"/>
+          <w:numId w:val="39"/>
+        </w:numPr>
+      </w:pPr>
+      <w:r>
+        <w:t>Reinstall standoffs</w:t>
+      </w:r>
+    </w:p>
+    <w:p>
+      <w:pPr>
+        <w:pStyle w:val="ListParagraph"/>
+        <w:numPr>
+          <w:ilvl w:val="0"/>
+          <w:numId w:val="39"/>
+        </w:numPr>
+      </w:pPr>
+      <w:r>
+        <w:t>Prepare and attach front panel</w:t>
+      </w:r>
+    </w:p>
+    <w:p>
+      <w:pPr>
+        <w:pStyle w:val="ListParagraph"/>
+        <w:numPr>
+          <w:ilvl w:val="0"/>
+          <w:numId w:val="39"/>
+        </w:numPr>
+      </w:pPr>
+      <w:r>
+        <w:t>Install FireFly modules</w:t>
+      </w:r>
+    </w:p>
+    <w:p>
+      <w:pPr>
+        <w:pStyle w:val="ListParagraph"/>
+        <w:numPr>
+          <w:ilvl w:val="0"/>
+          <w:numId w:val="39"/>
+        </w:numPr>
+      </w:pPr>
+      <w:r>
+        <w:t>Install FireFly heatsink thermal foam and heatsink</w:t>
+      </w:r>
+    </w:p>
+    <w:p>
+      <w:pPr>
+        <w:pStyle w:val="ListParagraph"/>
+        <w:numPr>
+          <w:ilvl w:val="0"/>
+          <w:numId w:val="39"/>
+        </w:numPr>
+      </w:pPr>
+      <w:r>
+        <w:t>Route FireFly cables to front panel coupler block</w:t>
+      </w:r>
+    </w:p>
+    <w:p>
+      <w:pPr>
+        <w:pStyle w:val="ListParagraph"/>
+        <w:numPr>
+          <w:ilvl w:val="0"/>
+          <w:numId w:val="39"/>
+        </w:numPr>
+      </w:pPr>
+      <w:r>
+        <w:t>Label front panel coupler block</w:t>
+      </w:r>
+    </w:p>
+    <w:p>
+      <w:pPr>
         <w:pStyle w:val="Heading3"/>
       </w:pPr>
       <w:r>
         <w:t xml:space="preserve">Set </w:t>
       </w:r>
-      <w:proofErr w:type="spellStart"/>
-      <w:r>
-        <w:t>FireFly</w:t>
-      </w:r>
-      <w:proofErr w:type="spellEnd"/>
-      <w:r>
-        <w:t xml:space="preserve"> </w:t>
+      <w:r>
+        <w:t xml:space="preserve">FireFly </w:t>
       </w:r>
       <w:r>
         <w:t xml:space="preserve">transmitter voltage </w:t>
@@ -102,15 +179,7 @@
         <w:t xml:space="preserve"> to the “3.8V” position. This </w:t>
       </w:r>
       <w:r>
-        <w:t xml:space="preserve">set the transmitter voltage for the </w:t>
-      </w:r>
-      <w:proofErr w:type="spellStart"/>
-      <w:r>
-        <w:t>FireFly</w:t>
-      </w:r>
-      <w:proofErr w:type="spellEnd"/>
-      <w:r>
-        <w:t xml:space="preserve"> in site “U39”. (FPGA #2 quads 125/126/127)</w:t>
+        <w:t>set the transmitter voltage for the FireFly in site “U39”. (FPGA #2 quads 125/126/127)</w:t>
       </w:r>
     </w:p>
     <w:p>
@@ -191,7 +260,7 @@
           </mc:Choice>
           <mc:Fallback>
             <w:pict>
-              <v:shapetype w14:anchorId="58F9701C" id="_x0000_t32" coordsize="21600,21600" o:spt="32" o:oned="t" path="m,l21600,21600e" filled="f">
+              <v:shapetype w14:anchorId="71D5C5FC" id="_x0000_t32" coordsize="21600,21600" o:spt="32" o:oned="t" path="m,l21600,21600e" filled="f">
                 <v:path arrowok="t" fillok="f" o:connecttype="none"/>
                 <o:lock v:ext="edit" shapetype="t"/>
               </v:shapetype>
@@ -271,7 +340,7 @@
           </mc:Choice>
           <mc:Fallback>
             <w:pict>
-              <v:shape w14:anchorId="6F4FF335" id="Straight Arrow Connector 2039020294" o:spid="_x0000_s1026" type="#_x0000_t32" style="position:absolute;margin-left:365.25pt;margin-top:33.25pt;width:3.75pt;height:65.25pt;flip:y;z-index:251910144;visibility:visible;mso-wrap-style:square;mso-width-percent:0;mso-height-percent:0;mso-wrap-distance-left:9pt;mso-wrap-distance-top:0;mso-wrap-distance-right:9pt;mso-wrap-distance-bottom:0;mso-position-horizontal:absolute;mso-position-horizontal-relative:margin;mso-position-vertical:absolute;mso-position-vertical-relative:text;mso-width-percent:0;mso-height-percent:0;mso-width-relative:margin;mso-height-relative:margin" o:gfxdata="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" strokecolor="red" strokeweight="2pt">
+              <v:shape w14:anchorId="3194CEDE" id="Straight Arrow Connector 2039020294" o:spid="_x0000_s1026" type="#_x0000_t32" style="position:absolute;margin-left:365.25pt;margin-top:33.25pt;width:3.75pt;height:65.25pt;flip:y;z-index:251910144;visibility:visible;mso-wrap-style:square;mso-width-percent:0;mso-height-percent:0;mso-wrap-distance-left:9pt;mso-wrap-distance-top:0;mso-wrap-distance-right:9pt;mso-wrap-distance-bottom:0;mso-position-horizontal:absolute;mso-position-horizontal-relative:margin;mso-position-vertical:absolute;mso-position-vertical-relative:text;mso-width-percent:0;mso-height-percent:0;mso-width-relative:margin;mso-height-relative:margin" o:gfxdata="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" strokecolor="red" strokeweight="2pt">
                 <v:stroke endarrow="open"/>
                 <w10:wrap anchorx="margin"/>
               </v:shape>
@@ -602,7 +671,7 @@
           </mc:Choice>
           <mc:Fallback>
             <w:pict>
-              <v:shape w14:anchorId="622FE3EA" id="Straight Arrow Connector 74" o:spid="_x0000_s1026" type="#_x0000_t32" style="position:absolute;margin-left:96.75pt;margin-top:60.5pt;width:192pt;height:63.75pt;flip:x y;z-index:251799552;visibility:visible;mso-wrap-style:square;mso-width-percent:0;mso-height-percent:0;mso-wrap-distance-left:9pt;mso-wrap-distance-top:0;mso-wrap-distance-right:9pt;mso-wrap-distance-bottom:0;mso-position-horizontal:absolute;mso-position-horizontal-relative:margin;mso-position-vertical:absolute;mso-position-vertical-relative:text;mso-width-percent:0;mso-height-percent:0;mso-width-relative:margin;mso-height-relative:margin" o:gfxdata="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" strokecolor="red" strokeweight="2pt">
+              <v:shape w14:anchorId="3B481DC6" id="Straight Arrow Connector 74" o:spid="_x0000_s1026" type="#_x0000_t32" style="position:absolute;margin-left:96.75pt;margin-top:60.5pt;width:192pt;height:63.75pt;flip:x y;z-index:251799552;visibility:visible;mso-wrap-style:square;mso-width-percent:0;mso-height-percent:0;mso-wrap-distance-left:9pt;mso-wrap-distance-top:0;mso-wrap-distance-right:9pt;mso-wrap-distance-bottom:0;mso-position-horizontal:absolute;mso-position-horizontal-relative:margin;mso-position-vertical:absolute;mso-position-vertical-relative:text;mso-width-percent:0;mso-height-percent:0;mso-width-relative:margin;mso-height-relative:margin" o:gfxdata="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" strokecolor="red" strokeweight="2pt">
                 <v:stroke endarrow="open"/>
                 <w10:wrap anchorx="margin"/>
               </v:shape>
@@ -1061,7 +1130,7 @@
         <w:t xml:space="preserve">Reinstall </w:t>
       </w:r>
       <w:r>
-        <w:t>standoffs and spacers</w:t>
+        <w:t>standoffs</w:t>
       </w:r>
     </w:p>
     <w:p>
@@ -1070,15 +1139,7 @@
         <w:ind w:left="360"/>
       </w:pPr>
       <w:r>
-        <w:t xml:space="preserve">Several standoffs may have been removed to facilitate testing the board with copper </w:t>
-      </w:r>
-      <w:proofErr w:type="spellStart"/>
-      <w:r>
-        <w:t>FireFly</w:t>
-      </w:r>
-      <w:proofErr w:type="spellEnd"/>
-      <w:r>
-        <w:t xml:space="preserve"> cables. If so, they need to be replaced.</w:t>
+        <w:t>Several standoffs may have been removed to facilitate testing the board with copper FireFly cables. If so, they need to be replaced.</w:t>
       </w:r>
     </w:p>
     <w:p>
@@ -1160,7 +1221,7 @@
           </mc:Choice>
           <mc:Fallback>
             <w:pict>
-              <v:shape w14:anchorId="448D60CD" id="Straight Arrow Connector 57148215" o:spid="_x0000_s1026" type="#_x0000_t32" style="position:absolute;margin-left:74.25pt;margin-top:56.65pt;width:51pt;height:56.25pt;flip:x y;z-index:251924480;visibility:visible;mso-wrap-style:square;mso-width-percent:0;mso-height-percent:0;mso-wrap-distance-left:9pt;mso-wrap-distance-top:0;mso-wrap-distance-right:9pt;mso-wrap-distance-bottom:0;mso-position-horizontal:absolute;mso-position-horizontal-relative:margin;mso-position-vertical:absolute;mso-position-vertical-relative:text;mso-width-percent:0;mso-height-percent:0;mso-width-relative:margin;mso-height-relative:margin" o:gfxdata="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" strokecolor="red" strokeweight="2pt">
+              <v:shape w14:anchorId="5133DD06" id="Straight Arrow Connector 57148215" o:spid="_x0000_s1026" type="#_x0000_t32" style="position:absolute;margin-left:74.25pt;margin-top:56.65pt;width:51pt;height:56.25pt;flip:x y;z-index:251924480;visibility:visible;mso-wrap-style:square;mso-width-percent:0;mso-height-percent:0;mso-wrap-distance-left:9pt;mso-wrap-distance-top:0;mso-wrap-distance-right:9pt;mso-wrap-distance-bottom:0;mso-position-horizontal:absolute;mso-position-horizontal-relative:margin;mso-position-vertical:absolute;mso-position-vertical-relative:text;mso-width-percent:0;mso-height-percent:0;mso-width-relative:margin;mso-height-relative:margin" o:gfxdata="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" strokecolor="red" strokeweight="2pt">
                 <v:stroke endarrow="open"/>
                 <w10:wrap anchorx="margin"/>
               </v:shape>
@@ -1236,7 +1297,7 @@
           </mc:Choice>
           <mc:Fallback>
             <w:pict>
-              <v:shape w14:anchorId="08B22FC8" id="Straight Arrow Connector 514012959" o:spid="_x0000_s1026" type="#_x0000_t32" style="position:absolute;margin-left:126.75pt;margin-top:58.9pt;width:309.75pt;height:53.25pt;flip:y;z-index:251928576;visibility:visible;mso-wrap-style:square;mso-width-percent:0;mso-height-percent:0;mso-wrap-distance-left:9pt;mso-wrap-distance-top:0;mso-wrap-distance-right:9pt;mso-wrap-distance-bottom:0;mso-position-horizontal:absolute;mso-position-horizontal-relative:margin;mso-position-vertical:absolute;mso-position-vertical-relative:text;mso-width-percent:0;mso-height-percent:0;mso-width-relative:margin;mso-height-relative:margin" o:gfxdata="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" strokecolor="red" strokeweight="2pt">
+              <v:shape w14:anchorId="48B96BE7" id="Straight Arrow Connector 514012959" o:spid="_x0000_s1026" type="#_x0000_t32" style="position:absolute;margin-left:126.75pt;margin-top:58.9pt;width:309.75pt;height:53.25pt;flip:y;z-index:251928576;visibility:visible;mso-wrap-style:square;mso-width-percent:0;mso-height-percent:0;mso-wrap-distance-left:9pt;mso-wrap-distance-top:0;mso-wrap-distance-right:9pt;mso-wrap-distance-bottom:0;mso-position-horizontal:absolute;mso-position-horizontal-relative:margin;mso-position-vertical:absolute;mso-position-vertical-relative:text;mso-width-percent:0;mso-height-percent:0;mso-width-relative:margin;mso-height-relative:margin" o:gfxdata="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" strokecolor="red" strokeweight="2pt">
                 <v:stroke endarrow="open"/>
                 <w10:wrap anchorx="margin"/>
               </v:shape>
@@ -1312,7 +1373,7 @@
           </mc:Choice>
           <mc:Fallback>
             <w:pict>
-              <v:shape w14:anchorId="49C38EF6" id="Straight Arrow Connector 1686765160" o:spid="_x0000_s1026" type="#_x0000_t32" style="position:absolute;margin-left:126pt;margin-top:57.4pt;width:106.5pt;height:54pt;flip:y;z-index:251926528;visibility:visible;mso-wrap-style:square;mso-width-percent:0;mso-height-percent:0;mso-wrap-distance-left:9pt;mso-wrap-distance-top:0;mso-wrap-distance-right:9pt;mso-wrap-distance-bottom:0;mso-position-horizontal:absolute;mso-position-horizontal-relative:margin;mso-position-vertical:absolute;mso-position-vertical-relative:text;mso-width-percent:0;mso-height-percent:0;mso-width-relative:margin;mso-height-relative:margin" o:gfxdata="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" strokecolor="red" strokeweight="2pt">
+              <v:shape w14:anchorId="17B0A696" id="Straight Arrow Connector 1686765160" o:spid="_x0000_s1026" type="#_x0000_t32" style="position:absolute;margin-left:126pt;margin-top:57.4pt;width:106.5pt;height:54pt;flip:y;z-index:251926528;visibility:visible;mso-wrap-style:square;mso-width-percent:0;mso-height-percent:0;mso-wrap-distance-left:9pt;mso-wrap-distance-top:0;mso-wrap-distance-right:9pt;mso-wrap-distance-bottom:0;mso-position-horizontal:absolute;mso-position-horizontal-relative:margin;mso-position-vertical:absolute;mso-position-vertical-relative:text;mso-width-percent:0;mso-height-percent:0;mso-width-relative:margin;mso-height-relative:margin" o:gfxdata="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" strokecolor="red" strokeweight="2pt">
                 <v:stroke endarrow="open"/>
                 <w10:wrap anchorx="margin"/>
               </v:shape>
@@ -1388,7 +1449,7 @@
           </mc:Choice>
           <mc:Fallback>
             <w:pict>
-              <v:shape w14:anchorId="2222A5F5" id="Straight Arrow Connector 1008327664" o:spid="_x0000_s1026" type="#_x0000_t32" style="position:absolute;margin-left:315pt;margin-top:57.4pt;width:34.5pt;height:53.25pt;flip:x y;z-index:251918336;visibility:visible;mso-wrap-style:square;mso-width-percent:0;mso-height-percent:0;mso-wrap-distance-left:9pt;mso-wrap-distance-top:0;mso-wrap-distance-right:9pt;mso-wrap-distance-bottom:0;mso-position-horizontal:absolute;mso-position-horizontal-relative:margin;mso-position-vertical:absolute;mso-position-vertical-relative:text;mso-width-percent:0;mso-height-percent:0;mso-width-relative:margin;mso-height-relative:margin" o:gfxdata="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" strokecolor="red" strokeweight="2pt">
+              <v:shape w14:anchorId="20275B52" id="Straight Arrow Connector 1008327664" o:spid="_x0000_s1026" type="#_x0000_t32" style="position:absolute;margin-left:315pt;margin-top:57.4pt;width:34.5pt;height:53.25pt;flip:x y;z-index:251918336;visibility:visible;mso-wrap-style:square;mso-width-percent:0;mso-height-percent:0;mso-wrap-distance-left:9pt;mso-wrap-distance-top:0;mso-wrap-distance-right:9pt;mso-wrap-distance-bottom:0;mso-position-horizontal:absolute;mso-position-horizontal-relative:margin;mso-position-vertical:absolute;mso-position-vertical-relative:text;mso-width-percent:0;mso-height-percent:0;mso-width-relative:margin;mso-height-relative:margin" o:gfxdata="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" strokecolor="red" strokeweight="2pt">
                 <v:stroke endarrow="open"/>
                 <w10:wrap anchorx="margin"/>
               </v:shape>
@@ -1464,7 +1525,7 @@
           </mc:Choice>
           <mc:Fallback>
             <w:pict>
-              <v:shape w14:anchorId="24AE26FD" id="Straight Arrow Connector 261041720" o:spid="_x0000_s1026" type="#_x0000_t32" style="position:absolute;margin-left:156.75pt;margin-top:55.9pt;width:193.5pt;height:57pt;flip:x y;z-index:251920384;visibility:visible;mso-wrap-style:square;mso-width-percent:0;mso-height-percent:0;mso-wrap-distance-left:9pt;mso-wrap-distance-top:0;mso-wrap-distance-right:9pt;mso-wrap-distance-bottom:0;mso-position-horizontal:absolute;mso-position-horizontal-relative:margin;mso-position-vertical:absolute;mso-position-vertical-relative:text;mso-width-percent:0;mso-height-percent:0;mso-width-relative:margin;mso-height-relative:margin" o:gfxdata="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" strokecolor="red" strokeweight="2pt">
+              <v:shape w14:anchorId="50965441" id="Straight Arrow Connector 261041720" o:spid="_x0000_s1026" type="#_x0000_t32" style="position:absolute;margin-left:156.75pt;margin-top:55.9pt;width:193.5pt;height:57pt;flip:x y;z-index:251920384;visibility:visible;mso-wrap-style:square;mso-width-percent:0;mso-height-percent:0;mso-wrap-distance-left:9pt;mso-wrap-distance-top:0;mso-wrap-distance-right:9pt;mso-wrap-distance-bottom:0;mso-position-horizontal:absolute;mso-position-horizontal-relative:margin;mso-position-vertical:absolute;mso-position-vertical-relative:text;mso-width-percent:0;mso-height-percent:0;mso-width-relative:margin;mso-height-relative:margin" o:gfxdata="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" strokecolor="red" strokeweight="2pt">
                 <v:stroke endarrow="open"/>
                 <w10:wrap anchorx="margin"/>
               </v:shape>
@@ -1595,29 +1656,12 @@
                               </w:rPr>
                               <w:t xml:space="preserve">Missing </w:t>
                             </w:r>
-                            <w:proofErr w:type="spellStart"/>
                             <w:r>
                               <w:rPr>
                                 <w:sz w:val="28"/>
                                 <w:szCs w:val="28"/>
                               </w:rPr>
-                              <w:t>FireFly</w:t>
-                            </w:r>
-                            <w:proofErr w:type="spellEnd"/>
-                            <w:r>
-                              <w:rPr>
-                                <w:sz w:val="28"/>
-                                <w:szCs w:val="28"/>
-                              </w:rPr>
-                              <w:t xml:space="preserve"> </w:t>
-                            </w:r>
-                            <w:proofErr w:type="gramStart"/>
-                            <w:r>
-                              <w:rPr>
-                                <w:sz w:val="28"/>
-                                <w:szCs w:val="28"/>
-                              </w:rPr>
-                              <w:t xml:space="preserve">heatsink </w:t>
+                              <w:t>FireFly heatsink</w:t>
                             </w:r>
                             <w:r>
                               <w:rPr>
@@ -1626,7 +1670,6 @@
                               </w:rPr>
                               <w:t xml:space="preserve"> standoffs</w:t>
                             </w:r>
-                            <w:proofErr w:type="gramEnd"/>
                           </w:p>
                           <w:p>
                             <w:pPr>
@@ -1684,29 +1727,12 @@
                         </w:rPr>
                         <w:t xml:space="preserve">Missing </w:t>
                       </w:r>
-                      <w:proofErr w:type="spellStart"/>
                       <w:r>
                         <w:rPr>
                           <w:sz w:val="28"/>
                           <w:szCs w:val="28"/>
                         </w:rPr>
-                        <w:t>FireFly</w:t>
-                      </w:r>
-                      <w:proofErr w:type="spellEnd"/>
-                      <w:r>
-                        <w:rPr>
-                          <w:sz w:val="28"/>
-                          <w:szCs w:val="28"/>
-                        </w:rPr>
-                        <w:t xml:space="preserve"> </w:t>
-                      </w:r>
-                      <w:proofErr w:type="gramStart"/>
-                      <w:r>
-                        <w:rPr>
-                          <w:sz w:val="28"/>
-                          <w:szCs w:val="28"/>
-                        </w:rPr>
-                        <w:t xml:space="preserve">heatsink </w:t>
+                        <w:t>FireFly heatsink</w:t>
                       </w:r>
                       <w:r>
                         <w:rPr>
@@ -1715,7 +1741,6 @@
                         </w:rPr>
                         <w:t xml:space="preserve"> standoffs</w:t>
                       </w:r>
-                      <w:proofErr w:type="gramEnd"/>
                     </w:p>
                     <w:p>
                       <w:pPr>
@@ -2144,19 +2169,11 @@
         </w:rPr>
         <w:t xml:space="preserve">mm long </w:t>
       </w:r>
-      <w:proofErr w:type="spellStart"/>
-      <w:r>
-        <w:rPr>
-          <w:color w:val="000000" w:themeColor="text1"/>
-        </w:rPr>
-        <w:t>FireFly</w:t>
-      </w:r>
-      <w:proofErr w:type="spellEnd"/>
-      <w:r>
-        <w:rPr>
-          <w:color w:val="000000" w:themeColor="text1"/>
-        </w:rPr>
-        <w:t xml:space="preserve"> heatsink</w:t>
+      <w:r>
+        <w:rPr>
+          <w:color w:val="000000" w:themeColor="text1"/>
+        </w:rPr>
+        <w:t>FireFly heatsink</w:t>
       </w:r>
       <w:r>
         <w:rPr>
@@ -2450,7 +2467,7 @@
           </mc:Choice>
           <mc:Fallback>
             <w:pict>
-              <v:shape w14:anchorId="5EE87BFA" id="Straight Arrow Connector 788476765" o:spid="_x0000_s1026" type="#_x0000_t32" style="position:absolute;margin-left:63pt;margin-top:33.8pt;width:215.25pt;height:47.25pt;flip:x y;z-index:251935744;visibility:visible;mso-wrap-style:square;mso-width-percent:0;mso-height-percent:0;mso-wrap-distance-left:9pt;mso-wrap-distance-top:0;mso-wrap-distance-right:9pt;mso-wrap-distance-bottom:0;mso-position-horizontal:absolute;mso-position-horizontal-relative:margin;mso-position-vertical:absolute;mso-position-vertical-relative:text;mso-width-percent:0;mso-height-percent:0;mso-width-relative:margin;mso-height-relative:margin" o:gfxdata="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" strokecolor="red" strokeweight="2pt">
+              <v:shape w14:anchorId="58977C85" id="Straight Arrow Connector 788476765" o:spid="_x0000_s1026" type="#_x0000_t32" style="position:absolute;margin-left:63pt;margin-top:33.8pt;width:215.25pt;height:47.25pt;flip:x y;z-index:251935744;visibility:visible;mso-wrap-style:square;mso-width-percent:0;mso-height-percent:0;mso-wrap-distance-left:9pt;mso-wrap-distance-top:0;mso-wrap-distance-right:9pt;mso-wrap-distance-bottom:0;mso-position-horizontal:absolute;mso-position-horizontal-relative:margin;mso-position-vertical:absolute;mso-position-vertical-relative:text;mso-width-percent:0;mso-height-percent:0;mso-width-relative:margin;mso-height-relative:margin" o:gfxdata="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" strokecolor="red" strokeweight="2pt">
                 <v:stroke endarrow="open"/>
                 <w10:wrap anchorx="margin"/>
               </v:shape>
@@ -2526,7 +2543,7 @@
           </mc:Choice>
           <mc:Fallback>
             <w:pict>
-              <v:shape w14:anchorId="533AC4E8" id="Straight Arrow Connector 1679677813" o:spid="_x0000_s1026" type="#_x0000_t32" style="position:absolute;margin-left:279pt;margin-top:24.8pt;width:24pt;height:58.5pt;flip:y;z-index:251937792;visibility:visible;mso-wrap-style:square;mso-width-percent:0;mso-height-percent:0;mso-wrap-distance-left:9pt;mso-wrap-distance-top:0;mso-wrap-distance-right:9pt;mso-wrap-distance-bottom:0;mso-position-horizontal:absolute;mso-position-horizontal-relative:margin;mso-position-vertical:absolute;mso-position-vertical-relative:text;mso-width-percent:0;mso-height-percent:0;mso-width-relative:margin;mso-height-relative:margin" o:gfxdata="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" strokecolor="red" strokeweight="2pt">
+              <v:shape w14:anchorId="1872D35F" id="Straight Arrow Connector 1679677813" o:spid="_x0000_s1026" type="#_x0000_t32" style="position:absolute;margin-left:279pt;margin-top:24.8pt;width:24pt;height:58.5pt;flip:y;z-index:251937792;visibility:visible;mso-wrap-style:square;mso-width-percent:0;mso-height-percent:0;mso-wrap-distance-left:9pt;mso-wrap-distance-top:0;mso-wrap-distance-right:9pt;mso-wrap-distance-bottom:0;mso-position-horizontal:absolute;mso-position-horizontal-relative:margin;mso-position-vertical:absolute;mso-position-vertical-relative:text;mso-width-percent:0;mso-height-percent:0;mso-width-relative:margin;mso-height-relative:margin" o:gfxdata="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" strokecolor="red" strokeweight="2pt">
                 <v:stroke endarrow="open"/>
                 <w10:wrap anchorx="margin"/>
               </v:shape>
@@ -2602,7 +2619,7 @@
           </mc:Choice>
           <mc:Fallback>
             <w:pict>
-              <v:shape w14:anchorId="346F5CAB" id="Straight Arrow Connector 81" o:spid="_x0000_s1026" type="#_x0000_t32" style="position:absolute;margin-left:276pt;margin-top:20.3pt;width:187.5pt;height:62.25pt;flip:y;z-index:251933696;visibility:visible;mso-wrap-style:square;mso-width-percent:0;mso-height-percent:0;mso-wrap-distance-left:9pt;mso-wrap-distance-top:0;mso-wrap-distance-right:9pt;mso-wrap-distance-bottom:0;mso-position-horizontal:absolute;mso-position-horizontal-relative:margin;mso-position-vertical:absolute;mso-position-vertical-relative:text;mso-width-percent:0;mso-height-percent:0;mso-width-relative:margin;mso-height-relative:margin" o:gfxdata="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" strokecolor="red" strokeweight="2pt">
+              <v:shape w14:anchorId="6B756E35" id="Straight Arrow Connector 81" o:spid="_x0000_s1026" type="#_x0000_t32" style="position:absolute;margin-left:276pt;margin-top:20.3pt;width:187.5pt;height:62.25pt;flip:y;z-index:251933696;visibility:visible;mso-wrap-style:square;mso-width-percent:0;mso-height-percent:0;mso-wrap-distance-left:9pt;mso-wrap-distance-top:0;mso-wrap-distance-right:9pt;mso-wrap-distance-bottom:0;mso-position-horizontal:absolute;mso-position-horizontal-relative:margin;mso-position-vertical:absolute;mso-position-vertical-relative:text;mso-width-percent:0;mso-height-percent:0;mso-width-relative:margin;mso-height-relative:margin" o:gfxdata="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" strokecolor="red" strokeweight="2pt">
                 <v:stroke endarrow="open"/>
                 <w10:wrap anchorx="margin"/>
               </v:shape>
@@ -2869,14 +2886,7 @@
         <w:rPr>
           <w:color w:val="000000" w:themeColor="text1"/>
         </w:rPr>
-        <w:t xml:space="preserve"> plus M2.5 </w:t>
-      </w:r>
-      <w:proofErr w:type="spellStart"/>
-      <w:r>
-        <w:rPr>
-          <w:color w:val="000000" w:themeColor="text1"/>
-        </w:rPr>
-        <w:t>lockwasher</w:t>
+        <w:t xml:space="preserve"> plus M2.5 lockwasher</w:t>
       </w:r>
       <w:r>
         <w:rPr>
@@ -2884,7 +2894,6 @@
         </w:rPr>
         <w:t>s</w:t>
       </w:r>
-      <w:proofErr w:type="spellEnd"/>
       <w:r>
         <w:rPr>
           <w:color w:val="000000" w:themeColor="text1"/>
@@ -3099,7 +3108,7 @@
           </mc:Choice>
           <mc:Fallback>
             <w:pict>
-              <v:shape w14:anchorId="3042B2AC" id="Straight Arrow Connector 1023974195" o:spid="_x0000_s1026" type="#_x0000_t32" style="position:absolute;margin-left:255pt;margin-top:81.15pt;width:18pt;height:54pt;flip:x y;z-index:251952128;visibility:visible;mso-wrap-style:square;mso-width-percent:0;mso-height-percent:0;mso-wrap-distance-left:9pt;mso-wrap-distance-top:0;mso-wrap-distance-right:9pt;mso-wrap-distance-bottom:0;mso-position-horizontal:absolute;mso-position-horizontal-relative:margin;mso-position-vertical:absolute;mso-position-vertical-relative:text;mso-width-percent:0;mso-height-percent:0;mso-width-relative:margin;mso-height-relative:margin" o:gfxdata="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" strokecolor="red" strokeweight="2pt">
+              <v:shape w14:anchorId="13208506" id="Straight Arrow Connector 1023974195" o:spid="_x0000_s1026" type="#_x0000_t32" style="position:absolute;margin-left:255pt;margin-top:81.15pt;width:18pt;height:54pt;flip:x y;z-index:251952128;visibility:visible;mso-wrap-style:square;mso-width-percent:0;mso-height-percent:0;mso-wrap-distance-left:9pt;mso-wrap-distance-top:0;mso-wrap-distance-right:9pt;mso-wrap-distance-bottom:0;mso-position-horizontal:absolute;mso-position-horizontal-relative:margin;mso-position-vertical:absolute;mso-position-vertical-relative:text;mso-width-percent:0;mso-height-percent:0;mso-width-relative:margin;mso-height-relative:margin" o:gfxdata="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" strokecolor="red" strokeweight="2pt">
                 <v:stroke endarrow="open"/>
                 <w10:wrap anchorx="margin"/>
               </v:shape>
@@ -3175,7 +3184,7 @@
           </mc:Choice>
           <mc:Fallback>
             <w:pict>
-              <v:shape w14:anchorId="5D49E1FA" id="Straight Arrow Connector 1950249803" o:spid="_x0000_s1026" type="#_x0000_t32" style="position:absolute;margin-left:117.75pt;margin-top:51.15pt;width:152.25pt;height:82.5pt;flip:y;z-index:251943936;visibility:visible;mso-wrap-style:square;mso-width-percent:0;mso-height-percent:0;mso-wrap-distance-left:9pt;mso-wrap-distance-top:0;mso-wrap-distance-right:9pt;mso-wrap-distance-bottom:0;mso-position-horizontal:absolute;mso-position-horizontal-relative:margin;mso-position-vertical:absolute;mso-position-vertical-relative:text;mso-width-percent:0;mso-height-percent:0;mso-width-relative:margin;mso-height-relative:margin" o:gfxdata="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" strokecolor="red" strokeweight="2pt">
+              <v:shape w14:anchorId="1172D0CD" id="Straight Arrow Connector 1950249803" o:spid="_x0000_s1026" type="#_x0000_t32" style="position:absolute;margin-left:117.75pt;margin-top:51.15pt;width:152.25pt;height:82.5pt;flip:y;z-index:251943936;visibility:visible;mso-wrap-style:square;mso-width-percent:0;mso-height-percent:0;mso-wrap-distance-left:9pt;mso-wrap-distance-top:0;mso-wrap-distance-right:9pt;mso-wrap-distance-bottom:0;mso-position-horizontal:absolute;mso-position-horizontal-relative:margin;mso-position-vertical:absolute;mso-position-vertical-relative:text;mso-width-percent:0;mso-height-percent:0;mso-width-relative:margin;mso-height-relative:margin" o:gfxdata="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" strokecolor="red" strokeweight="2pt">
                 <v:stroke endarrow="open"/>
                 <w10:wrap anchorx="margin"/>
               </v:shape>
@@ -3251,7 +3260,7 @@
           </mc:Choice>
           <mc:Fallback>
             <w:pict>
-              <v:shape w14:anchorId="59006FDA" id="Straight Arrow Connector 1521149731" o:spid="_x0000_s1026" type="#_x0000_t32" style="position:absolute;margin-left:105pt;margin-top:51.9pt;width:10.5pt;height:82.5pt;flip:x y;z-index:251941888;visibility:visible;mso-wrap-style:square;mso-width-percent:0;mso-height-percent:0;mso-wrap-distance-left:9pt;mso-wrap-distance-top:0;mso-wrap-distance-right:9pt;mso-wrap-distance-bottom:0;mso-position-horizontal:absolute;mso-position-horizontal-relative:margin;mso-position-vertical:absolute;mso-position-vertical-relative:text;mso-width-percent:0;mso-height-percent:0;mso-width-relative:margin;mso-height-relative:margin" o:gfxdata="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" strokecolor="red" strokeweight="2pt">
+              <v:shape w14:anchorId="752002D6" id="Straight Arrow Connector 1521149731" o:spid="_x0000_s1026" type="#_x0000_t32" style="position:absolute;margin-left:105pt;margin-top:51.9pt;width:10.5pt;height:82.5pt;flip:x y;z-index:251941888;visibility:visible;mso-wrap-style:square;mso-width-percent:0;mso-height-percent:0;mso-wrap-distance-left:9pt;mso-wrap-distance-top:0;mso-wrap-distance-right:9pt;mso-wrap-distance-bottom:0;mso-position-horizontal:absolute;mso-position-horizontal-relative:margin;mso-position-vertical:absolute;mso-position-vertical-relative:text;mso-width-percent:0;mso-height-percent:0;mso-width-relative:margin;mso-height-relative:margin" o:gfxdata="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" strokecolor="red" strokeweight="2pt">
                 <v:stroke endarrow="open"/>
                 <w10:wrap anchorx="margin"/>
               </v:shape>
@@ -3327,7 +3336,7 @@
           </mc:Choice>
           <mc:Fallback>
             <w:pict>
-              <v:shape w14:anchorId="34464A1F" id="Straight Arrow Connector 92" o:spid="_x0000_s1026" type="#_x0000_t32" style="position:absolute;margin-left:415.5pt;margin-top:46.65pt;width:29.25pt;height:90pt;flip:x y;z-index:251814912;visibility:visible;mso-wrap-style:square;mso-width-percent:0;mso-height-percent:0;mso-wrap-distance-left:9pt;mso-wrap-distance-top:0;mso-wrap-distance-right:9pt;mso-wrap-distance-bottom:0;mso-position-horizontal:absolute;mso-position-horizontal-relative:margin;mso-position-vertical:absolute;mso-position-vertical-relative:text;mso-width-percent:0;mso-height-percent:0;mso-width-relative:margin;mso-height-relative:margin" o:gfxdata="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" strokecolor="red" strokeweight="2pt">
+              <v:shape w14:anchorId="22515B9E" id="Straight Arrow Connector 92" o:spid="_x0000_s1026" type="#_x0000_t32" style="position:absolute;margin-left:415.5pt;margin-top:46.65pt;width:29.25pt;height:90pt;flip:x y;z-index:251814912;visibility:visible;mso-wrap-style:square;mso-width-percent:0;mso-height-percent:0;mso-wrap-distance-left:9pt;mso-wrap-distance-top:0;mso-wrap-distance-right:9pt;mso-wrap-distance-bottom:0;mso-position-horizontal:absolute;mso-position-horizontal-relative:margin;mso-position-vertical:absolute;mso-position-vertical-relative:text;mso-width-percent:0;mso-height-percent:0;mso-width-relative:margin;mso-height-relative:margin" o:gfxdata="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" strokecolor="red" strokeweight="2pt">
                 <v:stroke endarrow="open"/>
                 <w10:wrap anchorx="margin"/>
               </v:shape>
@@ -3818,7 +3827,7 @@
           </mc:Choice>
           <mc:Fallback>
             <w:pict>
-              <v:shape w14:anchorId="7925465E" id="Straight Arrow Connector 1644997591" o:spid="_x0000_s1026" type="#_x0000_t32" style="position:absolute;margin-left:108.75pt;margin-top:42.25pt;width:133.5pt;height:48pt;flip:x;z-index:251948032;visibility:visible;mso-wrap-style:square;mso-width-percent:0;mso-height-percent:0;mso-wrap-distance-left:9pt;mso-wrap-distance-top:0;mso-wrap-distance-right:9pt;mso-wrap-distance-bottom:0;mso-position-horizontal:absolute;mso-position-horizontal-relative:margin;mso-position-vertical:absolute;mso-position-vertical-relative:text;mso-width-percent:0;mso-height-percent:0;mso-width-relative:margin;mso-height-relative:margin" o:gfxdata="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" strokecolor="red" strokeweight="2pt">
+              <v:shape w14:anchorId="1D5CC4C1" id="Straight Arrow Connector 1644997591" o:spid="_x0000_s1026" type="#_x0000_t32" style="position:absolute;margin-left:108.75pt;margin-top:42.25pt;width:133.5pt;height:48pt;flip:x;z-index:251948032;visibility:visible;mso-wrap-style:square;mso-width-percent:0;mso-height-percent:0;mso-wrap-distance-left:9pt;mso-wrap-distance-top:0;mso-wrap-distance-right:9pt;mso-wrap-distance-bottom:0;mso-position-horizontal:absolute;mso-position-horizontal-relative:margin;mso-position-vertical:absolute;mso-position-vertical-relative:text;mso-width-percent:0;mso-height-percent:0;mso-width-relative:margin;mso-height-relative:margin" o:gfxdata="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" strokecolor="red" strokeweight="2pt">
                 <v:stroke endarrow="open"/>
                 <w10:wrap anchorx="margin"/>
               </v:shape>
@@ -4004,15 +4013,7 @@
       </w:r>
       <w:r>
         <w:lastRenderedPageBreak/>
-        <w:t xml:space="preserve">Install </w:t>
-      </w:r>
-      <w:proofErr w:type="spellStart"/>
-      <w:r>
-        <w:t>FireFly</w:t>
-      </w:r>
-      <w:proofErr w:type="spellEnd"/>
-      <w:r>
-        <w:t xml:space="preserve"> modules</w:t>
+        <w:t>Install FireFly modules</w:t>
       </w:r>
     </w:p>
     <w:p>
@@ -4028,13 +4029,8 @@
       <w:r>
         <w:t xml:space="preserve">he </w:t>
       </w:r>
-      <w:proofErr w:type="spellStart"/>
-      <w:r>
-        <w:t>FireFly</w:t>
-      </w:r>
-      <w:proofErr w:type="spellEnd"/>
-      <w:r>
-        <w:t xml:space="preserve"> types and sites are:</w:t>
+      <w:r>
+        <w:t>FireFly types and sites are:</w:t>
       </w:r>
     </w:p>
     <w:p>
@@ -4400,7 +4396,7 @@
           </mc:Choice>
           <mc:Fallback>
             <w:pict>
-              <v:shape w14:anchorId="0AF137BB" id="Straight Arrow Connector 1669972961" o:spid="_x0000_s1026" type="#_x0000_t32" style="position:absolute;margin-left:102.75pt;margin-top:52.1pt;width:133.5pt;height:147pt;flip:y;z-index:251970560;visibility:visible;mso-wrap-style:square;mso-width-percent:0;mso-height-percent:0;mso-wrap-distance-left:9pt;mso-wrap-distance-top:0;mso-wrap-distance-right:9pt;mso-wrap-distance-bottom:0;mso-position-horizontal:absolute;mso-position-horizontal-relative:margin;mso-position-vertical:absolute;mso-position-vertical-relative:text;mso-width-percent:0;mso-height-percent:0;mso-width-relative:margin;mso-height-relative:margin" o:gfxdata="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" strokecolor="red" strokeweight="2pt">
+              <v:shape w14:anchorId="75287141" id="Straight Arrow Connector 1669972961" o:spid="_x0000_s1026" type="#_x0000_t32" style="position:absolute;margin-left:102.75pt;margin-top:52.1pt;width:133.5pt;height:147pt;flip:y;z-index:251970560;visibility:visible;mso-wrap-style:square;mso-width-percent:0;mso-height-percent:0;mso-wrap-distance-left:9pt;mso-wrap-distance-top:0;mso-wrap-distance-right:9pt;mso-wrap-distance-bottom:0;mso-position-horizontal:absolute;mso-position-horizontal-relative:margin;mso-position-vertical:absolute;mso-position-vertical-relative:text;mso-width-percent:0;mso-height-percent:0;mso-width-relative:margin;mso-height-relative:margin" o:gfxdata="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" strokecolor="red" strokeweight="2pt">
                 <v:stroke endarrow="open"/>
                 <w10:wrap anchorx="margin"/>
               </v:shape>
@@ -4476,7 +4472,7 @@
           </mc:Choice>
           <mc:Fallback>
             <w:pict>
-              <v:shape w14:anchorId="698F7317" id="Straight Arrow Connector 1109558486" o:spid="_x0000_s1026" type="#_x0000_t32" style="position:absolute;margin-left:102.75pt;margin-top:49.85pt;width:82.5pt;height:149.25pt;flip:y;z-index:251968512;visibility:visible;mso-wrap-style:square;mso-width-percent:0;mso-height-percent:0;mso-wrap-distance-left:9pt;mso-wrap-distance-top:0;mso-wrap-distance-right:9pt;mso-wrap-distance-bottom:0;mso-position-horizontal:absolute;mso-position-horizontal-relative:margin;mso-position-vertical:absolute;mso-position-vertical-relative:text;mso-width-percent:0;mso-height-percent:0;mso-width-relative:margin;mso-height-relative:margin" o:gfxdata="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" strokecolor="red" strokeweight="2pt">
+              <v:shape w14:anchorId="71AFB5B0" id="Straight Arrow Connector 1109558486" o:spid="_x0000_s1026" type="#_x0000_t32" style="position:absolute;margin-left:102.75pt;margin-top:49.85pt;width:82.5pt;height:149.25pt;flip:y;z-index:251968512;visibility:visible;mso-wrap-style:square;mso-width-percent:0;mso-height-percent:0;mso-wrap-distance-left:9pt;mso-wrap-distance-top:0;mso-wrap-distance-right:9pt;mso-wrap-distance-bottom:0;mso-position-horizontal:absolute;mso-position-horizontal-relative:margin;mso-position-vertical:absolute;mso-position-vertical-relative:text;mso-width-percent:0;mso-height-percent:0;mso-width-relative:margin;mso-height-relative:margin" o:gfxdata="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" strokecolor="red" strokeweight="2pt">
                 <v:stroke endarrow="open"/>
                 <w10:wrap anchorx="margin"/>
               </v:shape>
@@ -4552,7 +4548,7 @@
           </mc:Choice>
           <mc:Fallback>
             <w:pict>
-              <v:shape w14:anchorId="571CD265" id="Straight Arrow Connector 1651206292" o:spid="_x0000_s1026" type="#_x0000_t32" style="position:absolute;margin-left:100.5pt;margin-top:45.35pt;width:8.25pt;height:154.5pt;flip:y;z-index:251966464;visibility:visible;mso-wrap-style:square;mso-width-percent:0;mso-height-percent:0;mso-wrap-distance-left:9pt;mso-wrap-distance-top:0;mso-wrap-distance-right:9pt;mso-wrap-distance-bottom:0;mso-position-horizontal:absolute;mso-position-horizontal-relative:margin;mso-position-vertical:absolute;mso-position-vertical-relative:text;mso-width-percent:0;mso-height-percent:0;mso-width-relative:margin;mso-height-relative:margin" o:gfxdata="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" strokecolor="red" strokeweight="2pt">
+              <v:shape w14:anchorId="7BCC4FA0" id="Straight Arrow Connector 1651206292" o:spid="_x0000_s1026" type="#_x0000_t32" style="position:absolute;margin-left:100.5pt;margin-top:45.35pt;width:8.25pt;height:154.5pt;flip:y;z-index:251966464;visibility:visible;mso-wrap-style:square;mso-width-percent:0;mso-height-percent:0;mso-wrap-distance-left:9pt;mso-wrap-distance-top:0;mso-wrap-distance-right:9pt;mso-wrap-distance-bottom:0;mso-position-horizontal:absolute;mso-position-horizontal-relative:margin;mso-position-vertical:absolute;mso-position-vertical-relative:text;mso-width-percent:0;mso-height-percent:0;mso-width-relative:margin;mso-height-relative:margin" o:gfxdata="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" strokecolor="red" strokeweight="2pt">
                 <v:stroke endarrow="open"/>
                 <w10:wrap anchorx="margin"/>
               </v:shape>
@@ -4628,7 +4624,7 @@
           </mc:Choice>
           <mc:Fallback>
             <w:pict>
-              <v:shape w14:anchorId="71BF4D99" id="Straight Arrow Connector 1181579635" o:spid="_x0000_s1026" type="#_x0000_t32" style="position:absolute;margin-left:101.25pt;margin-top:49.1pt;width:210.75pt;height:151.5pt;flip:y;z-index:251964416;visibility:visible;mso-wrap-style:square;mso-width-percent:0;mso-height-percent:0;mso-wrap-distance-left:9pt;mso-wrap-distance-top:0;mso-wrap-distance-right:9pt;mso-wrap-distance-bottom:0;mso-position-horizontal:absolute;mso-position-horizontal-relative:margin;mso-position-vertical:absolute;mso-position-vertical-relative:text;mso-width-percent:0;mso-height-percent:0;mso-width-relative:margin;mso-height-relative:margin" o:gfxdata="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" strokecolor="red" strokeweight="2pt">
+              <v:shape w14:anchorId="3B23748B" id="Straight Arrow Connector 1181579635" o:spid="_x0000_s1026" type="#_x0000_t32" style="position:absolute;margin-left:101.25pt;margin-top:49.1pt;width:210.75pt;height:151.5pt;flip:y;z-index:251964416;visibility:visible;mso-wrap-style:square;mso-width-percent:0;mso-height-percent:0;mso-wrap-distance-left:9pt;mso-wrap-distance-top:0;mso-wrap-distance-right:9pt;mso-wrap-distance-bottom:0;mso-position-horizontal:absolute;mso-position-horizontal-relative:margin;mso-position-vertical:absolute;mso-position-vertical-relative:text;mso-width-percent:0;mso-height-percent:0;mso-width-relative:margin;mso-height-relative:margin" o:gfxdata="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" strokecolor="red" strokeweight="2pt">
                 <v:stroke endarrow="open"/>
                 <w10:wrap anchorx="margin"/>
               </v:shape>
@@ -4704,7 +4700,7 @@
           </mc:Choice>
           <mc:Fallback>
             <w:pict>
-              <v:shape w14:anchorId="36933E1D" id="Straight Arrow Connector 819257572" o:spid="_x0000_s1026" type="#_x0000_t32" style="position:absolute;margin-left:246.75pt;margin-top:50.6pt;width:149.25pt;height:153pt;flip:y;z-index:251962368;visibility:visible;mso-wrap-style:square;mso-width-percent:0;mso-height-percent:0;mso-wrap-distance-left:9pt;mso-wrap-distance-top:0;mso-wrap-distance-right:9pt;mso-wrap-distance-bottom:0;mso-position-horizontal:absolute;mso-position-horizontal-relative:margin;mso-position-vertical:absolute;mso-position-vertical-relative:text;mso-width-percent:0;mso-height-percent:0;mso-width-relative:margin;mso-height-relative:margin" o:gfxdata="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" strokecolor="red" strokeweight="2pt">
+              <v:shape w14:anchorId="42A70ADE" id="Straight Arrow Connector 819257572" o:spid="_x0000_s1026" type="#_x0000_t32" style="position:absolute;margin-left:246.75pt;margin-top:50.6pt;width:149.25pt;height:153pt;flip:y;z-index:251962368;visibility:visible;mso-wrap-style:square;mso-width-percent:0;mso-height-percent:0;mso-wrap-distance-left:9pt;mso-wrap-distance-top:0;mso-wrap-distance-right:9pt;mso-wrap-distance-bottom:0;mso-position-horizontal:absolute;mso-position-horizontal-relative:margin;mso-position-vertical:absolute;mso-position-vertical-relative:text;mso-width-percent:0;mso-height-percent:0;mso-width-relative:margin;mso-height-relative:margin" o:gfxdata="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" strokecolor="red" strokeweight="2pt">
                 <v:stroke endarrow="open"/>
                 <w10:wrap anchorx="margin"/>
               </v:shape>
@@ -4780,7 +4776,7 @@
           </mc:Choice>
           <mc:Fallback>
             <w:pict>
-              <v:shape w14:anchorId="4B2F09E7" id="Straight Arrow Connector 1893036515" o:spid="_x0000_s1026" type="#_x0000_t32" style="position:absolute;margin-left:387pt;margin-top:50.6pt;width:37.5pt;height:152.25pt;flip:y;z-index:251960320;visibility:visible;mso-wrap-style:square;mso-width-percent:0;mso-height-percent:0;mso-wrap-distance-left:9pt;mso-wrap-distance-top:0;mso-wrap-distance-right:9pt;mso-wrap-distance-bottom:0;mso-position-horizontal:absolute;mso-position-horizontal-relative:margin;mso-position-vertical:absolute;mso-position-vertical-relative:text;mso-width-percent:0;mso-height-percent:0;mso-width-relative:margin;mso-height-relative:margin" o:gfxdata="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" strokecolor="red" strokeweight="2pt">
+              <v:shape w14:anchorId="3F0136B4" id="Straight Arrow Connector 1893036515" o:spid="_x0000_s1026" type="#_x0000_t32" style="position:absolute;margin-left:387pt;margin-top:50.6pt;width:37.5pt;height:152.25pt;flip:y;z-index:251960320;visibility:visible;mso-wrap-style:square;mso-width-percent:0;mso-height-percent:0;mso-wrap-distance-left:9pt;mso-wrap-distance-top:0;mso-wrap-distance-right:9pt;mso-wrap-distance-bottom:0;mso-position-horizontal:absolute;mso-position-horizontal-relative:margin;mso-position-vertical:absolute;mso-position-vertical-relative:text;mso-width-percent:0;mso-height-percent:0;mso-width-relative:margin;mso-height-relative:margin" o:gfxdata="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" strokecolor="red" strokeweight="2pt">
                 <v:stroke endarrow="open"/>
                 <w10:wrap anchorx="margin"/>
               </v:shape>
@@ -5302,29 +5298,8 @@
         <w:t xml:space="preserve">by 15-mm long </w:t>
       </w:r>
       <w:r>
-        <w:t xml:space="preserve">strips of pink 1.78 mm thick Laird </w:t>
-      </w:r>
-      <w:proofErr w:type="spellStart"/>
-      <w:r>
-        <w:t>Tflex</w:t>
-      </w:r>
-      <w:proofErr w:type="spellEnd"/>
-      <w:r>
-        <w:t xml:space="preserve"> HD300 (</w:t>
-      </w:r>
-      <w:proofErr w:type="spellStart"/>
-      <w:r>
-        <w:t>DigiKey</w:t>
-      </w:r>
-      <w:proofErr w:type="spellEnd"/>
-      <w:r>
-        <w:t xml:space="preserve"> P/N 926-1594). Apply them to the top of the </w:t>
-      </w:r>
-      <w:proofErr w:type="spellStart"/>
-      <w:r>
-        <w:t>FireFly</w:t>
-      </w:r>
-      <w:proofErr w:type="spellEnd"/>
+        <w:t>strips of pink 1.78 mm thick Laird Tflex HD300 (DigiKey P/N 926-1594). Apply them to the top of the FireFly</w:t>
+      </w:r>
       <w:r>
         <w:t xml:space="preserve"> receivers and transmitter</w:t>
       </w:r>
@@ -5332,23 +5307,19 @@
         <w:t>.</w:t>
       </w:r>
       <w:r>
-        <w:t xml:space="preserve"> Cut one 11-mm square piece and apply it to the top of the </w:t>
-      </w:r>
-      <w:proofErr w:type="spellStart"/>
-      <w:r>
-        <w:t>FireFly</w:t>
-      </w:r>
-      <w:proofErr w:type="spellEnd"/>
-      <w:r>
-        <w:t xml:space="preserve"> transceiver. Be sure it does hot </w:t>
-      </w:r>
-      <w:proofErr w:type="spellStart"/>
-      <w:r>
-        <w:t>ovelap</w:t>
-      </w:r>
-      <w:proofErr w:type="spellEnd"/>
-      <w:r>
-        <w:t xml:space="preserve"> the latch on this device.</w:t>
+        <w:t xml:space="preserve"> Cut one 11-mm square piece and apply it to the top of the FireFly transceiver. Be sure it does </w:t>
+      </w:r>
+      <w:r>
+        <w:t>n</w:t>
+      </w:r>
+      <w:r>
+        <w:t>ot ove</w:t>
+      </w:r>
+      <w:r>
+        <w:t>r</w:t>
+      </w:r>
+      <w:r>
+        <w:t>lap the latch on this device.</w:t>
       </w:r>
       <w:r>
         <w:t xml:space="preserve"> </w:t>
@@ -5382,27 +5353,27 @@
         <mc:AlternateContent>
           <mc:Choice Requires="wps">
             <w:drawing>
-              <wp:anchor distT="0" distB="0" distL="114300" distR="114300" simplePos="0" relativeHeight="251978752" behindDoc="0" locked="0" layoutInCell="1" allowOverlap="1" wp14:anchorId="3278DA33" wp14:editId="4A962737">
+              <wp:anchor distT="0" distB="0" distL="114300" distR="114300" simplePos="0" relativeHeight="251974656" behindDoc="0" locked="0" layoutInCell="1" allowOverlap="1" wp14:anchorId="406027E5" wp14:editId="3374BA1D">
                 <wp:simplePos x="0" y="0"/>
                 <wp:positionH relativeFrom="margin">
-                  <wp:posOffset>1362075</wp:posOffset>
+                  <wp:posOffset>4733925</wp:posOffset>
                 </wp:positionH>
                 <wp:positionV relativeFrom="paragraph">
-                  <wp:posOffset>688339</wp:posOffset>
+                  <wp:posOffset>812165</wp:posOffset>
                 </wp:positionV>
-                <wp:extent cx="771525" cy="1419225"/>
-                <wp:effectExtent l="0" t="38100" r="66675" b="28575"/>
+                <wp:extent cx="295275" cy="1143000"/>
+                <wp:effectExtent l="57150" t="38100" r="28575" b="19050"/>
                 <wp:wrapNone/>
-                <wp:docPr id="1946876270" name="Straight Arrow Connector 1946876270"/>
+                <wp:docPr id="1810396098" name="Straight Arrow Connector 1810396098"/>
                 <wp:cNvGraphicFramePr/>
                 <a:graphic xmlns:a="http://schemas.openxmlformats.org/drawingml/2006/main">
                   <a:graphicData uri="http://schemas.microsoft.com/office/word/2010/wordprocessingShape">
                     <wps:wsp>
                       <wps:cNvCnPr/>
                       <wps:spPr>
-                        <a:xfrm flipV="1">
+                        <a:xfrm flipH="1" flipV="1">
                           <a:off x="0" y="0"/>
-                          <a:ext cx="771525" cy="1419225"/>
+                          <a:ext cx="295275" cy="1143000"/>
                         </a:xfrm>
                         <a:prstGeom prst="straightConnector1">
                           <a:avLst/>
@@ -5443,7 +5414,7 @@
           </mc:Choice>
           <mc:Fallback>
             <w:pict>
-              <v:shape w14:anchorId="76E23531" id="Straight Arrow Connector 1946876270" o:spid="_x0000_s1026" type="#_x0000_t32" style="position:absolute;margin-left:107.25pt;margin-top:54.2pt;width:60.75pt;height:111.75pt;flip:y;z-index:251978752;visibility:visible;mso-wrap-style:square;mso-width-percent:0;mso-height-percent:0;mso-wrap-distance-left:9pt;mso-wrap-distance-top:0;mso-wrap-distance-right:9pt;mso-wrap-distance-bottom:0;mso-position-horizontal:absolute;mso-position-horizontal-relative:margin;mso-position-vertical:absolute;mso-position-vertical-relative:text;mso-width-percent:0;mso-height-percent:0;mso-width-relative:margin;mso-height-relative:margin" o:gfxdata="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" strokecolor="red" strokeweight="2pt">
+              <v:shape w14:anchorId="458D2AF1" id="Straight Arrow Connector 1810396098" o:spid="_x0000_s1026" type="#_x0000_t32" style="position:absolute;margin-left:372.75pt;margin-top:63.95pt;width:23.25pt;height:90pt;flip:x y;z-index:251974656;visibility:visible;mso-wrap-style:square;mso-width-percent:0;mso-height-percent:0;mso-wrap-distance-left:9pt;mso-wrap-distance-top:0;mso-wrap-distance-right:9pt;mso-wrap-distance-bottom:0;mso-position-horizontal:absolute;mso-position-horizontal-relative:margin;mso-position-vertical:absolute;mso-position-vertical-relative:text;mso-width-percent:0;mso-height-percent:0;mso-width-relative:margin;mso-height-relative:margin" o:gfxdata="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" strokecolor="red" strokeweight="2pt">
                 <v:stroke endarrow="open"/>
                 <w10:wrap anchorx="margin"/>
               </v:shape>
@@ -5458,27 +5429,27 @@
         <mc:AlternateContent>
           <mc:Choice Requires="wps">
             <w:drawing>
-              <wp:anchor distT="0" distB="0" distL="114300" distR="114300" simplePos="0" relativeHeight="251974656" behindDoc="0" locked="0" layoutInCell="1" allowOverlap="1" wp14:anchorId="406027E5" wp14:editId="5F903038">
+              <wp:anchor distT="0" distB="0" distL="114300" distR="114300" simplePos="0" relativeHeight="251978752" behindDoc="0" locked="0" layoutInCell="1" allowOverlap="1" wp14:anchorId="3278DA33" wp14:editId="04F72657">
                 <wp:simplePos x="0" y="0"/>
                 <wp:positionH relativeFrom="margin">
-                  <wp:posOffset>4733925</wp:posOffset>
+                  <wp:posOffset>1466850</wp:posOffset>
                 </wp:positionH>
                 <wp:positionV relativeFrom="paragraph">
-                  <wp:posOffset>812164</wp:posOffset>
+                  <wp:posOffset>688340</wp:posOffset>
                 </wp:positionV>
-                <wp:extent cx="323850" cy="1285875"/>
-                <wp:effectExtent l="57150" t="38100" r="19050" b="28575"/>
+                <wp:extent cx="666750" cy="1238250"/>
+                <wp:effectExtent l="0" t="38100" r="57150" b="19050"/>
                 <wp:wrapNone/>
-                <wp:docPr id="1810396098" name="Straight Arrow Connector 1810396098"/>
+                <wp:docPr id="1946876270" name="Straight Arrow Connector 1946876270"/>
                 <wp:cNvGraphicFramePr/>
                 <a:graphic xmlns:a="http://schemas.openxmlformats.org/drawingml/2006/main">
                   <a:graphicData uri="http://schemas.microsoft.com/office/word/2010/wordprocessingShape">
                     <wps:wsp>
                       <wps:cNvCnPr/>
                       <wps:spPr>
-                        <a:xfrm flipH="1" flipV="1">
+                        <a:xfrm flipV="1">
                           <a:off x="0" y="0"/>
-                          <a:ext cx="323850" cy="1285875"/>
+                          <a:ext cx="666750" cy="1238250"/>
                         </a:xfrm>
                         <a:prstGeom prst="straightConnector1">
                           <a:avLst/>
@@ -5519,7 +5490,7 @@
           </mc:Choice>
           <mc:Fallback>
             <w:pict>
-              <v:shape w14:anchorId="1B710A1B" id="Straight Arrow Connector 1810396098" o:spid="_x0000_s1026" type="#_x0000_t32" style="position:absolute;margin-left:372.75pt;margin-top:63.95pt;width:25.5pt;height:101.25pt;flip:x y;z-index:251974656;visibility:visible;mso-wrap-style:square;mso-width-percent:0;mso-height-percent:0;mso-wrap-distance-left:9pt;mso-wrap-distance-top:0;mso-wrap-distance-right:9pt;mso-wrap-distance-bottom:0;mso-position-horizontal:absolute;mso-position-horizontal-relative:margin;mso-position-vertical:absolute;mso-position-vertical-relative:text;mso-width-percent:0;mso-height-percent:0;mso-width-relative:margin;mso-height-relative:margin" o:gfxdata="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" strokecolor="red" strokeweight="2pt">
+              <v:shape w14:anchorId="60697D2C" id="Straight Arrow Connector 1946876270" o:spid="_x0000_s1026" type="#_x0000_t32" style="position:absolute;margin-left:115.5pt;margin-top:54.2pt;width:52.5pt;height:97.5pt;flip:y;z-index:251978752;visibility:visible;mso-wrap-style:square;mso-width-percent:0;mso-height-percent:0;mso-wrap-distance-left:9pt;mso-wrap-distance-top:0;mso-wrap-distance-right:9pt;mso-wrap-distance-bottom:0;mso-position-horizontal:absolute;mso-position-horizontal-relative:margin;mso-position-vertical:absolute;mso-position-vertical-relative:text;mso-width-percent:0;mso-height-percent:0;mso-width-relative:margin;mso-height-relative:margin" o:gfxdata="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" strokecolor="red" strokeweight="2pt">
                 <v:stroke endarrow="open"/>
                 <w10:wrap anchorx="margin"/>
               </v:shape>
@@ -5583,24 +5554,6 @@
           <w:highlight w:val="lightGray"/>
         </w:rPr>
       </w:pPr>
-    </w:p>
-    <w:p>
-      <w:pPr>
-        <w:pStyle w:val="NoSpacing"/>
-        <w:rPr>
-          <w:color w:val="FF0000"/>
-          <w:highlight w:val="lightGray"/>
-        </w:rPr>
-      </w:pPr>
-    </w:p>
-    <w:p>
-      <w:pPr>
-        <w:pStyle w:val="NoSpacing"/>
-        <w:rPr>
-          <w:color w:val="FF0000"/>
-          <w:highlight w:val="lightGray"/>
-        </w:rPr>
-      </w:pPr>
       <w:r>
         <w:rPr>
           <w:noProof/>
@@ -5608,13 +5561,13 @@
         <mc:AlternateContent>
           <mc:Choice Requires="wps">
             <w:drawing>
-              <wp:anchor distT="0" distB="0" distL="114300" distR="114300" simplePos="0" relativeHeight="251976704" behindDoc="0" locked="0" layoutInCell="1" allowOverlap="1" wp14:anchorId="3E8631B8" wp14:editId="3CA4F794">
+              <wp:anchor distT="0" distB="0" distL="114300" distR="114300" simplePos="0" relativeHeight="251976704" behindDoc="0" locked="0" layoutInCell="1" allowOverlap="1" wp14:anchorId="3E8631B8" wp14:editId="7D2F73DB">
                 <wp:simplePos x="0" y="0"/>
                 <wp:positionH relativeFrom="margin">
-                  <wp:posOffset>590550</wp:posOffset>
+                  <wp:posOffset>657225</wp:posOffset>
                 </wp:positionH>
                 <wp:positionV relativeFrom="paragraph">
-                  <wp:posOffset>13970</wp:posOffset>
+                  <wp:posOffset>177800</wp:posOffset>
                 </wp:positionV>
                 <wp:extent cx="1590675" cy="571500"/>
                 <wp:effectExtent l="0" t="0" r="28575" b="95250"/>
@@ -5741,7 +5694,7 @@
           </mc:Choice>
           <mc:Fallback>
             <w:pict>
-              <v:shape w14:anchorId="3E8631B8" id="_x0000_s1039" type="#_x0000_t61" style="position:absolute;margin-left:46.5pt;margin-top:1.1pt;width:125.25pt;height:45pt;z-index:251976704;visibility:visible;mso-wrap-style:square;mso-width-percent:0;mso-height-percent:0;mso-wrap-distance-left:9pt;mso-wrap-distance-top:0;mso-wrap-distance-right:9pt;mso-wrap-distance-bottom:0;mso-position-horizontal:absolute;mso-position-horizontal-relative:margin;mso-position-vertical:absolute;mso-position-vertical-relative:text;mso-width-percent:0;mso-height-percent:0;mso-width-relative:margin;mso-height-relative:margin;v-text-anchor:middle" o:gfxdata="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" adj="6300,24300" fillcolor="#b9cde5" strokecolor="#385d8a" strokeweight="2pt">
+              <v:shape w14:anchorId="3E8631B8" id="_x0000_s1039" type="#_x0000_t61" style="position:absolute;margin-left:51.75pt;margin-top:14pt;width:125.25pt;height:45pt;z-index:251976704;visibility:visible;mso-wrap-style:square;mso-width-percent:0;mso-height-percent:0;mso-wrap-distance-left:9pt;mso-wrap-distance-top:0;mso-wrap-distance-right:9pt;mso-wrap-distance-bottom:0;mso-position-horizontal:absolute;mso-position-horizontal-relative:margin;mso-position-vertical:absolute;mso-position-vertical-relative:text;mso-width-percent:0;mso-height-percent:0;mso-width-relative:margin;mso-height-relative:margin;v-text-anchor:middle" o:gfxdata="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" adj="6300,24300" fillcolor="#b9cde5" strokecolor="#385d8a" strokeweight="2pt">
                 <v:textbox>
                   <w:txbxContent>
                     <w:p>
@@ -5820,6 +5773,15 @@
           </mc:Fallback>
         </mc:AlternateContent>
       </w:r>
+    </w:p>
+    <w:p>
+      <w:pPr>
+        <w:pStyle w:val="NoSpacing"/>
+        <w:rPr>
+          <w:color w:val="FF0000"/>
+          <w:highlight w:val="lightGray"/>
+        </w:rPr>
+      </w:pPr>
       <w:r>
         <w:rPr>
           <w:noProof/>
@@ -5827,13 +5789,13 @@
         <mc:AlternateContent>
           <mc:Choice Requires="wps">
             <w:drawing>
-              <wp:anchor distT="0" distB="0" distL="114300" distR="114300" simplePos="0" relativeHeight="251972608" behindDoc="0" locked="0" layoutInCell="1" allowOverlap="1" wp14:anchorId="2EF7C989" wp14:editId="5ACB507F">
+              <wp:anchor distT="0" distB="0" distL="114300" distR="114300" simplePos="0" relativeHeight="251972608" behindDoc="0" locked="0" layoutInCell="1" allowOverlap="1" wp14:anchorId="2EF7C989" wp14:editId="13C0E47B">
                 <wp:simplePos x="0" y="0"/>
                 <wp:positionH relativeFrom="margin">
-                  <wp:align>right</wp:align>
+                  <wp:posOffset>4181475</wp:posOffset>
                 </wp:positionH>
                 <wp:positionV relativeFrom="paragraph">
-                  <wp:posOffset>13970</wp:posOffset>
+                  <wp:posOffset>35560</wp:posOffset>
                 </wp:positionV>
                 <wp:extent cx="1695450" cy="571500"/>
                 <wp:effectExtent l="0" t="0" r="19050" b="95250"/>
@@ -5910,7 +5872,7 @@
           </mc:Choice>
           <mc:Fallback>
             <w:pict>
-              <v:shape w14:anchorId="2EF7C989" id="_x0000_s1040" type="#_x0000_t61" style="position:absolute;margin-left:82.3pt;margin-top:1.1pt;width:133.5pt;height:45pt;z-index:251972608;visibility:visible;mso-wrap-style:square;mso-width-percent:0;mso-height-percent:0;mso-wrap-distance-left:9pt;mso-wrap-distance-top:0;mso-wrap-distance-right:9pt;mso-wrap-distance-bottom:0;mso-position-horizontal:right;mso-position-horizontal-relative:margin;mso-position-vertical:absolute;mso-position-vertical-relative:text;mso-width-percent:0;mso-height-percent:0;mso-width-relative:margin;mso-height-relative:margin;v-text-anchor:middle" o:gfxdata="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" adj="6300,24300" fillcolor="#b9cde5" strokecolor="#385d8a" strokeweight="2pt">
+              <v:shape w14:anchorId="2EF7C989" id="_x0000_s1040" type="#_x0000_t61" style="position:absolute;margin-left:329.25pt;margin-top:2.8pt;width:133.5pt;height:45pt;z-index:251972608;visibility:visible;mso-wrap-style:square;mso-width-percent:0;mso-height-percent:0;mso-wrap-distance-left:9pt;mso-wrap-distance-top:0;mso-wrap-distance-right:9pt;mso-wrap-distance-bottom:0;mso-position-horizontal:absolute;mso-position-horizontal-relative:margin;mso-position-vertical:absolute;mso-position-vertical-relative:text;mso-width-percent:0;mso-height-percent:0;mso-width-relative:margin;mso-height-relative:margin;v-text-anchor:middle" o:gfxdata="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" adj="6300,24300" fillcolor="#b9cde5" strokecolor="#385d8a" strokeweight="2pt">
                 <v:textbox>
                   <w:txbxContent>
                     <w:p>
@@ -5942,53 +5904,58 @@
     </w:p>
     <w:p>
       <w:pPr>
-        <w:pStyle w:val="outline1"/>
+        <w:pStyle w:val="NoSpacing"/>
+        <w:rPr>
+          <w:color w:val="FF0000"/>
+        </w:rPr>
+      </w:pPr>
+    </w:p>
+    <w:p>
+      <w:pPr>
+        <w:pStyle w:val="NoSpacing"/>
         <w:numPr>
           <w:ilvl w:val="0"/>
           <w:numId w:val="22"/>
         </w:numPr>
         <w:rPr>
-          <w:highlight w:val="lightGray"/>
-        </w:rPr>
-      </w:pPr>
-      <w:r>
-        <w:rPr>
-          <w:highlight w:val="lightGray"/>
+          <w:color w:val="000000" w:themeColor="text1"/>
+        </w:rPr>
+      </w:pPr>
+      <w:r>
+        <w:rPr>
+          <w:color w:val="000000" w:themeColor="text1"/>
         </w:rPr>
         <w:lastRenderedPageBreak/>
-        <w:t xml:space="preserve">Mount the </w:t>
-      </w:r>
-      <w:proofErr w:type="spellStart"/>
-      <w:r>
-        <w:rPr>
-          <w:highlight w:val="lightGray"/>
-        </w:rPr>
-        <w:t>FireFly</w:t>
-      </w:r>
-      <w:proofErr w:type="spellEnd"/>
-      <w:r>
-        <w:rPr>
-          <w:highlight w:val="lightGray"/>
-        </w:rPr>
-        <w:t xml:space="preserve"> heatsink using 4 M2.5x12 screws, 4 M2.5 shoulder washers, and 4 S001YJ1D springs.</w:t>
-      </w:r>
-      <w:r>
-        <w:rPr>
-          <w:highlight w:val="lightGray"/>
-        </w:rPr>
-        <w:t xml:space="preserve"> The shoulder on the washer should be inside the spring.</w:t>
-      </w:r>
-      <w:r>
-        <w:rPr>
-          <w:highlight w:val="lightGray"/>
-        </w:rPr>
-        <w:t xml:space="preserve"> Tighten the screws just until the springs are fully compressed. Dress the cables that fit between the heatsink and the front panel.</w:t>
+        <w:t>Mount</w:t>
+      </w:r>
+      <w:r>
+        <w:rPr>
+          <w:color w:val="000000" w:themeColor="text1"/>
+        </w:rPr>
+        <w:t xml:space="preserve"> the FireFly heatsink using 4 M2.5x12 screws, 4 M2.5 shoulder washers, and 4 S001YJ1D springs. The shoulder on the washer should be inside the spring. Tighten the screws just until the springs are </w:t>
+      </w:r>
+      <w:r>
+        <w:rPr>
+          <w:color w:val="000000" w:themeColor="text1"/>
+        </w:rPr>
+        <w:t xml:space="preserve">almost </w:t>
+      </w:r>
+      <w:r>
+        <w:rPr>
+          <w:color w:val="000000" w:themeColor="text1"/>
+        </w:rPr>
+        <w:t>fully compressed</w:t>
+      </w:r>
+      <w:r>
+        <w:rPr>
+          <w:color w:val="000000" w:themeColor="text1"/>
+        </w:rPr>
+        <w:t xml:space="preserve">. </w:t>
       </w:r>
     </w:p>
     <w:p>
       <w:pPr>
         <w:pStyle w:val="NoSpacing"/>
-        <w:ind w:left="1080"/>
         <w:rPr>
           <w:color w:val="FF0000"/>
           <w:highlight w:val="lightGray"/>
@@ -6071,6 +6038,201 @@
       <w:r>
         <w:rPr>
           <w:noProof/>
+        </w:rPr>
+        <mc:AlternateContent>
+          <mc:Choice Requires="wps">
+            <w:drawing>
+              <wp:anchor distT="0" distB="0" distL="114300" distR="114300" simplePos="0" relativeHeight="251991040" behindDoc="0" locked="0" layoutInCell="1" allowOverlap="1" wp14:anchorId="24063443" wp14:editId="41DF77CB">
+                <wp:simplePos x="0" y="0"/>
+                <wp:positionH relativeFrom="margin">
+                  <wp:posOffset>1638299</wp:posOffset>
+                </wp:positionH>
+                <wp:positionV relativeFrom="paragraph">
+                  <wp:posOffset>814069</wp:posOffset>
+                </wp:positionV>
+                <wp:extent cx="1266825" cy="371475"/>
+                <wp:effectExtent l="38100" t="57150" r="28575" b="28575"/>
+                <wp:wrapNone/>
+                <wp:docPr id="30730068" name="Straight Arrow Connector 30730068"/>
+                <wp:cNvGraphicFramePr/>
+                <a:graphic xmlns:a="http://schemas.openxmlformats.org/drawingml/2006/main">
+                  <a:graphicData uri="http://schemas.microsoft.com/office/word/2010/wordprocessingShape">
+                    <wps:wsp>
+                      <wps:cNvCnPr/>
+                      <wps:spPr>
+                        <a:xfrm flipH="1" flipV="1">
+                          <a:off x="0" y="0"/>
+                          <a:ext cx="1266825" cy="371475"/>
+                        </a:xfrm>
+                        <a:prstGeom prst="straightConnector1">
+                          <a:avLst/>
+                        </a:prstGeom>
+                        <a:ln w="25400">
+                          <a:solidFill>
+                            <a:srgbClr val="FF0000"/>
+                          </a:solidFill>
+                          <a:tailEnd type="arrow"/>
+                        </a:ln>
+                      </wps:spPr>
+                      <wps:style>
+                        <a:lnRef idx="1">
+                          <a:schemeClr val="accent1"/>
+                        </a:lnRef>
+                        <a:fillRef idx="0">
+                          <a:schemeClr val="accent1"/>
+                        </a:fillRef>
+                        <a:effectRef idx="0">
+                          <a:schemeClr val="accent1"/>
+                        </a:effectRef>
+                        <a:fontRef idx="minor">
+                          <a:schemeClr val="tx1"/>
+                        </a:fontRef>
+                      </wps:style>
+                      <wps:bodyPr/>
+                    </wps:wsp>
+                  </a:graphicData>
+                </a:graphic>
+                <wp14:sizeRelH relativeFrom="margin">
+                  <wp14:pctWidth>0</wp14:pctWidth>
+                </wp14:sizeRelH>
+                <wp14:sizeRelV relativeFrom="margin">
+                  <wp14:pctHeight>0</wp14:pctHeight>
+                </wp14:sizeRelV>
+              </wp:anchor>
+            </w:drawing>
+          </mc:Choice>
+          <mc:Fallback>
+            <w:pict>
+              <v:shape w14:anchorId="0E752117" id="Straight Arrow Connector 30730068" o:spid="_x0000_s1026" type="#_x0000_t32" style="position:absolute;margin-left:129pt;margin-top:64.1pt;width:99.75pt;height:29.25pt;flip:x y;z-index:251991040;visibility:visible;mso-wrap-style:square;mso-width-percent:0;mso-height-percent:0;mso-wrap-distance-left:9pt;mso-wrap-distance-top:0;mso-wrap-distance-right:9pt;mso-wrap-distance-bottom:0;mso-position-horizontal:absolute;mso-position-horizontal-relative:margin;mso-position-vertical:absolute;mso-position-vertical-relative:text;mso-width-percent:0;mso-height-percent:0;mso-width-relative:margin;mso-height-relative:margin" o:gfxdata="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" strokecolor="red" strokeweight="2pt">
+                <v:stroke endarrow="open"/>
+                <w10:wrap anchorx="margin"/>
+              </v:shape>
+            </w:pict>
+          </mc:Fallback>
+        </mc:AlternateContent>
+      </w:r>
+      <w:r>
+        <w:rPr>
+          <w:noProof/>
+        </w:rPr>
+        <mc:AlternateContent>
+          <mc:Choice Requires="wps">
+            <w:drawing>
+              <wp:anchor distT="0" distB="0" distL="114300" distR="114300" simplePos="0" relativeHeight="251988992" behindDoc="0" locked="0" layoutInCell="1" allowOverlap="1" wp14:anchorId="0F80D1E5" wp14:editId="2AA3080A">
+                <wp:simplePos x="0" y="0"/>
+                <wp:positionH relativeFrom="margin">
+                  <wp:posOffset>2914650</wp:posOffset>
+                </wp:positionH>
+                <wp:positionV relativeFrom="paragraph">
+                  <wp:posOffset>904875</wp:posOffset>
+                </wp:positionV>
+                <wp:extent cx="1590675" cy="571500"/>
+                <wp:effectExtent l="0" t="0" r="28575" b="95250"/>
+                <wp:wrapNone/>
+                <wp:docPr id="521012668" name="Rectangular Callout 17"/>
+                <wp:cNvGraphicFramePr/>
+                <a:graphic xmlns:a="http://schemas.openxmlformats.org/drawingml/2006/main">
+                  <a:graphicData uri="http://schemas.microsoft.com/office/word/2010/wordprocessingShape">
+                    <wps:wsp>
+                      <wps:cNvSpPr/>
+                      <wps:spPr>
+                        <a:xfrm>
+                          <a:off x="0" y="0"/>
+                          <a:ext cx="1590675" cy="571500"/>
+                        </a:xfrm>
+                        <a:prstGeom prst="wedgeRectCallout">
+                          <a:avLst/>
+                        </a:prstGeom>
+                        <a:solidFill>
+                          <a:srgbClr val="4F81BD">
+                            <a:lumMod val="40000"/>
+                            <a:lumOff val="60000"/>
+                          </a:srgbClr>
+                        </a:solidFill>
+                        <a:ln w="25400" cap="flat" cmpd="sng" algn="ctr">
+                          <a:solidFill>
+                            <a:srgbClr val="4F81BD">
+                              <a:shade val="50000"/>
+                            </a:srgbClr>
+                          </a:solidFill>
+                          <a:prstDash val="solid"/>
+                        </a:ln>
+                        <a:effectLst/>
+                      </wps:spPr>
+                      <wps:txbx>
+                        <w:txbxContent>
+                          <w:p>
+                            <w:pPr>
+                              <w:jc w:val="center"/>
+                              <w:rPr>
+                                <w:color w:val="002060"/>
+                                <w:sz w:val="28"/>
+                                <w:szCs w:val="28"/>
+                              </w:rPr>
+                            </w:pPr>
+                            <w:r>
+                              <w:rPr>
+                                <w:color w:val="002060"/>
+                                <w:sz w:val="28"/>
+                                <w:szCs w:val="28"/>
+                              </w:rPr>
+                              <w:t>Spring almost fully compressed</w:t>
+                            </w:r>
+                          </w:p>
+                        </w:txbxContent>
+                      </wps:txbx>
+                      <wps:bodyPr rot="0" spcFirstLastPara="0" vertOverflow="overflow" horzOverflow="overflow" vert="horz" wrap="square" lIns="91440" tIns="45720" rIns="91440" bIns="45720" numCol="1" spcCol="0" rtlCol="0" fromWordArt="0" anchor="ctr" anchorCtr="0" forceAA="0" compatLnSpc="1">
+                        <a:prstTxWarp prst="textNoShape">
+                          <a:avLst/>
+                        </a:prstTxWarp>
+                        <a:noAutofit/>
+                      </wps:bodyPr>
+                    </wps:wsp>
+                  </a:graphicData>
+                </a:graphic>
+                <wp14:sizeRelH relativeFrom="margin">
+                  <wp14:pctWidth>0</wp14:pctWidth>
+                </wp14:sizeRelH>
+                <wp14:sizeRelV relativeFrom="margin">
+                  <wp14:pctHeight>0</wp14:pctHeight>
+                </wp14:sizeRelV>
+              </wp:anchor>
+            </w:drawing>
+          </mc:Choice>
+          <mc:Fallback>
+            <w:pict>
+              <v:shape w14:anchorId="0F80D1E5" id="_x0000_s1041" type="#_x0000_t61" style="position:absolute;left:0;text-align:left;margin-left:229.5pt;margin-top:71.25pt;width:125.25pt;height:45pt;z-index:251988992;visibility:visible;mso-wrap-style:square;mso-width-percent:0;mso-height-percent:0;mso-wrap-distance-left:9pt;mso-wrap-distance-top:0;mso-wrap-distance-right:9pt;mso-wrap-distance-bottom:0;mso-position-horizontal:absolute;mso-position-horizontal-relative:margin;mso-position-vertical:absolute;mso-position-vertical-relative:text;mso-width-percent:0;mso-height-percent:0;mso-width-relative:margin;mso-height-relative:margin;v-text-anchor:middle" o:gfxdata="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" adj="6300,24300" fillcolor="#b9cde5" strokecolor="#385d8a" strokeweight="2pt">
+                <v:textbox>
+                  <w:txbxContent>
+                    <w:p>
+                      <w:pPr>
+                        <w:jc w:val="center"/>
+                        <w:rPr>
+                          <w:color w:val="002060"/>
+                          <w:sz w:val="28"/>
+                          <w:szCs w:val="28"/>
+                        </w:rPr>
+                      </w:pPr>
+                      <w:r>
+                        <w:rPr>
+                          <w:color w:val="002060"/>
+                          <w:sz w:val="28"/>
+                          <w:szCs w:val="28"/>
+                        </w:rPr>
+                        <w:t>Spring almost fully compressed</w:t>
+                      </w:r>
+                    </w:p>
+                  </w:txbxContent>
+                </v:textbox>
+                <w10:wrap anchorx="margin"/>
+              </v:shape>
+            </w:pict>
+          </mc:Fallback>
+        </mc:AlternateContent>
+      </w:r>
+      <w:r>
+        <w:rPr>
+          <w:noProof/>
           <w:color w:val="000000" w:themeColor="text1"/>
         </w:rPr>
         <w:drawing>
@@ -6125,23 +6287,7 @@
         </w:numPr>
       </w:pPr>
       <w:r>
-        <w:t xml:space="preserve">One at a time, route the </w:t>
-      </w:r>
-      <w:proofErr w:type="spellStart"/>
-      <w:r>
-        <w:t>FireFly</w:t>
-      </w:r>
-      <w:proofErr w:type="spellEnd"/>
-      <w:r>
-        <w:t xml:space="preserve"> cables in the space between the front panel and the </w:t>
-      </w:r>
-      <w:proofErr w:type="spellStart"/>
-      <w:r>
-        <w:t>FireFly</w:t>
-      </w:r>
-      <w:proofErr w:type="spellEnd"/>
-      <w:r>
-        <w:t xml:space="preserve"> heatsink. Pass the cable through the slot in the front panel and p</w:t>
+        <w:t>One at a time, route the FireFly cables in the space between the front panel and the FireFly heatsink. Pass the cable through the slot in the front panel and p</w:t>
       </w:r>
       <w:r>
         <w:t xml:space="preserve">lug the MTP connector into the front panel </w:t>
@@ -6181,6 +6327,201 @@
         </w:numPr>
         <w:ind w:left="1080" w:hanging="360"/>
       </w:pPr>
+      <w:r>
+        <w:rPr>
+          <w:noProof/>
+        </w:rPr>
+        <mc:AlternateContent>
+          <mc:Choice Requires="wps">
+            <w:drawing>
+              <wp:anchor distT="0" distB="0" distL="114300" distR="114300" simplePos="0" relativeHeight="251995136" behindDoc="0" locked="0" layoutInCell="1" allowOverlap="1" wp14:anchorId="502C276B" wp14:editId="0851A2F3">
+                <wp:simplePos x="0" y="0"/>
+                <wp:positionH relativeFrom="margin">
+                  <wp:posOffset>2057399</wp:posOffset>
+                </wp:positionH>
+                <wp:positionV relativeFrom="paragraph">
+                  <wp:posOffset>826769</wp:posOffset>
+                </wp:positionV>
+                <wp:extent cx="2647950" cy="66675"/>
+                <wp:effectExtent l="19050" t="76200" r="19050" b="47625"/>
+                <wp:wrapNone/>
+                <wp:docPr id="1403933635" name="Straight Arrow Connector 1403933635"/>
+                <wp:cNvGraphicFramePr/>
+                <a:graphic xmlns:a="http://schemas.openxmlformats.org/drawingml/2006/main">
+                  <a:graphicData uri="http://schemas.microsoft.com/office/word/2010/wordprocessingShape">
+                    <wps:wsp>
+                      <wps:cNvCnPr/>
+                      <wps:spPr>
+                        <a:xfrm flipH="1" flipV="1">
+                          <a:off x="0" y="0"/>
+                          <a:ext cx="2647950" cy="66675"/>
+                        </a:xfrm>
+                        <a:prstGeom prst="straightConnector1">
+                          <a:avLst/>
+                        </a:prstGeom>
+                        <a:ln w="25400">
+                          <a:solidFill>
+                            <a:srgbClr val="FF0000"/>
+                          </a:solidFill>
+                          <a:tailEnd type="arrow"/>
+                        </a:ln>
+                      </wps:spPr>
+                      <wps:style>
+                        <a:lnRef idx="1">
+                          <a:schemeClr val="accent1"/>
+                        </a:lnRef>
+                        <a:fillRef idx="0">
+                          <a:schemeClr val="accent1"/>
+                        </a:fillRef>
+                        <a:effectRef idx="0">
+                          <a:schemeClr val="accent1"/>
+                        </a:effectRef>
+                        <a:fontRef idx="minor">
+                          <a:schemeClr val="tx1"/>
+                        </a:fontRef>
+                      </wps:style>
+                      <wps:bodyPr/>
+                    </wps:wsp>
+                  </a:graphicData>
+                </a:graphic>
+                <wp14:sizeRelH relativeFrom="margin">
+                  <wp14:pctWidth>0</wp14:pctWidth>
+                </wp14:sizeRelH>
+                <wp14:sizeRelV relativeFrom="margin">
+                  <wp14:pctHeight>0</wp14:pctHeight>
+                </wp14:sizeRelV>
+              </wp:anchor>
+            </w:drawing>
+          </mc:Choice>
+          <mc:Fallback>
+            <w:pict>
+              <v:shape w14:anchorId="285CCEB5" id="Straight Arrow Connector 1403933635" o:spid="_x0000_s1026" type="#_x0000_t32" style="position:absolute;margin-left:162pt;margin-top:65.1pt;width:208.5pt;height:5.25pt;flip:x y;z-index:251995136;visibility:visible;mso-wrap-style:square;mso-width-percent:0;mso-height-percent:0;mso-wrap-distance-left:9pt;mso-wrap-distance-top:0;mso-wrap-distance-right:9pt;mso-wrap-distance-bottom:0;mso-position-horizontal:absolute;mso-position-horizontal-relative:margin;mso-position-vertical:absolute;mso-position-vertical-relative:text;mso-width-percent:0;mso-height-percent:0;mso-width-relative:margin;mso-height-relative:margin" o:gfxdata="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" strokecolor="red" strokeweight="2pt">
+                <v:stroke endarrow="open"/>
+                <w10:wrap anchorx="margin"/>
+              </v:shape>
+            </w:pict>
+          </mc:Fallback>
+        </mc:AlternateContent>
+      </w:r>
+      <w:r>
+        <w:rPr>
+          <w:noProof/>
+        </w:rPr>
+        <mc:AlternateContent>
+          <mc:Choice Requires="wps">
+            <w:drawing>
+              <wp:anchor distT="0" distB="0" distL="114300" distR="114300" simplePos="0" relativeHeight="251993088" behindDoc="0" locked="0" layoutInCell="1" allowOverlap="1" wp14:anchorId="3FFBC86F" wp14:editId="41C199B5">
+                <wp:simplePos x="0" y="0"/>
+                <wp:positionH relativeFrom="margin">
+                  <wp:posOffset>4724400</wp:posOffset>
+                </wp:positionH>
+                <wp:positionV relativeFrom="paragraph">
+                  <wp:posOffset>721995</wp:posOffset>
+                </wp:positionV>
+                <wp:extent cx="1590675" cy="381000"/>
+                <wp:effectExtent l="0" t="0" r="28575" b="76200"/>
+                <wp:wrapNone/>
+                <wp:docPr id="697416312" name="Rectangular Callout 17"/>
+                <wp:cNvGraphicFramePr/>
+                <a:graphic xmlns:a="http://schemas.openxmlformats.org/drawingml/2006/main">
+                  <a:graphicData uri="http://schemas.microsoft.com/office/word/2010/wordprocessingShape">
+                    <wps:wsp>
+                      <wps:cNvSpPr/>
+                      <wps:spPr>
+                        <a:xfrm>
+                          <a:off x="0" y="0"/>
+                          <a:ext cx="1590675" cy="381000"/>
+                        </a:xfrm>
+                        <a:prstGeom prst="wedgeRectCallout">
+                          <a:avLst/>
+                        </a:prstGeom>
+                        <a:solidFill>
+                          <a:srgbClr val="4F81BD">
+                            <a:lumMod val="40000"/>
+                            <a:lumOff val="60000"/>
+                          </a:srgbClr>
+                        </a:solidFill>
+                        <a:ln w="25400" cap="flat" cmpd="sng" algn="ctr">
+                          <a:solidFill>
+                            <a:srgbClr val="4F81BD">
+                              <a:shade val="50000"/>
+                            </a:srgbClr>
+                          </a:solidFill>
+                          <a:prstDash val="solid"/>
+                        </a:ln>
+                        <a:effectLst/>
+                      </wps:spPr>
+                      <wps:txbx>
+                        <w:txbxContent>
+                          <w:p>
+                            <w:pPr>
+                              <w:jc w:val="center"/>
+                              <w:rPr>
+                                <w:color w:val="002060"/>
+                                <w:sz w:val="28"/>
+                                <w:szCs w:val="28"/>
+                              </w:rPr>
+                            </w:pPr>
+                            <w:r>
+                              <w:rPr>
+                                <w:color w:val="002060"/>
+                                <w:sz w:val="28"/>
+                                <w:szCs w:val="28"/>
+                              </w:rPr>
+                              <w:t>Cables routed</w:t>
+                            </w:r>
+                          </w:p>
+                        </w:txbxContent>
+                      </wps:txbx>
+                      <wps:bodyPr rot="0" spcFirstLastPara="0" vertOverflow="overflow" horzOverflow="overflow" vert="horz" wrap="square" lIns="91440" tIns="45720" rIns="91440" bIns="45720" numCol="1" spcCol="0" rtlCol="0" fromWordArt="0" anchor="ctr" anchorCtr="0" forceAA="0" compatLnSpc="1">
+                        <a:prstTxWarp prst="textNoShape">
+                          <a:avLst/>
+                        </a:prstTxWarp>
+                        <a:noAutofit/>
+                      </wps:bodyPr>
+                    </wps:wsp>
+                  </a:graphicData>
+                </a:graphic>
+                <wp14:sizeRelH relativeFrom="margin">
+                  <wp14:pctWidth>0</wp14:pctWidth>
+                </wp14:sizeRelH>
+                <wp14:sizeRelV relativeFrom="margin">
+                  <wp14:pctHeight>0</wp14:pctHeight>
+                </wp14:sizeRelV>
+              </wp:anchor>
+            </w:drawing>
+          </mc:Choice>
+          <mc:Fallback>
+            <w:pict>
+              <v:shape w14:anchorId="3FFBC86F" id="_x0000_s1042" type="#_x0000_t61" style="position:absolute;left:0;text-align:left;margin-left:372pt;margin-top:56.85pt;width:125.25pt;height:30pt;z-index:251993088;visibility:visible;mso-wrap-style:square;mso-width-percent:0;mso-height-percent:0;mso-wrap-distance-left:9pt;mso-wrap-distance-top:0;mso-wrap-distance-right:9pt;mso-wrap-distance-bottom:0;mso-position-horizontal:absolute;mso-position-horizontal-relative:margin;mso-position-vertical:absolute;mso-position-vertical-relative:text;mso-width-percent:0;mso-height-percent:0;mso-width-relative:margin;mso-height-relative:margin;v-text-anchor:middle" o:gfxdata="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" adj="6300,24300" fillcolor="#b9cde5" strokecolor="#385d8a" strokeweight="2pt">
+                <v:textbox>
+                  <w:txbxContent>
+                    <w:p>
+                      <w:pPr>
+                        <w:jc w:val="center"/>
+                        <w:rPr>
+                          <w:color w:val="002060"/>
+                          <w:sz w:val="28"/>
+                          <w:szCs w:val="28"/>
+                        </w:rPr>
+                      </w:pPr>
+                      <w:r>
+                        <w:rPr>
+                          <w:color w:val="002060"/>
+                          <w:sz w:val="28"/>
+                          <w:szCs w:val="28"/>
+                        </w:rPr>
+                        <w:t>Cables routed</w:t>
+                      </w:r>
+                    </w:p>
+                  </w:txbxContent>
+                </v:textbox>
+                <w10:wrap anchorx="margin"/>
+              </v:shape>
+            </w:pict>
+          </mc:Fallback>
+        </mc:AlternateContent>
+      </w:r>
       <w:r>
         <w:rPr>
           <w:noProof/>
@@ -6345,7 +6686,10 @@
         </w:numPr>
       </w:pPr>
       <w:r>
-        <w:t>With scissors, trim the excess from both ends of the tape.</w:t>
+        <w:t>With scissors, trim the excess from both ends of the tape</w:t>
+      </w:r>
+      <w:r>
+        <w:t>, peel the backing, and apply the labels.</w:t>
       </w:r>
     </w:p>
     <w:p>
@@ -6435,7 +6779,7 @@
           </mc:Choice>
           <mc:Fallback>
             <w:pict>
-              <v:shape w14:anchorId="4973DD39" id="Straight Arrow Connector 2091075354" o:spid="_x0000_s1026" type="#_x0000_t32" style="position:absolute;margin-left:219pt;margin-top:49.4pt;width:81.75pt;height:11.25pt;flip:x y;z-index:251984896;visibility:visible;mso-wrap-style:square;mso-width-percent:0;mso-height-percent:0;mso-wrap-distance-left:9pt;mso-wrap-distance-top:0;mso-wrap-distance-right:9pt;mso-wrap-distance-bottom:0;mso-position-horizontal:absolute;mso-position-horizontal-relative:margin;mso-position-vertical:absolute;mso-position-vertical-relative:text;mso-width-percent:0;mso-height-percent:0;mso-width-relative:margin;mso-height-relative:margin" o:gfxdata="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" strokecolor="red" strokeweight="2pt">
+              <v:shape w14:anchorId="5512AEF5" id="Straight Arrow Connector 2091075354" o:spid="_x0000_s1026" type="#_x0000_t32" style="position:absolute;margin-left:219pt;margin-top:49.4pt;width:81.75pt;height:11.25pt;flip:x y;z-index:251984896;visibility:visible;mso-wrap-style:square;mso-width-percent:0;mso-height-percent:0;mso-wrap-distance-left:9pt;mso-wrap-distance-top:0;mso-wrap-distance-right:9pt;mso-wrap-distance-bottom:0;mso-position-horizontal:absolute;mso-position-horizontal-relative:margin;mso-position-vertical:absolute;mso-position-vertical-relative:text;mso-width-percent:0;mso-height-percent:0;mso-width-relative:margin;mso-height-relative:margin" o:gfxdata="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" strokecolor="red" strokeweight="2pt">
                 <v:stroke endarrow="open"/>
                 <w10:wrap anchorx="margin"/>
               </v:shape>
@@ -6533,7 +6877,7 @@
           </mc:Choice>
           <mc:Fallback>
             <w:pict>
-              <v:shape w14:anchorId="26E1F78E" id="_x0000_s1041" type="#_x0000_t61" style="position:absolute;left:0;text-align:left;margin-left:300pt;margin-top:40.45pt;width:125.25pt;height:45pt;z-index:251980800;visibility:visible;mso-wrap-style:square;mso-width-percent:0;mso-height-percent:0;mso-wrap-distance-left:9pt;mso-wrap-distance-top:0;mso-wrap-distance-right:9pt;mso-wrap-distance-bottom:0;mso-position-horizontal:absolute;mso-position-horizontal-relative:margin;mso-position-vertical:absolute;mso-position-vertical-relative:text;mso-width-percent:0;mso-height-percent:0;mso-width-relative:margin;mso-height-relative:margin;v-text-anchor:middle" o:gfxdata="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" adj="6300,24300" fillcolor="#b9cde5" strokecolor="#385d8a" strokeweight="2pt">
+              <v:shape w14:anchorId="26E1F78E" id="_x0000_s1043" type="#_x0000_t61" style="position:absolute;left:0;text-align:left;margin-left:300pt;margin-top:40.45pt;width:125.25pt;height:45pt;z-index:251980800;visibility:visible;mso-wrap-style:square;mso-width-percent:0;mso-height-percent:0;mso-wrap-distance-left:9pt;mso-wrap-distance-top:0;mso-wrap-distance-right:9pt;mso-wrap-distance-bottom:0;mso-position-horizontal:absolute;mso-position-horizontal-relative:margin;mso-position-vertical:absolute;mso-position-vertical-relative:text;mso-width-percent:0;mso-height-percent:0;mso-width-relative:margin;mso-height-relative:margin;v-text-anchor:middle" o:gfxdata="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" adj="6300,24300" fillcolor="#b9cde5" strokecolor="#385d8a" strokeweight="2pt">
                 <v:textbox>
                   <w:txbxContent>
                     <w:p>
@@ -6699,7 +7043,7 @@
           </mc:Choice>
           <mc:Fallback>
             <w:pict>
-              <v:shape w14:anchorId="2CDCF269" id="Straight Arrow Connector 859267153" o:spid="_x0000_s1026" type="#_x0000_t32" style="position:absolute;margin-left:218.25pt;margin-top:35.2pt;width:86.25pt;height:32.25pt;flip:x y;z-index:251986944;visibility:visible;mso-wrap-style:square;mso-width-percent:0;mso-height-percent:0;mso-wrap-distance-left:9pt;mso-wrap-distance-top:0;mso-wrap-distance-right:9pt;mso-wrap-distance-bottom:0;mso-position-horizontal:absolute;mso-position-horizontal-relative:margin;mso-position-vertical:absolute;mso-position-vertical-relative:text;mso-width-percent:0;mso-height-percent:0;mso-width-relative:margin;mso-height-relative:margin" o:gfxdata="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" strokecolor="red" strokeweight="2pt">
+              <v:shape w14:anchorId="50361BAA" id="Straight Arrow Connector 859267153" o:spid="_x0000_s1026" type="#_x0000_t32" style="position:absolute;margin-left:218.25pt;margin-top:35.2pt;width:86.25pt;height:32.25pt;flip:x y;z-index:251986944;visibility:visible;mso-wrap-style:square;mso-width-percent:0;mso-height-percent:0;mso-wrap-distance-left:9pt;mso-wrap-distance-top:0;mso-wrap-distance-right:9pt;mso-wrap-distance-bottom:0;mso-position-horizontal:absolute;mso-position-horizontal-relative:margin;mso-position-vertical:absolute;mso-position-vertical-relative:text;mso-width-percent:0;mso-height-percent:0;mso-width-relative:margin;mso-height-relative:margin" o:gfxdata="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" strokecolor="red" strokeweight="2pt">
                 <v:stroke endarrow="open"/>
                 <w10:wrap anchorx="margin"/>
               </v:shape>
@@ -6813,7 +7157,7 @@
           </mc:Choice>
           <mc:Fallback>
             <w:pict>
-              <v:shape w14:anchorId="1A41DB09" id="_x0000_s1042" type="#_x0000_t61" style="position:absolute;left:0;text-align:left;margin-left:306pt;margin-top:44.2pt;width:135.75pt;height:45pt;z-index:251982848;visibility:visible;mso-wrap-style:square;mso-width-percent:0;mso-height-percent:0;mso-wrap-distance-left:9pt;mso-wrap-distance-top:0;mso-wrap-distance-right:9pt;mso-wrap-distance-bottom:0;mso-position-horizontal:absolute;mso-position-horizontal-relative:margin;mso-position-vertical:absolute;mso-position-vertical-relative:text;mso-width-percent:0;mso-height-percent:0;mso-width-relative:margin;mso-height-relative:margin;v-text-anchor:middle" o:gfxdata="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" adj="6300,24300" fillcolor="#b9cde5" strokecolor="#385d8a" strokeweight="2pt">
+              <v:shape w14:anchorId="1A41DB09" id="_x0000_s1044" type="#_x0000_t61" style="position:absolute;left:0;text-align:left;margin-left:306pt;margin-top:44.2pt;width:135.75pt;height:45pt;z-index:251982848;visibility:visible;mso-wrap-style:square;mso-width-percent:0;mso-height-percent:0;mso-wrap-distance-left:9pt;mso-wrap-distance-top:0;mso-wrap-distance-right:9pt;mso-wrap-distance-bottom:0;mso-position-horizontal:absolute;mso-position-horizontal-relative:margin;mso-position-vertical:absolute;mso-position-vertical-relative:text;mso-width-percent:0;mso-height-percent:0;mso-width-relative:margin;mso-height-relative:margin;v-text-anchor:middle" o:gfxdata="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" adj="6300,24300" fillcolor="#b9cde5" strokecolor="#385d8a" strokeweight="2pt">
                 <v:textbox>
                   <w:txbxContent>
                     <w:p>
@@ -7042,7 +7386,6 @@
           <w:b w:val="0"/>
           <w:bCs w:val="0"/>
         </w:rPr>
-        <w:lastRenderedPageBreak/>
         <w:t>Details about i</w:t>
       </w:r>
       <w:r>
@@ -7064,23 +7407,7 @@
           <w:b w:val="0"/>
           <w:bCs w:val="0"/>
         </w:rPr>
-        <w:t xml:space="preserve"> </w:t>
-      </w:r>
-      <w:proofErr w:type="spellStart"/>
-      <w:r>
-        <w:rPr>
-          <w:b w:val="0"/>
-          <w:bCs w:val="0"/>
-        </w:rPr>
-        <w:t>FireFly</w:t>
-      </w:r>
-      <w:proofErr w:type="spellEnd"/>
-      <w:r>
-        <w:rPr>
-          <w:b w:val="0"/>
-          <w:bCs w:val="0"/>
-        </w:rPr>
-        <w:t xml:space="preserve"> modules</w:t>
+        <w:t xml:space="preserve"> FireFly modules</w:t>
       </w:r>
     </w:p>
     <w:p>
@@ -7104,21 +7431,7 @@
         <w:rPr>
           <w:color w:val="000000" w:themeColor="text1"/>
         </w:rPr>
-        <w:t xml:space="preserve">When installing a </w:t>
-      </w:r>
-      <w:proofErr w:type="spellStart"/>
-      <w:r>
-        <w:rPr>
-          <w:color w:val="000000" w:themeColor="text1"/>
-        </w:rPr>
-        <w:t>FireFly</w:t>
-      </w:r>
-      <w:proofErr w:type="spellEnd"/>
-      <w:r>
-        <w:rPr>
-          <w:color w:val="000000" w:themeColor="text1"/>
-        </w:rPr>
-        <w:t xml:space="preserve"> module with a retaining clip, the clip MUST be at its full height on both sides throughout the process.</w:t>
+        <w:t>When installing a FireFly module with a retaining clip, the clip MUST be at its full height on both sides throughout the process.</w:t>
       </w:r>
     </w:p>
     <w:p>
@@ -7136,21 +7449,7 @@
         <w:rPr>
           <w:color w:val="000000" w:themeColor="text1"/>
         </w:rPr>
-        <w:t xml:space="preserve">If the clip is down by even a small amount, it will bend the receiver on the socket when the </w:t>
-      </w:r>
-      <w:proofErr w:type="spellStart"/>
-      <w:r>
-        <w:rPr>
-          <w:color w:val="000000" w:themeColor="text1"/>
-        </w:rPr>
-        <w:t>FireFly</w:t>
-      </w:r>
-      <w:proofErr w:type="spellEnd"/>
-      <w:r>
-        <w:rPr>
-          <w:color w:val="000000" w:themeColor="text1"/>
-        </w:rPr>
-        <w:t xml:space="preserve"> is pushed in.</w:t>
+        <w:t>If the clip is down by even a small amount, it will bend the receiver on the socket when the FireFly is pushed in.</w:t>
       </w:r>
     </w:p>
     <w:p>
@@ -7168,21 +7467,7 @@
         <w:rPr>
           <w:color w:val="000000" w:themeColor="text1"/>
         </w:rPr>
-        <w:t xml:space="preserve">Subsequently pressing down on the clip to lock it will be hard, and the receiver will be bent even more. The </w:t>
-      </w:r>
-      <w:proofErr w:type="spellStart"/>
-      <w:r>
-        <w:rPr>
-          <w:color w:val="000000" w:themeColor="text1"/>
-        </w:rPr>
-        <w:t>FireFly</w:t>
-      </w:r>
-      <w:proofErr w:type="spellEnd"/>
-      <w:r>
-        <w:rPr>
-          <w:color w:val="000000" w:themeColor="text1"/>
-        </w:rPr>
-        <w:t xml:space="preserve"> may be withdrawn slightly.</w:t>
+        <w:t>Subsequently pressing down on the clip to lock it will be hard, and the receiver will be bent even more. The FireFly may be withdrawn slightly.</w:t>
       </w:r>
     </w:p>
     <w:p>
@@ -7304,7 +7589,7 @@
           </mc:Choice>
           <mc:Fallback>
             <w:pict>
-              <v:shape w14:anchorId="557BDFC3" id="Straight Arrow Connector 560228160" o:spid="_x0000_s1026" type="#_x0000_t32" style="position:absolute;margin-left:335.25pt;margin-top:134.6pt;width:60.75pt;height:7.5pt;flip:x y;z-index:251874304;visibility:visible;mso-wrap-style:square;mso-width-percent:0;mso-height-percent:0;mso-wrap-distance-left:9pt;mso-wrap-distance-top:0;mso-wrap-distance-right:9pt;mso-wrap-distance-bottom:0;mso-position-horizontal:absolute;mso-position-horizontal-relative:margin;mso-position-vertical:absolute;mso-position-vertical-relative:text;mso-width-percent:0;mso-height-percent:0;mso-width-relative:margin;mso-height-relative:margin" o:gfxdata="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" strokecolor="red" strokeweight="2pt">
+              <v:shape w14:anchorId="6DC013E7" id="Straight Arrow Connector 560228160" o:spid="_x0000_s1026" type="#_x0000_t32" style="position:absolute;margin-left:335.25pt;margin-top:134.6pt;width:60.75pt;height:7.5pt;flip:x y;z-index:251874304;visibility:visible;mso-wrap-style:square;mso-width-percent:0;mso-height-percent:0;mso-wrap-distance-left:9pt;mso-wrap-distance-top:0;mso-wrap-distance-right:9pt;mso-wrap-distance-bottom:0;mso-position-horizontal:absolute;mso-position-horizontal-relative:margin;mso-position-vertical:absolute;mso-position-vertical-relative:text;mso-width-percent:0;mso-height-percent:0;mso-width-relative:margin;mso-height-relative:margin" o:gfxdata="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" strokecolor="red" strokeweight="2pt">
                 <v:stroke endarrow="open"/>
                 <w10:wrap anchorx="margin"/>
               </v:shape>
@@ -7380,7 +7665,7 @@
           </mc:Choice>
           <mc:Fallback>
             <w:pict>
-              <v:shape w14:anchorId="57BD7521" id="Straight Arrow Connector 2004318622" o:spid="_x0000_s1026" type="#_x0000_t32" style="position:absolute;margin-left:186.75pt;margin-top:80.6pt;width:206.25pt;height:32.25pt;flip:x;z-index:251873280;visibility:visible;mso-wrap-style:square;mso-width-percent:0;mso-height-percent:0;mso-wrap-distance-left:9pt;mso-wrap-distance-top:0;mso-wrap-distance-right:9pt;mso-wrap-distance-bottom:0;mso-position-horizontal:absolute;mso-position-horizontal-relative:margin;mso-position-vertical:absolute;mso-position-vertical-relative:text;mso-width-percent:0;mso-height-percent:0;mso-width-relative:margin;mso-height-relative:margin" o:gfxdata="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" strokecolor="red" strokeweight="2pt">
+              <v:shape w14:anchorId="257385BA" id="Straight Arrow Connector 2004318622" o:spid="_x0000_s1026" type="#_x0000_t32" style="position:absolute;margin-left:186.75pt;margin-top:80.6pt;width:206.25pt;height:32.25pt;flip:x;z-index:251873280;visibility:visible;mso-wrap-style:square;mso-width-percent:0;mso-height-percent:0;mso-wrap-distance-left:9pt;mso-wrap-distance-top:0;mso-wrap-distance-right:9pt;mso-wrap-distance-bottom:0;mso-position-horizontal:absolute;mso-position-horizontal-relative:margin;mso-position-vertical:absolute;mso-position-vertical-relative:text;mso-width-percent:0;mso-height-percent:0;mso-width-relative:margin;mso-height-relative:margin" o:gfxdata="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" strokecolor="red" strokeweight="2pt">
                 <v:stroke endarrow="open"/>
                 <w10:wrap anchorx="margin"/>
               </v:shape>
@@ -7456,7 +7741,7 @@
           </mc:Choice>
           <mc:Fallback>
             <w:pict>
-              <v:shape w14:anchorId="09DEA997" id="Straight Arrow Connector 432968384" o:spid="_x0000_s1026" type="#_x0000_t32" style="position:absolute;margin-left:167.25pt;margin-top:20.6pt;width:219pt;height:24pt;flip:x;z-index:251872256;visibility:visible;mso-wrap-style:square;mso-width-percent:0;mso-height-percent:0;mso-wrap-distance-left:9pt;mso-wrap-distance-top:0;mso-wrap-distance-right:9pt;mso-wrap-distance-bottom:0;mso-position-horizontal:absolute;mso-position-horizontal-relative:margin;mso-position-vertical:absolute;mso-position-vertical-relative:text;mso-width-percent:0;mso-height-percent:0;mso-width-relative:margin;mso-height-relative:margin" o:gfxdata="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" strokecolor="red" strokeweight="2pt">
+              <v:shape w14:anchorId="4944BD83" id="Straight Arrow Connector 432968384" o:spid="_x0000_s1026" type="#_x0000_t32" style="position:absolute;margin-left:167.25pt;margin-top:20.6pt;width:219pt;height:24pt;flip:x;z-index:251872256;visibility:visible;mso-wrap-style:square;mso-width-percent:0;mso-height-percent:0;mso-wrap-distance-left:9pt;mso-wrap-distance-top:0;mso-wrap-distance-right:9pt;mso-wrap-distance-bottom:0;mso-position-horizontal:absolute;mso-position-horizontal-relative:margin;mso-position-vertical:absolute;mso-position-vertical-relative:text;mso-width-percent:0;mso-height-percent:0;mso-width-relative:margin;mso-height-relative:margin" o:gfxdata="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" strokecolor="red" strokeweight="2pt">
                 <v:stroke endarrow="open"/>
                 <w10:wrap anchorx="margin"/>
               </v:shape>
@@ -7510,7 +7795,6 @@
                                 <w:szCs w:val="28"/>
                               </w:rPr>
                             </w:pPr>
-                            <w:proofErr w:type="spellStart"/>
                             <w:r>
                               <w:rPr>
                                 <w:rFonts w:hAnsi="Calibri"/>
@@ -7519,18 +7803,7 @@
                                 <w:sz w:val="28"/>
                                 <w:szCs w:val="28"/>
                               </w:rPr>
-                              <w:t>FireFly</w:t>
-                            </w:r>
-                            <w:proofErr w:type="spellEnd"/>
-                            <w:r>
-                              <w:rPr>
-                                <w:rFonts w:hAnsi="Calibri"/>
-                                <w:color w:val="000000" w:themeColor="text1"/>
-                                <w:kern w:val="24"/>
-                                <w:sz w:val="28"/>
-                                <w:szCs w:val="28"/>
-                              </w:rPr>
-                              <w:t xml:space="preserve"> fully inserted</w:t>
+                              <w:t>FireFly fully inserted</w:t>
                             </w:r>
                           </w:p>
                         </w:txbxContent>
@@ -7550,7 +7823,7 @@
                 <v:stroke joinstyle="miter"/>
                 <v:path gradientshapeok="t" o:connecttype="rect"/>
               </v:shapetype>
-              <v:shape id="TextBox 17" o:spid="_x0000_s1043" type="#_x0000_t202" style="position:absolute;left:0;text-align:left;margin-left:395.25pt;margin-top:129.7pt;width:125.7pt;height:41.2pt;z-index:251871232;visibility:visible;mso-wrap-style:square;mso-wrap-distance-left:9pt;mso-wrap-distance-top:0;mso-wrap-distance-right:9pt;mso-wrap-distance-bottom:0;mso-position-horizontal:absolute;mso-position-horizontal-relative:text;mso-position-vertical:absolute;mso-position-vertical-relative:text;v-text-anchor:top" o:gfxdata="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" filled="f" stroked="f">
+              <v:shape id="TextBox 17" o:spid="_x0000_s1045" type="#_x0000_t202" style="position:absolute;left:0;text-align:left;margin-left:395.25pt;margin-top:129.7pt;width:125.7pt;height:41.2pt;z-index:251871232;visibility:visible;mso-wrap-style:square;mso-wrap-distance-left:9pt;mso-wrap-distance-top:0;mso-wrap-distance-right:9pt;mso-wrap-distance-bottom:0;mso-position-horizontal:absolute;mso-position-horizontal-relative:text;mso-position-vertical:absolute;mso-position-vertical-relative:text;v-text-anchor:top" o:gfxdata="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" filled="f" stroked="f">
                 <v:textbox style="mso-fit-shape-to-text:t">
                   <w:txbxContent>
                     <w:p>
@@ -7563,7 +7836,6 @@
                           <w:szCs w:val="28"/>
                         </w:rPr>
                       </w:pPr>
-                      <w:proofErr w:type="spellStart"/>
                       <w:r>
                         <w:rPr>
                           <w:rFonts w:hAnsi="Calibri"/>
@@ -7572,18 +7844,7 @@
                           <w:sz w:val="28"/>
                           <w:szCs w:val="28"/>
                         </w:rPr>
-                        <w:t>FireFly</w:t>
-                      </w:r>
-                      <w:proofErr w:type="spellEnd"/>
-                      <w:r>
-                        <w:rPr>
-                          <w:rFonts w:hAnsi="Calibri"/>
-                          <w:color w:val="000000" w:themeColor="text1"/>
-                          <w:kern w:val="24"/>
-                          <w:sz w:val="28"/>
-                          <w:szCs w:val="28"/>
-                        </w:rPr>
-                        <w:t xml:space="preserve"> fully inserted</w:t>
+                        <w:t>FireFly fully inserted</w:t>
                       </w:r>
                     </w:p>
                   </w:txbxContent>
@@ -7663,7 +7924,7 @@
           </mc:Choice>
           <mc:Fallback>
             <w:pict>
-              <v:shape w14:anchorId="23D4839D" id="TextBox 16" o:spid="_x0000_s1044" type="#_x0000_t202" style="position:absolute;left:0;text-align:left;margin-left:391.5pt;margin-top:66.7pt;width:138.75pt;height:41.2pt;z-index:251870208;visibility:visible;mso-wrap-style:square;mso-wrap-distance-left:9pt;mso-wrap-distance-top:0;mso-wrap-distance-right:9pt;mso-wrap-distance-bottom:0;mso-position-horizontal:absolute;mso-position-horizontal-relative:text;mso-position-vertical:absolute;mso-position-vertical-relative:text;v-text-anchor:top" o:gfxdata="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" filled="f" stroked="f">
+              <v:shape w14:anchorId="23D4839D" id="TextBox 16" o:spid="_x0000_s1046" type="#_x0000_t202" style="position:absolute;left:0;text-align:left;margin-left:391.5pt;margin-top:66.7pt;width:138.75pt;height:41.2pt;z-index:251870208;visibility:visible;mso-wrap-style:square;mso-wrap-distance-left:9pt;mso-wrap-distance-top:0;mso-wrap-distance-right:9pt;mso-wrap-distance-bottom:0;mso-position-horizontal:absolute;mso-position-horizontal-relative:text;mso-position-vertical:absolute;mso-position-vertical-relative:text;v-text-anchor:top" o:gfxdata="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" filled="f" stroked="f">
                 <v:textbox style="mso-fit-shape-to-text:t">
                   <w:txbxContent>
                     <w:p>
@@ -7764,7 +8025,7 @@
           </mc:Choice>
           <mc:Fallback>
             <w:pict>
-              <v:shape w14:anchorId="2084E611" id="TextBox 12" o:spid="_x0000_s1045" type="#_x0000_t202" style="position:absolute;left:0;text-align:left;margin-left:385.5pt;margin-top:5.2pt;width:138.75pt;height:41.2pt;z-index:251869184;visibility:visible;mso-wrap-style:square;mso-wrap-distance-left:9pt;mso-wrap-distance-top:0;mso-wrap-distance-right:9pt;mso-wrap-distance-bottom:0;mso-position-horizontal:absolute;mso-position-horizontal-relative:text;mso-position-vertical:absolute;mso-position-vertical-relative:text;v-text-anchor:top" o:gfxdata="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" filled="f" stroked="f">
+              <v:shape w14:anchorId="2084E611" id="TextBox 12" o:spid="_x0000_s1047" type="#_x0000_t202" style="position:absolute;left:0;text-align:left;margin-left:385.5pt;margin-top:5.2pt;width:138.75pt;height:41.2pt;z-index:251869184;visibility:visible;mso-wrap-style:square;mso-wrap-distance-left:9pt;mso-wrap-distance-top:0;mso-wrap-distance-right:9pt;mso-wrap-distance-bottom:0;mso-position-horizontal:absolute;mso-position-horizontal-relative:text;mso-position-vertical:absolute;mso-position-vertical-relative:text;v-text-anchor:top" o:gfxdata="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" filled="f" stroked="f">
                 <v:textbox style="mso-fit-shape-to-text:t">
                   <w:txbxContent>
                     <w:p>
@@ -7994,7 +8255,7 @@
           </mc:Choice>
           <mc:Fallback>
             <w:pict>
-              <v:shape w14:anchorId="7C0B22C9" id="Straight Arrow Connector 862916216" o:spid="_x0000_s1026" type="#_x0000_t32" style="position:absolute;margin-left:114pt;margin-top:147.75pt;width:285.75pt;height:9.75pt;flip:x y;z-index:251880448;visibility:visible;mso-wrap-style:square;mso-width-percent:0;mso-height-percent:0;mso-wrap-distance-left:9pt;mso-wrap-distance-top:0;mso-wrap-distance-right:9pt;mso-wrap-distance-bottom:0;mso-position-horizontal:absolute;mso-position-horizontal-relative:margin;mso-position-vertical:absolute;mso-position-vertical-relative:text;mso-width-percent:0;mso-height-percent:0;mso-width-relative:margin;mso-height-relative:margin" o:gfxdata="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" strokecolor="red" strokeweight="2pt">
+              <v:shape w14:anchorId="2F3EB644" id="Straight Arrow Connector 862916216" o:spid="_x0000_s1026" type="#_x0000_t32" style="position:absolute;margin-left:114pt;margin-top:147.75pt;width:285.75pt;height:9.75pt;flip:x y;z-index:251880448;visibility:visible;mso-wrap-style:square;mso-width-percent:0;mso-height-percent:0;mso-wrap-distance-left:9pt;mso-wrap-distance-top:0;mso-wrap-distance-right:9pt;mso-wrap-distance-bottom:0;mso-position-horizontal:absolute;mso-position-horizontal-relative:margin;mso-position-vertical:absolute;mso-position-vertical-relative:text;mso-width-percent:0;mso-height-percent:0;mso-width-relative:margin;mso-height-relative:margin" o:gfxdata="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" strokecolor="red" strokeweight="2pt">
                 <v:stroke endarrow="open"/>
                 <w10:wrap anchorx="margin"/>
               </v:shape>
@@ -8070,7 +8331,7 @@
           </mc:Choice>
           <mc:Fallback>
             <w:pict>
-              <v:shape w14:anchorId="72D2B8E9" id="Straight Arrow Connector 920541789" o:spid="_x0000_s1026" type="#_x0000_t32" style="position:absolute;margin-left:259.5pt;margin-top:84pt;width:137.25pt;height:60pt;flip:x;z-index:251879424;visibility:visible;mso-wrap-style:square;mso-width-percent:0;mso-height-percent:0;mso-wrap-distance-left:9pt;mso-wrap-distance-top:0;mso-wrap-distance-right:9pt;mso-wrap-distance-bottom:0;mso-position-horizontal:absolute;mso-position-horizontal-relative:margin;mso-position-vertical:absolute;mso-position-vertical-relative:text;mso-width-percent:0;mso-height-percent:0;mso-width-relative:margin;mso-height-relative:margin" o:gfxdata="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" strokecolor="red" strokeweight="2pt">
+              <v:shape w14:anchorId="666BBF23" id="Straight Arrow Connector 920541789" o:spid="_x0000_s1026" type="#_x0000_t32" style="position:absolute;margin-left:259.5pt;margin-top:84pt;width:137.25pt;height:60pt;flip:x;z-index:251879424;visibility:visible;mso-wrap-style:square;mso-width-percent:0;mso-height-percent:0;mso-wrap-distance-left:9pt;mso-wrap-distance-top:0;mso-wrap-distance-right:9pt;mso-wrap-distance-bottom:0;mso-position-horizontal:absolute;mso-position-horizontal-relative:margin;mso-position-vertical:absolute;mso-position-vertical-relative:text;mso-width-percent:0;mso-height-percent:0;mso-width-relative:margin;mso-height-relative:margin" o:gfxdata="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" strokecolor="red" strokeweight="2pt">
                 <v:stroke endarrow="open"/>
                 <w10:wrap anchorx="margin"/>
               </v:shape>
@@ -8146,7 +8407,7 @@
           </mc:Choice>
           <mc:Fallback>
             <w:pict>
-              <v:shape w14:anchorId="11581D2B" id="Straight Arrow Connector 517503142" o:spid="_x0000_s1026" type="#_x0000_t32" style="position:absolute;margin-left:263.25pt;margin-top:13.5pt;width:132pt;height:108pt;flip:x;z-index:251878400;visibility:visible;mso-wrap-style:square;mso-width-percent:0;mso-height-percent:0;mso-wrap-distance-left:9pt;mso-wrap-distance-top:0;mso-wrap-distance-right:9pt;mso-wrap-distance-bottom:0;mso-position-horizontal:absolute;mso-position-horizontal-relative:margin;mso-position-vertical:absolute;mso-position-vertical-relative:text;mso-width-percent:0;mso-height-percent:0;mso-width-relative:margin;mso-height-relative:margin" o:gfxdata="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" strokecolor="red" strokeweight="2pt">
+              <v:shape w14:anchorId="242E83C2" id="Straight Arrow Connector 517503142" o:spid="_x0000_s1026" type="#_x0000_t32" style="position:absolute;margin-left:263.25pt;margin-top:13.5pt;width:132pt;height:108pt;flip:x;z-index:251878400;visibility:visible;mso-wrap-style:square;mso-width-percent:0;mso-height-percent:0;mso-wrap-distance-left:9pt;mso-wrap-distance-top:0;mso-wrap-distance-right:9pt;mso-wrap-distance-bottom:0;mso-position-horizontal:absolute;mso-position-horizontal-relative:margin;mso-position-vertical:absolute;mso-position-vertical-relative:text;mso-width-percent:0;mso-height-percent:0;mso-width-relative:margin;mso-height-relative:margin" o:gfxdata="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" strokecolor="red" strokeweight="2pt">
                 <v:stroke endarrow="open"/>
                 <w10:wrap anchorx="margin"/>
               </v:shape>
@@ -8201,7 +8462,6 @@
                                 <w:szCs w:val="28"/>
                               </w:rPr>
                             </w:pPr>
-                            <w:proofErr w:type="spellStart"/>
                             <w:r>
                               <w:rPr>
                                 <w:rFonts w:hAnsi="Calibri"/>
@@ -8210,18 +8470,7 @@
                                 <w:sz w:val="28"/>
                                 <w:szCs w:val="28"/>
                               </w:rPr>
-                              <w:t>FireFly</w:t>
-                            </w:r>
-                            <w:proofErr w:type="spellEnd"/>
-                            <w:r>
-                              <w:rPr>
-                                <w:rFonts w:hAnsi="Calibri"/>
-                                <w:color w:val="000000" w:themeColor="text1"/>
-                                <w:kern w:val="24"/>
-                                <w:sz w:val="28"/>
-                                <w:szCs w:val="28"/>
-                              </w:rPr>
-                              <w:t xml:space="preserve"> slightly withdrawn</w:t>
+                              <w:t>FireFly slightly withdrawn</w:t>
                             </w:r>
                           </w:p>
                         </w:txbxContent>
@@ -8237,7 +8486,7 @@
           </mc:Choice>
           <mc:Fallback>
             <w:pict>
-              <v:shape w14:anchorId="270B256A" id="TextBox 27" o:spid="_x0000_s1046" type="#_x0000_t202" style="position:absolute;left:0;text-align:left;margin-left:396.75pt;margin-top:142.5pt;width:125.7pt;height:41.2pt;z-index:251877376;visibility:visible;mso-wrap-style:square;mso-wrap-distance-left:9pt;mso-wrap-distance-top:0;mso-wrap-distance-right:9pt;mso-wrap-distance-bottom:0;mso-position-horizontal:absolute;mso-position-horizontal-relative:text;mso-position-vertical:absolute;mso-position-vertical-relative:text;v-text-anchor:top" o:gfxdata="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" filled="f" stroked="f">
+              <v:shape w14:anchorId="270B256A" id="TextBox 27" o:spid="_x0000_s1048" type="#_x0000_t202" style="position:absolute;left:0;text-align:left;margin-left:396.75pt;margin-top:142.5pt;width:125.7pt;height:41.2pt;z-index:251877376;visibility:visible;mso-wrap-style:square;mso-wrap-distance-left:9pt;mso-wrap-distance-top:0;mso-wrap-distance-right:9pt;mso-wrap-distance-bottom:0;mso-position-horizontal:absolute;mso-position-horizontal-relative:text;mso-position-vertical:absolute;mso-position-vertical-relative:text;v-text-anchor:top" o:gfxdata="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" filled="f" stroked="f">
                 <v:textbox style="mso-fit-shape-to-text:t">
                   <w:txbxContent>
                     <w:p>
@@ -8250,7 +8499,6 @@
                           <w:szCs w:val="28"/>
                         </w:rPr>
                       </w:pPr>
-                      <w:proofErr w:type="spellStart"/>
                       <w:r>
                         <w:rPr>
                           <w:rFonts w:hAnsi="Calibri"/>
@@ -8259,18 +8507,7 @@
                           <w:sz w:val="28"/>
                           <w:szCs w:val="28"/>
                         </w:rPr>
-                        <w:t>FireFly</w:t>
-                      </w:r>
-                      <w:proofErr w:type="spellEnd"/>
-                      <w:r>
-                        <w:rPr>
-                          <w:rFonts w:hAnsi="Calibri"/>
-                          <w:color w:val="000000" w:themeColor="text1"/>
-                          <w:kern w:val="24"/>
-                          <w:sz w:val="28"/>
-                          <w:szCs w:val="28"/>
-                        </w:rPr>
-                        <w:t xml:space="preserve"> slightly withdrawn</w:t>
+                        <w:t>FireFly slightly withdrawn</w:t>
                       </w:r>
                     </w:p>
                   </w:txbxContent>
@@ -8335,29 +8572,7 @@
                                 <w:sz w:val="28"/>
                                 <w:szCs w:val="28"/>
                               </w:rPr>
-                              <w:t xml:space="preserve">Receiver bent forward when </w:t>
-                            </w:r>
-                            <w:proofErr w:type="spellStart"/>
-                            <w:r>
-                              <w:rPr>
-                                <w:rFonts w:hAnsi="Calibri"/>
-                                <w:color w:val="000000" w:themeColor="text1"/>
-                                <w:kern w:val="24"/>
-                                <w:sz w:val="28"/>
-                                <w:szCs w:val="28"/>
-                              </w:rPr>
-                              <w:t>FireFly</w:t>
-                            </w:r>
-                            <w:proofErr w:type="spellEnd"/>
-                            <w:r>
-                              <w:rPr>
-                                <w:rFonts w:hAnsi="Calibri"/>
-                                <w:color w:val="000000" w:themeColor="text1"/>
-                                <w:kern w:val="24"/>
-                                <w:sz w:val="28"/>
-                                <w:szCs w:val="28"/>
-                              </w:rPr>
-                              <w:t xml:space="preserve"> is pushed in</w:t>
+                              <w:t>Receiver bent forward when FireFly is pushed in</w:t>
                             </w:r>
                           </w:p>
                         </w:txbxContent>
@@ -8373,7 +8588,7 @@
           </mc:Choice>
           <mc:Fallback>
             <w:pict>
-              <v:shape w14:anchorId="32DD1F87" id="TextBox 26" o:spid="_x0000_s1047" type="#_x0000_t202" style="position:absolute;left:0;text-align:left;margin-left:395.25pt;margin-top:69pt;width:138.75pt;height:58.15pt;z-index:251876352;visibility:visible;mso-wrap-style:square;mso-wrap-distance-left:9pt;mso-wrap-distance-top:0;mso-wrap-distance-right:9pt;mso-wrap-distance-bottom:0;mso-position-horizontal:absolute;mso-position-horizontal-relative:text;mso-position-vertical:absolute;mso-position-vertical-relative:text;v-text-anchor:top" o:gfxdata="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" filled="f" stroked="f">
+              <v:shape w14:anchorId="32DD1F87" id="TextBox 26" o:spid="_x0000_s1049" type="#_x0000_t202" style="position:absolute;left:0;text-align:left;margin-left:395.25pt;margin-top:69pt;width:138.75pt;height:58.15pt;z-index:251876352;visibility:visible;mso-wrap-style:square;mso-wrap-distance-left:9pt;mso-wrap-distance-top:0;mso-wrap-distance-right:9pt;mso-wrap-distance-bottom:0;mso-position-horizontal:absolute;mso-position-horizontal-relative:text;mso-position-vertical:absolute;mso-position-vertical-relative:text;v-text-anchor:top" o:gfxdata="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" filled="f" stroked="f">
                 <v:textbox style="mso-fit-shape-to-text:t">
                   <w:txbxContent>
                     <w:p>
@@ -8394,29 +8609,7 @@
                           <w:sz w:val="28"/>
                           <w:szCs w:val="28"/>
                         </w:rPr>
-                        <w:t xml:space="preserve">Receiver bent forward when </w:t>
-                      </w:r>
-                      <w:proofErr w:type="spellStart"/>
-                      <w:r>
-                        <w:rPr>
-                          <w:rFonts w:hAnsi="Calibri"/>
-                          <w:color w:val="000000" w:themeColor="text1"/>
-                          <w:kern w:val="24"/>
-                          <w:sz w:val="28"/>
-                          <w:szCs w:val="28"/>
-                        </w:rPr>
-                        <w:t>FireFly</w:t>
-                      </w:r>
-                      <w:proofErr w:type="spellEnd"/>
-                      <w:r>
-                        <w:rPr>
-                          <w:rFonts w:hAnsi="Calibri"/>
-                          <w:color w:val="000000" w:themeColor="text1"/>
-                          <w:kern w:val="24"/>
-                          <w:sz w:val="28"/>
-                          <w:szCs w:val="28"/>
-                        </w:rPr>
-                        <w:t xml:space="preserve"> is pushed in</w:t>
+                        <w:t>Receiver bent forward when FireFly is pushed in</w:t>
                       </w:r>
                     </w:p>
                   </w:txbxContent>
@@ -8497,7 +8690,7 @@
           </mc:Choice>
           <mc:Fallback>
             <w:pict>
-              <v:shape w14:anchorId="2BE5763A" id="TextBox 24" o:spid="_x0000_s1048" type="#_x0000_t202" style="position:absolute;left:0;text-align:left;margin-left:395.25pt;margin-top:.75pt;width:138.75pt;height:58.15pt;z-index:251875328;visibility:visible;mso-wrap-style:square;mso-wrap-distance-left:9pt;mso-wrap-distance-top:0;mso-wrap-distance-right:9pt;mso-wrap-distance-bottom:0;mso-position-horizontal:absolute;mso-position-horizontal-relative:text;mso-position-vertical:absolute;mso-position-vertical-relative:text;v-text-anchor:top" o:gfxdata="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" filled="f" stroked="f">
+              <v:shape w14:anchorId="2BE5763A" id="TextBox 24" o:spid="_x0000_s1050" type="#_x0000_t202" style="position:absolute;left:0;text-align:left;margin-left:395.25pt;margin-top:.75pt;width:138.75pt;height:58.15pt;z-index:251875328;visibility:visible;mso-wrap-style:square;mso-wrap-distance-left:9pt;mso-wrap-distance-top:0;mso-wrap-distance-right:9pt;mso-wrap-distance-bottom:0;mso-position-horizontal:absolute;mso-position-horizontal-relative:text;mso-position-vertical:absolute;mso-position-vertical-relative:text;v-text-anchor:top" o:gfxdata="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" filled="f" stroked="f">
                 <v:textbox style="mso-fit-shape-to-text:t">
                   <w:txbxContent>
                     <w:p>
@@ -8708,7 +8901,7 @@
           </mc:Choice>
           <mc:Fallback>
             <w:pict>
-              <v:shape w14:anchorId="689BC91F" id="Straight Arrow Connector 1020830180" o:spid="_x0000_s1026" type="#_x0000_t32" style="position:absolute;margin-left:165pt;margin-top:93.6pt;width:142.5pt;height:23.05pt;flip:x;z-index:251884544;visibility:visible;mso-wrap-style:square;mso-width-percent:0;mso-height-percent:0;mso-wrap-distance-left:9pt;mso-wrap-distance-top:0;mso-wrap-distance-right:9pt;mso-wrap-distance-bottom:0;mso-position-horizontal:absolute;mso-position-horizontal-relative:margin;mso-position-vertical:absolute;mso-position-vertical-relative:text;mso-width-percent:0;mso-height-percent:0;mso-width-relative:margin;mso-height-relative:margin" o:gfxdata="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" strokecolor="red" strokeweight="2pt">
+              <v:shape w14:anchorId="1E1E44D3" id="Straight Arrow Connector 1020830180" o:spid="_x0000_s1026" type="#_x0000_t32" style="position:absolute;margin-left:165pt;margin-top:93.6pt;width:142.5pt;height:23.05pt;flip:x;z-index:251884544;visibility:visible;mso-wrap-style:square;mso-width-percent:0;mso-height-percent:0;mso-wrap-distance-left:9pt;mso-wrap-distance-top:0;mso-wrap-distance-right:9pt;mso-wrap-distance-bottom:0;mso-position-horizontal:absolute;mso-position-horizontal-relative:margin;mso-position-vertical:absolute;mso-position-vertical-relative:text;mso-width-percent:0;mso-height-percent:0;mso-width-relative:margin;mso-height-relative:margin" o:gfxdata="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" strokecolor="red" strokeweight="2pt">
                 <v:stroke endarrow="open"/>
                 <w10:wrap anchorx="margin"/>
               </v:shape>
@@ -8784,7 +8977,7 @@
           </mc:Choice>
           <mc:Fallback>
             <w:pict>
-              <v:shape w14:anchorId="3EEEA22A" id="Straight Arrow Connector 130989073" o:spid="_x0000_s1026" type="#_x0000_t32" style="position:absolute;margin-left:177.75pt;margin-top:21pt;width:123pt;height:3.6pt;flip:x;z-index:251883520;visibility:visible;mso-wrap-style:square;mso-width-percent:0;mso-height-percent:0;mso-wrap-distance-left:9pt;mso-wrap-distance-top:0;mso-wrap-distance-right:9pt;mso-wrap-distance-bottom:0;mso-position-horizontal:absolute;mso-position-horizontal-relative:margin;mso-position-vertical:absolute;mso-position-vertical-relative:text;mso-width-percent:0;mso-height-percent:0;mso-width-relative:margin;mso-height-relative:margin" o:gfxdata="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" strokecolor="red" strokeweight="2pt">
+              <v:shape w14:anchorId="52CE15AE" id="Straight Arrow Connector 130989073" o:spid="_x0000_s1026" type="#_x0000_t32" style="position:absolute;margin-left:177.75pt;margin-top:21pt;width:123pt;height:3.6pt;flip:x;z-index:251883520;visibility:visible;mso-wrap-style:square;mso-width-percent:0;mso-height-percent:0;mso-wrap-distance-left:9pt;mso-wrap-distance-top:0;mso-wrap-distance-right:9pt;mso-wrap-distance-bottom:0;mso-position-horizontal:absolute;mso-position-horizontal-relative:margin;mso-position-vertical:absolute;mso-position-vertical-relative:text;mso-width-percent:0;mso-height-percent:0;mso-width-relative:margin;mso-height-relative:margin" o:gfxdata="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" strokecolor="red" strokeweight="2pt">
                 <v:stroke endarrow="open"/>
                 <w10:wrap anchorx="margin"/>
               </v:shape>
@@ -8862,7 +9055,7 @@
           </mc:Choice>
           <mc:Fallback>
             <w:pict>
-              <v:shape w14:anchorId="0B84254C" id="TextBox 34" o:spid="_x0000_s1049" type="#_x0000_t202" style="position:absolute;left:0;text-align:left;margin-left:307.5pt;margin-top:80.95pt;width:125.7pt;height:41.2pt;z-index:251882496;visibility:visible;mso-wrap-style:square;mso-wrap-distance-left:9pt;mso-wrap-distance-top:0;mso-wrap-distance-right:9pt;mso-wrap-distance-bottom:0;mso-position-horizontal:absolute;mso-position-horizontal-relative:text;mso-position-vertical:absolute;mso-position-vertical-relative:text;v-text-anchor:top" o:gfxdata="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" filled="f" stroked="f">
+              <v:shape w14:anchorId="0B84254C" id="TextBox 34" o:spid="_x0000_s1051" type="#_x0000_t202" style="position:absolute;left:0;text-align:left;margin-left:307.5pt;margin-top:80.95pt;width:125.7pt;height:41.2pt;z-index:251882496;visibility:visible;mso-wrap-style:square;mso-wrap-distance-left:9pt;mso-wrap-distance-top:0;mso-wrap-distance-right:9pt;mso-wrap-distance-bottom:0;mso-position-horizontal:absolute;mso-position-horizontal-relative:text;mso-position-vertical:absolute;mso-position-vertical-relative:text;v-text-anchor:top" o:gfxdata="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" filled="f" stroked="f">
                 <v:textbox style="mso-fit-shape-to-text:t">
                   <w:txbxContent>
                     <w:p>
@@ -8975,7 +9168,7 @@
           </mc:Choice>
           <mc:Fallback>
             <w:pict>
-              <v:shape w14:anchorId="3A806ED9" id="TextBox 35" o:spid="_x0000_s1050" type="#_x0000_t202" style="position:absolute;left:0;text-align:left;margin-left:302.25pt;margin-top:8.2pt;width:138.75pt;height:41.2pt;z-index:251881472;visibility:visible;mso-wrap-style:square;mso-wrap-distance-left:9pt;mso-wrap-distance-top:0;mso-wrap-distance-right:9pt;mso-wrap-distance-bottom:0;mso-position-horizontal:absolute;mso-position-horizontal-relative:text;mso-position-vertical:absolute;mso-position-vertical-relative:text;v-text-anchor:top" o:gfxdata="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" filled="f" stroked="f">
+              <v:shape w14:anchorId="3A806ED9" id="TextBox 35" o:spid="_x0000_s1052" type="#_x0000_t202" style="position:absolute;left:0;text-align:left;margin-left:302.25pt;margin-top:8.2pt;width:138.75pt;height:41.2pt;z-index:251881472;visibility:visible;mso-wrap-style:square;mso-wrap-distance-left:9pt;mso-wrap-distance-top:0;mso-wrap-distance-right:9pt;mso-wrap-distance-bottom:0;mso-position-horizontal:absolute;mso-position-horizontal-relative:text;mso-position-vertical:absolute;mso-position-vertical-relative:text;v-text-anchor:top" o:gfxdata="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" filled="f" stroked="f">
                 <v:textbox style="mso-fit-shape-to-text:t">
                   <w:txbxContent>
                     <w:p>
@@ -9139,21 +9332,7 @@
         <w:rPr>
           <w:color w:val="000000" w:themeColor="text1"/>
         </w:rPr>
-        <w:t xml:space="preserve">When installing a </w:t>
-      </w:r>
-      <w:proofErr w:type="spellStart"/>
-      <w:r>
-        <w:rPr>
-          <w:color w:val="000000" w:themeColor="text1"/>
-        </w:rPr>
-        <w:t>FireFly</w:t>
-      </w:r>
-      <w:proofErr w:type="spellEnd"/>
-      <w:r>
-        <w:rPr>
-          <w:color w:val="000000" w:themeColor="text1"/>
-        </w:rPr>
-        <w:t xml:space="preserve"> module or cable, it is first placed over the low-speed connector.</w:t>
+        <w:t>When installing a FireFly module or cable, it is first placed over the low-speed connector.</w:t>
       </w:r>
     </w:p>
     <w:p>
@@ -9331,7 +9510,7 @@
           </mc:Choice>
           <mc:Fallback>
             <w:pict>
-              <v:shape w14:anchorId="327AC056" id="_x0000_s1051" type="#_x0000_t202" style="position:absolute;left:0;text-align:left;margin-left:321.75pt;margin-top:14.7pt;width:210.75pt;height:58.15pt;z-index:251885568;visibility:visible;mso-wrap-style:square;mso-width-percent:0;mso-wrap-distance-left:9pt;mso-wrap-distance-top:0;mso-wrap-distance-right:9pt;mso-wrap-distance-bottom:0;mso-position-horizontal:absolute;mso-position-horizontal-relative:margin;mso-position-vertical:absolute;mso-position-vertical-relative:text;mso-width-percent:0;mso-width-relative:margin;v-text-anchor:top" o:gfxdata="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" filled="f" stroked="f">
+              <v:shape w14:anchorId="327AC056" id="_x0000_s1053" type="#_x0000_t202" style="position:absolute;left:0;text-align:left;margin-left:321.75pt;margin-top:14.7pt;width:210.75pt;height:58.15pt;z-index:251885568;visibility:visible;mso-wrap-style:square;mso-width-percent:0;mso-wrap-distance-left:9pt;mso-wrap-distance-top:0;mso-wrap-distance-right:9pt;mso-wrap-distance-bottom:0;mso-position-horizontal:absolute;mso-position-horizontal-relative:margin;mso-position-vertical:absolute;mso-position-vertical-relative:text;mso-width-percent:0;mso-width-relative:margin;v-text-anchor:top" o:gfxdata="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" filled="f" stroked="f">
                 <v:textbox style="mso-fit-shape-to-text:t">
                   <w:txbxContent>
                     <w:p>
@@ -9460,7 +9639,7 @@
           </mc:Choice>
           <mc:Fallback>
             <w:pict>
-              <v:shape w14:anchorId="6C568595" id="Straight Arrow Connector 2097175971" o:spid="_x0000_s1026" type="#_x0000_t32" style="position:absolute;margin-left:137.25pt;margin-top:67.35pt;width:186.75pt;height:3.6pt;flip:x y;z-index:251889664;visibility:visible;mso-wrap-style:square;mso-width-percent:0;mso-height-percent:0;mso-wrap-distance-left:9pt;mso-wrap-distance-top:0;mso-wrap-distance-right:9pt;mso-wrap-distance-bottom:0;mso-position-horizontal:absolute;mso-position-horizontal-relative:margin;mso-position-vertical:absolute;mso-position-vertical-relative:text;mso-width-percent:0;mso-height-percent:0;mso-width-relative:margin;mso-height-relative:margin" o:gfxdata="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" strokecolor="red" strokeweight="2pt">
+              <v:shape w14:anchorId="03A12A90" id="Straight Arrow Connector 2097175971" o:spid="_x0000_s1026" type="#_x0000_t32" style="position:absolute;margin-left:137.25pt;margin-top:67.35pt;width:186.75pt;height:3.6pt;flip:x y;z-index:251889664;visibility:visible;mso-wrap-style:square;mso-width-percent:0;mso-height-percent:0;mso-wrap-distance-left:9pt;mso-wrap-distance-top:0;mso-wrap-distance-right:9pt;mso-wrap-distance-bottom:0;mso-position-horizontal:absolute;mso-position-horizontal-relative:margin;mso-position-vertical:absolute;mso-position-vertical-relative:text;mso-width-percent:0;mso-height-percent:0;mso-width-relative:margin;mso-height-relative:margin" o:gfxdata="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" strokecolor="red" strokeweight="2pt">
                 <v:stroke endarrow="open"/>
                 <w10:wrap anchorx="margin"/>
               </v:shape>
@@ -9542,7 +9721,7 @@
           </mc:Choice>
           <mc:Fallback>
             <w:pict>
-              <v:shape w14:anchorId="5F507BDF" id="TextBox 9" o:spid="_x0000_s1052" type="#_x0000_t202" style="position:absolute;left:0;text-align:left;margin-left:324pt;margin-top:55.75pt;width:210pt;height:92.1pt;z-index:251886592;visibility:visible;mso-wrap-style:square;mso-width-percent:0;mso-wrap-distance-left:9pt;mso-wrap-distance-top:0;mso-wrap-distance-right:9pt;mso-wrap-distance-bottom:0;mso-position-horizontal:absolute;mso-position-horizontal-relative:margin;mso-position-vertical:absolute;mso-position-vertical-relative:text;mso-width-percent:0;mso-width-relative:margin;v-text-anchor:top" o:gfxdata="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" filled="f" stroked="f">
+              <v:shape w14:anchorId="5F507BDF" id="TextBox 9" o:spid="_x0000_s1054" type="#_x0000_t202" style="position:absolute;left:0;text-align:left;margin-left:324pt;margin-top:55.75pt;width:210pt;height:92.1pt;z-index:251886592;visibility:visible;mso-wrap-style:square;mso-width-percent:0;mso-wrap-distance-left:9pt;mso-wrap-distance-top:0;mso-wrap-distance-right:9pt;mso-wrap-distance-bottom:0;mso-position-horizontal:absolute;mso-position-horizontal-relative:margin;mso-position-vertical:absolute;mso-position-vertical-relative:text;mso-width-percent:0;mso-width-relative:margin;v-text-anchor:top" o:gfxdata="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" filled="f" stroked="f">
                 <v:textbox style="mso-fit-shape-to-text:t">
                   <w:txbxContent>
                     <w:p>
@@ -9642,7 +9821,7 @@
           </mc:Choice>
           <mc:Fallback>
             <w:pict>
-              <v:shape w14:anchorId="5ED7CA38" id="Straight Arrow Connector 1825272069" o:spid="_x0000_s1026" type="#_x0000_t32" style="position:absolute;margin-left:202.5pt;margin-top:12.15pt;width:126.75pt;height:3.6pt;flip:x;z-index:251888640;visibility:visible;mso-wrap-style:square;mso-width-percent:0;mso-height-percent:0;mso-wrap-distance-left:9pt;mso-wrap-distance-top:0;mso-wrap-distance-right:9pt;mso-wrap-distance-bottom:0;mso-position-horizontal:absolute;mso-position-horizontal-relative:margin;mso-position-vertical:absolute;mso-position-vertical-relative:text;mso-width-percent:0;mso-height-percent:0;mso-width-relative:margin;mso-height-relative:margin" o:gfxdata="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" strokecolor="red" strokeweight="2pt">
+              <v:shape w14:anchorId="2686B342" id="Straight Arrow Connector 1825272069" o:spid="_x0000_s1026" type="#_x0000_t32" style="position:absolute;margin-left:202.5pt;margin-top:12.15pt;width:126.75pt;height:3.6pt;flip:x;z-index:251888640;visibility:visible;mso-wrap-style:square;mso-width-percent:0;mso-height-percent:0;mso-wrap-distance-left:9pt;mso-wrap-distance-top:0;mso-wrap-distance-right:9pt;mso-wrap-distance-bottom:0;mso-position-horizontal:absolute;mso-position-horizontal-relative:margin;mso-position-vertical:absolute;mso-position-vertical-relative:text;mso-width-percent:0;mso-height-percent:0;mso-width-relative:margin;mso-height-relative:margin" o:gfxdata="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" strokecolor="red" strokeweight="2pt">
                 <v:stroke endarrow="open"/>
                 <w10:wrap anchorx="margin"/>
               </v:shape>
@@ -9797,7 +9976,7 @@
           </mc:Choice>
           <mc:Fallback>
             <w:pict>
-              <v:shape w14:anchorId="2F9AB130" id="Straight Arrow Connector 109125865" o:spid="_x0000_s1026" type="#_x0000_t32" style="position:absolute;margin-left:123pt;margin-top:38.8pt;width:207pt;height:33.75pt;flip:x;z-index:251890688;visibility:visible;mso-wrap-style:square;mso-width-percent:0;mso-height-percent:0;mso-wrap-distance-left:9pt;mso-wrap-distance-top:0;mso-wrap-distance-right:9pt;mso-wrap-distance-bottom:0;mso-position-horizontal:absolute;mso-position-horizontal-relative:margin;mso-position-vertical:absolute;mso-position-vertical-relative:text;mso-width-percent:0;mso-height-percent:0;mso-width-relative:margin;mso-height-relative:margin" o:gfxdata="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" strokecolor="red" strokeweight="2pt">
+              <v:shape w14:anchorId="72741B85" id="Straight Arrow Connector 109125865" o:spid="_x0000_s1026" type="#_x0000_t32" style="position:absolute;margin-left:123pt;margin-top:38.8pt;width:207pt;height:33.75pt;flip:x;z-index:251890688;visibility:visible;mso-wrap-style:square;mso-width-percent:0;mso-height-percent:0;mso-wrap-distance-left:9pt;mso-wrap-distance-top:0;mso-wrap-distance-right:9pt;mso-wrap-distance-bottom:0;mso-position-horizontal:absolute;mso-position-horizontal-relative:margin;mso-position-vertical:absolute;mso-position-vertical-relative:text;mso-width-percent:0;mso-height-percent:0;mso-width-relative:margin;mso-height-relative:margin" o:gfxdata="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" strokecolor="red" strokeweight="2pt">
                 <v:stroke endarrow="open"/>
                 <w10:wrap anchorx="margin"/>
               </v:shape>
@@ -9879,7 +10058,7 @@
           </mc:Choice>
           <mc:Fallback>
             <w:pict>
-              <v:shape w14:anchorId="41B7BA1F" id="TextBox 18" o:spid="_x0000_s1053" type="#_x0000_t202" style="position:absolute;left:0;text-align:left;margin-left:330.75pt;margin-top:26.05pt;width:198pt;height:58.15pt;z-index:251887616;visibility:visible;mso-wrap-style:square;mso-width-percent:0;mso-wrap-distance-left:9pt;mso-wrap-distance-top:0;mso-wrap-distance-right:9pt;mso-wrap-distance-bottom:0;mso-position-horizontal:absolute;mso-position-horizontal-relative:text;mso-position-vertical:absolute;mso-position-vertical-relative:text;mso-width-percent:0;mso-width-relative:margin;v-text-anchor:top" o:gfxdata="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" filled="f" stroked="f">
+              <v:shape w14:anchorId="41B7BA1F" id="TextBox 18" o:spid="_x0000_s1055" type="#_x0000_t202" style="position:absolute;left:0;text-align:left;margin-left:330.75pt;margin-top:26.05pt;width:198pt;height:58.15pt;z-index:251887616;visibility:visible;mso-wrap-style:square;mso-width-percent:0;mso-wrap-distance-left:9pt;mso-wrap-distance-top:0;mso-wrap-distance-right:9pt;mso-wrap-distance-bottom:0;mso-position-horizontal:absolute;mso-position-horizontal-relative:text;mso-position-vertical:absolute;mso-position-vertical-relative:text;mso-width-percent:0;mso-width-relative:margin;v-text-anchor:top" o:gfxdata="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" filled="f" stroked="f">
                 <v:textbox style="mso-fit-shape-to-text:t">
                   <w:txbxContent>
                     <w:p>
@@ -10215,7 +10394,7 @@
           </mc:Choice>
           <mc:Fallback>
             <w:pict>
-              <v:shape w14:anchorId="5FA5FEB6" id="Straight Arrow Connector 628263337" o:spid="_x0000_s1026" type="#_x0000_t32" style="position:absolute;margin-left:185.25pt;margin-top:21.25pt;width:102.75pt;height:31.5pt;flip:x;z-index:251893760;visibility:visible;mso-wrap-style:square;mso-width-percent:0;mso-height-percent:0;mso-wrap-distance-left:9pt;mso-wrap-distance-top:0;mso-wrap-distance-right:9pt;mso-wrap-distance-bottom:0;mso-position-horizontal:absolute;mso-position-horizontal-relative:margin;mso-position-vertical:absolute;mso-position-vertical-relative:text;mso-width-percent:0;mso-height-percent:0;mso-width-relative:margin;mso-height-relative:margin" o:gfxdata="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" strokecolor="red" strokeweight="2pt">
+              <v:shape w14:anchorId="6EEA7834" id="Straight Arrow Connector 628263337" o:spid="_x0000_s1026" type="#_x0000_t32" style="position:absolute;margin-left:185.25pt;margin-top:21.25pt;width:102.75pt;height:31.5pt;flip:x;z-index:251893760;visibility:visible;mso-wrap-style:square;mso-width-percent:0;mso-height-percent:0;mso-wrap-distance-left:9pt;mso-wrap-distance-top:0;mso-wrap-distance-right:9pt;mso-wrap-distance-bottom:0;mso-position-horizontal:absolute;mso-position-horizontal-relative:margin;mso-position-vertical:absolute;mso-position-vertical-relative:text;mso-width-percent:0;mso-height-percent:0;mso-width-relative:margin;mso-height-relative:margin" o:gfxdata="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" strokecolor="red" strokeweight="2pt">
                 <v:stroke endarrow="open"/>
                 <w10:wrap anchorx="margin"/>
               </v:shape>
@@ -10294,7 +10473,7 @@
           </mc:Choice>
           <mc:Fallback>
             <w:pict>
-              <v:shape w14:anchorId="18F2BF8A" id="TextBox 82" o:spid="_x0000_s1054" type="#_x0000_t202" style="position:absolute;left:0;text-align:left;margin-left:289.25pt;margin-top:6pt;width:213.25pt;height:58.15pt;z-index:251892736;visibility:visible;mso-wrap-style:square;mso-wrap-distance-left:9pt;mso-wrap-distance-top:0;mso-wrap-distance-right:9pt;mso-wrap-distance-bottom:0;mso-position-horizontal:absolute;mso-position-horizontal-relative:margin;mso-position-vertical:absolute;mso-position-vertical-relative:text;v-text-anchor:top" o:gfxdata="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" filled="f" stroked="f">
+              <v:shape w14:anchorId="18F2BF8A" id="TextBox 82" o:spid="_x0000_s1056" type="#_x0000_t202" style="position:absolute;left:0;text-align:left;margin-left:289.25pt;margin-top:6pt;width:213.25pt;height:58.15pt;z-index:251892736;visibility:visible;mso-wrap-style:square;mso-wrap-distance-left:9pt;mso-wrap-distance-top:0;mso-wrap-distance-right:9pt;mso-wrap-distance-bottom:0;mso-position-horizontal:absolute;mso-position-horizontal-relative:margin;mso-position-vertical:absolute;mso-position-vertical-relative:text;v-text-anchor:top" o:gfxdata="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" filled="f" stroked="f">
                 <v:textbox style="mso-fit-shape-to-text:t">
                   <w:txbxContent>
                     <w:p>
@@ -10494,7 +10673,7 @@
           </mc:Choice>
           <mc:Fallback>
             <w:pict>
-              <v:shape w14:anchorId="4AE28997" id="TextBox 39" o:spid="_x0000_s1055" type="#_x0000_t202" style="position:absolute;left:0;text-align:left;margin-left:325.5pt;margin-top:16pt;width:204pt;height:92.1pt;z-index:251894784;visibility:visible;mso-wrap-style:square;mso-width-percent:0;mso-wrap-distance-left:9pt;mso-wrap-distance-top:0;mso-wrap-distance-right:9pt;mso-wrap-distance-bottom:0;mso-position-horizontal:absolute;mso-position-horizontal-relative:margin;mso-position-vertical:absolute;mso-position-vertical-relative:text;mso-width-percent:0;mso-width-relative:margin;v-text-anchor:top" o:gfxdata="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" filled="f" stroked="f">
+              <v:shape w14:anchorId="4AE28997" id="TextBox 39" o:spid="_x0000_s1057" type="#_x0000_t202" style="position:absolute;left:0;text-align:left;margin-left:325.5pt;margin-top:16pt;width:204pt;height:92.1pt;z-index:251894784;visibility:visible;mso-wrap-style:square;mso-width-percent:0;mso-wrap-distance-left:9pt;mso-wrap-distance-top:0;mso-wrap-distance-right:9pt;mso-wrap-distance-bottom:0;mso-position-horizontal:absolute;mso-position-horizontal-relative:margin;mso-position-vertical:absolute;mso-position-vertical-relative:text;mso-width-percent:0;mso-width-relative:margin;v-text-anchor:top" o:gfxdata="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" filled="f" stroked="f">
                 <v:textbox style="mso-fit-shape-to-text:t">
                   <w:txbxContent>
                     <w:p>
@@ -10599,7 +10778,7 @@
           </mc:Choice>
           <mc:Fallback>
             <w:pict>
-              <v:shape w14:anchorId="7969A5FE" id="Straight Arrow Connector 22" o:spid="_x0000_s1026" type="#_x0000_t32" style="position:absolute;margin-left:104.25pt;margin-top:-7.65pt;width:130.9pt;height:154.65pt;flip:x;z-index:251897856;visibility:visible;mso-wrap-style:square;mso-width-percent:0;mso-height-percent:0;mso-wrap-distance-left:9pt;mso-wrap-distance-top:0;mso-wrap-distance-right:9pt;mso-wrap-distance-bottom:0;mso-position-horizontal:absolute;mso-position-horizontal-relative:text;mso-position-vertical:absolute;mso-position-vertical-relative:text;mso-width-percent:0;mso-height-percent:0;mso-width-relative:margin;mso-height-relative:margin" o:gfxdata="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" strokecolor="red" strokeweight="3.5pt">
+              <v:shape w14:anchorId="239BBCCD" id="Straight Arrow Connector 22" o:spid="_x0000_s1026" type="#_x0000_t32" style="position:absolute;margin-left:104.25pt;margin-top:-7.65pt;width:130.9pt;height:154.65pt;flip:x;z-index:251897856;visibility:visible;mso-wrap-style:square;mso-width-percent:0;mso-height-percent:0;mso-wrap-distance-left:9pt;mso-wrap-distance-top:0;mso-wrap-distance-right:9pt;mso-wrap-distance-bottom:0;mso-position-horizontal:absolute;mso-position-horizontal-relative:text;mso-position-vertical:absolute;mso-position-vertical-relative:text;mso-width-percent:0;mso-height-percent:0;mso-width-relative:margin;mso-height-relative:margin" o:gfxdata="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" strokecolor="red" strokeweight="3.5pt">
                 <v:shadow on="t" color="black" opacity="24903f" origin=",.5" offset="0,.55556mm"/>
                 <o:lock v:ext="edit" shapetype="f"/>
               </v:shape>
@@ -10674,7 +10853,7 @@
           </mc:Choice>
           <mc:Fallback>
             <w:pict>
-              <v:shape w14:anchorId="0EB8B5D6" id="Straight Arrow Connector 22" o:spid="_x0000_s1026" type="#_x0000_t32" style="position:absolute;margin-left:102pt;margin-top:-18.1pt;width:172.85pt;height:161.45pt;z-index:251896832;visibility:visible;mso-wrap-style:square;mso-wrap-distance-left:9pt;mso-wrap-distance-top:0;mso-wrap-distance-right:9pt;mso-wrap-distance-bottom:0;mso-position-horizontal:absolute;mso-position-horizontal-relative:text;mso-position-vertical:absolute;mso-position-vertical-relative:text" o:gfxdata="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" strokecolor="red" strokeweight="3.5pt">
+              <v:shape w14:anchorId="27E71F84" id="Straight Arrow Connector 22" o:spid="_x0000_s1026" type="#_x0000_t32" style="position:absolute;margin-left:102pt;margin-top:-18.1pt;width:172.85pt;height:161.45pt;z-index:251896832;visibility:visible;mso-wrap-style:square;mso-wrap-distance-left:9pt;mso-wrap-distance-top:0;mso-wrap-distance-right:9pt;mso-wrap-distance-bottom:0;mso-position-horizontal:absolute;mso-position-horizontal-relative:text;mso-position-vertical:absolute;mso-position-vertical-relative:text" o:gfxdata="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" strokecolor="red" strokeweight="3.5pt">
                 <v:shadow on="t" color="black" opacity="24903f" origin=",.5" offset="0,.55556mm"/>
                 <o:lock v:ext="edit" shapetype="f"/>
               </v:shape>
@@ -10750,7 +10929,7 @@
           </mc:Choice>
           <mc:Fallback>
             <w:pict>
-              <v:shape w14:anchorId="1962A985" id="Straight Arrow Connector 846570610" o:spid="_x0000_s1026" type="#_x0000_t32" style="position:absolute;margin-left:222pt;margin-top:13.75pt;width:118.5pt;height:18pt;flip:x;z-index:251895808;visibility:visible;mso-wrap-style:square;mso-width-percent:0;mso-height-percent:0;mso-wrap-distance-left:9pt;mso-wrap-distance-top:0;mso-wrap-distance-right:9pt;mso-wrap-distance-bottom:0;mso-position-horizontal:absolute;mso-position-horizontal-relative:margin;mso-position-vertical:absolute;mso-position-vertical-relative:text;mso-width-percent:0;mso-height-percent:0;mso-width-relative:margin;mso-height-relative:margin" o:gfxdata="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" strokecolor="red" strokeweight="2pt">
+              <v:shape w14:anchorId="35E6191C" id="Straight Arrow Connector 846570610" o:spid="_x0000_s1026" type="#_x0000_t32" style="position:absolute;margin-left:222pt;margin-top:13.75pt;width:118.5pt;height:18pt;flip:x;z-index:251895808;visibility:visible;mso-wrap-style:square;mso-width-percent:0;mso-height-percent:0;mso-wrap-distance-left:9pt;mso-wrap-distance-top:0;mso-wrap-distance-right:9pt;mso-wrap-distance-bottom:0;mso-position-horizontal:absolute;mso-position-horizontal-relative:margin;mso-position-vertical:absolute;mso-position-vertical-relative:text;mso-width-percent:0;mso-height-percent:0;mso-width-relative:margin;mso-height-relative:margin" o:gfxdata="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" strokecolor="red" strokeweight="2pt">
                 <v:stroke endarrow="open"/>
                 <w10:wrap anchorx="margin"/>
               </v:shape>
@@ -10901,7 +11080,7 @@
           </mc:Choice>
           <mc:Fallback>
             <w:pict>
-              <v:shape w14:anchorId="0A5C051D" id="Straight Arrow Connector 22" o:spid="_x0000_s1026" type="#_x0000_t32" style="position:absolute;margin-left:137.25pt;margin-top:3.75pt;width:103.9pt;height:116.25pt;flip:x;z-index:251900928;visibility:visible;mso-wrap-style:square;mso-width-percent:0;mso-height-percent:0;mso-wrap-distance-left:9pt;mso-wrap-distance-top:0;mso-wrap-distance-right:9pt;mso-wrap-distance-bottom:0;mso-position-horizontal:absolute;mso-position-horizontal-relative:text;mso-position-vertical:absolute;mso-position-vertical-relative:text;mso-width-percent:0;mso-height-percent:0;mso-width-relative:margin;mso-height-relative:margin" o:gfxdata="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" strokecolor="red" strokeweight="3.5pt">
+              <v:shape w14:anchorId="08378F85" id="Straight Arrow Connector 22" o:spid="_x0000_s1026" type="#_x0000_t32" style="position:absolute;margin-left:137.25pt;margin-top:3.75pt;width:103.9pt;height:116.25pt;flip:x;z-index:251900928;visibility:visible;mso-wrap-style:square;mso-width-percent:0;mso-height-percent:0;mso-wrap-distance-left:9pt;mso-wrap-distance-top:0;mso-wrap-distance-right:9pt;mso-wrap-distance-bottom:0;mso-position-horizontal:absolute;mso-position-horizontal-relative:text;mso-position-vertical:absolute;mso-position-vertical-relative:text;mso-width-percent:0;mso-height-percent:0;mso-width-relative:margin;mso-height-relative:margin" o:gfxdata="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" strokecolor="red" strokeweight="3.5pt">
                 <v:shadow on="t" color="black" opacity="24903f" origin=",.5" offset="0,.55556mm"/>
                 <o:lock v:ext="edit" shapetype="f"/>
               </v:shape>
@@ -10982,7 +11161,7 @@
           </mc:Choice>
           <mc:Fallback>
             <w:pict>
-              <v:shape w14:anchorId="566E25BF" id="Straight Arrow Connector 22" o:spid="_x0000_s1026" type="#_x0000_t32" style="position:absolute;margin-left:122.25pt;margin-top:3pt;width:132pt;height:118.5pt;z-index:251899904;visibility:visible;mso-wrap-style:square;mso-width-percent:0;mso-height-percent:0;mso-wrap-distance-left:9pt;mso-wrap-distance-top:0;mso-wrap-distance-right:9pt;mso-wrap-distance-bottom:0;mso-position-horizontal:absolute;mso-position-horizontal-relative:text;mso-position-vertical:absolute;mso-position-vertical-relative:text;mso-width-percent:0;mso-height-percent:0;mso-width-relative:margin;mso-height-relative:margin" o:gfxdata="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" strokecolor="red" strokeweight="3.5pt">
+              <v:shape w14:anchorId="75E23A15" id="Straight Arrow Connector 22" o:spid="_x0000_s1026" type="#_x0000_t32" style="position:absolute;margin-left:122.25pt;margin-top:3pt;width:132pt;height:118.5pt;z-index:251899904;visibility:visible;mso-wrap-style:square;mso-width-percent:0;mso-height-percent:0;mso-wrap-distance-left:9pt;mso-wrap-distance-top:0;mso-wrap-distance-right:9pt;mso-wrap-distance-bottom:0;mso-position-horizontal:absolute;mso-position-horizontal-relative:text;mso-position-vertical:absolute;mso-position-vertical-relative:text;mso-width-percent:0;mso-height-percent:0;mso-width-relative:margin;mso-height-relative:margin" o:gfxdata="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" strokecolor="red" strokeweight="3.5pt">
                 <v:shadow on="t" color="black" opacity="24903f" origin=",.5" offset="0,.55556mm"/>
                 <o:lock v:ext="edit" shapetype="f"/>
               </v:shape>
@@ -11067,7 +11246,7 @@
           </mc:Choice>
           <mc:Fallback>
             <w:pict>
-              <v:shape w14:anchorId="46D97E45" id="Straight Arrow Connector 1378647586" o:spid="_x0000_s1026" type="#_x0000_t32" style="position:absolute;margin-left:125.25pt;margin-top:17.55pt;width:216.75pt;height:56.25pt;flip:x;z-index:251898880;visibility:visible;mso-wrap-style:square;mso-width-percent:0;mso-height-percent:0;mso-wrap-distance-left:9pt;mso-wrap-distance-top:0;mso-wrap-distance-right:9pt;mso-wrap-distance-bottom:0;mso-position-horizontal:absolute;mso-position-horizontal-relative:margin;mso-position-vertical:absolute;mso-position-vertical-relative:text;mso-width-percent:0;mso-height-percent:0;mso-width-relative:margin;mso-height-relative:margin" o:gfxdata="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" strokecolor="red" strokeweight="2pt">
+              <v:shape w14:anchorId="73699703" id="Straight Arrow Connector 1378647586" o:spid="_x0000_s1026" type="#_x0000_t32" style="position:absolute;margin-left:125.25pt;margin-top:17.55pt;width:216.75pt;height:56.25pt;flip:x;z-index:251898880;visibility:visible;mso-wrap-style:square;mso-width-percent:0;mso-height-percent:0;mso-wrap-distance-left:9pt;mso-wrap-distance-top:0;mso-wrap-distance-right:9pt;mso-wrap-distance-bottom:0;mso-position-horizontal:absolute;mso-position-horizontal-relative:margin;mso-position-vertical:absolute;mso-position-vertical-relative:text;mso-width-percent:0;mso-height-percent:0;mso-width-relative:margin;mso-height-relative:margin" o:gfxdata="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" strokecolor="red" strokeweight="2pt">
                 <v:stroke endarrow="open"/>
                 <w10:wrap anchorx="margin"/>
               </v:shape>
@@ -11149,7 +11328,7 @@
           </mc:Choice>
           <mc:Fallback>
             <w:pict>
-              <v:shape w14:anchorId="3B4C9674" id="TextBox 57" o:spid="_x0000_s1056" type="#_x0000_t202" style="position:absolute;left:0;text-align:left;margin-left:338.25pt;margin-top:5.55pt;width:189.75pt;height:58.15pt;z-index:251901952;visibility:visible;mso-wrap-style:square;mso-width-percent:0;mso-wrap-distance-left:9pt;mso-wrap-distance-top:0;mso-wrap-distance-right:9pt;mso-wrap-distance-bottom:0;mso-position-horizontal:absolute;mso-position-horizontal-relative:text;mso-position-vertical:absolute;mso-position-vertical-relative:text;mso-width-percent:0;mso-width-relative:margin;v-text-anchor:top" o:gfxdata="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" filled="f" stroked="f">
+              <v:shape w14:anchorId="3B4C9674" id="TextBox 57" o:spid="_x0000_s1058" type="#_x0000_t202" style="position:absolute;left:0;text-align:left;margin-left:338.25pt;margin-top:5.55pt;width:189.75pt;height:58.15pt;z-index:251901952;visibility:visible;mso-wrap-style:square;mso-width-percent:0;mso-wrap-distance-left:9pt;mso-wrap-distance-top:0;mso-wrap-distance-right:9pt;mso-wrap-distance-bottom:0;mso-position-horizontal:absolute;mso-position-horizontal-relative:text;mso-position-vertical:absolute;mso-position-vertical-relative:text;mso-width-percent:0;mso-width-relative:margin;v-text-anchor:top" o:gfxdata="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" filled="f" stroked="f">
                 <v:textbox style="mso-fit-shape-to-text:t">
                   <w:txbxContent>
                     <w:p>
@@ -11323,7 +11502,7 @@
           </mc:Choice>
           <mc:Fallback>
             <w:pict>
-              <v:shape w14:anchorId="6514D737" id="Straight Arrow Connector 22" o:spid="_x0000_s1026" type="#_x0000_t32" style="position:absolute;margin-left:157.5pt;margin-top:12.55pt;width:112.15pt;height:141.75pt;flip:x;z-index:251906048;visibility:visible;mso-wrap-style:square;mso-width-percent:0;mso-height-percent:0;mso-wrap-distance-left:9pt;mso-wrap-distance-top:0;mso-wrap-distance-right:9pt;mso-wrap-distance-bottom:0;mso-position-horizontal:absolute;mso-position-horizontal-relative:text;mso-position-vertical:absolute;mso-position-vertical-relative:text;mso-width-percent:0;mso-height-percent:0;mso-width-relative:margin;mso-height-relative:margin" o:gfxdata="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" strokecolor="red" strokeweight="3.5pt">
+              <v:shape w14:anchorId="5D6E2D86" id="Straight Arrow Connector 22" o:spid="_x0000_s1026" type="#_x0000_t32" style="position:absolute;margin-left:157.5pt;margin-top:12.55pt;width:112.15pt;height:141.75pt;flip:x;z-index:251906048;visibility:visible;mso-wrap-style:square;mso-width-percent:0;mso-height-percent:0;mso-wrap-distance-left:9pt;mso-wrap-distance-top:0;mso-wrap-distance-right:9pt;mso-wrap-distance-bottom:0;mso-position-horizontal:absolute;mso-position-horizontal-relative:text;mso-position-vertical:absolute;mso-position-vertical-relative:text;mso-width-percent:0;mso-height-percent:0;mso-width-relative:margin;mso-height-relative:margin" o:gfxdata="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" strokecolor="red" strokeweight="3.5pt">
                 <v:shadow on="t" color="black" opacity="24903f" origin=",.5" offset="0,.55556mm"/>
                 <o:lock v:ext="edit" shapetype="f"/>
               </v:shape>
@@ -11404,7 +11583,7 @@
           </mc:Choice>
           <mc:Fallback>
             <w:pict>
-              <v:shape w14:anchorId="758FAF58" id="Straight Arrow Connector 22" o:spid="_x0000_s1026" type="#_x0000_t32" style="position:absolute;margin-left:153.75pt;margin-top:9.55pt;width:96pt;height:150pt;z-index:251905024;visibility:visible;mso-wrap-style:square;mso-width-percent:0;mso-height-percent:0;mso-wrap-distance-left:9pt;mso-wrap-distance-top:0;mso-wrap-distance-right:9pt;mso-wrap-distance-bottom:0;mso-position-horizontal:absolute;mso-position-horizontal-relative:text;mso-position-vertical:absolute;mso-position-vertical-relative:text;mso-width-percent:0;mso-height-percent:0;mso-width-relative:margin;mso-height-relative:margin" o:gfxdata="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" strokecolor="red" strokeweight="3.5pt">
+              <v:shape w14:anchorId="46DB2A69" id="Straight Arrow Connector 22" o:spid="_x0000_s1026" type="#_x0000_t32" style="position:absolute;margin-left:153.75pt;margin-top:9.55pt;width:96pt;height:150pt;z-index:251905024;visibility:visible;mso-wrap-style:square;mso-width-percent:0;mso-height-percent:0;mso-wrap-distance-left:9pt;mso-wrap-distance-top:0;mso-wrap-distance-right:9pt;mso-wrap-distance-bottom:0;mso-position-horizontal:absolute;mso-position-horizontal-relative:text;mso-position-vertical:absolute;mso-position-vertical-relative:text;mso-width-percent:0;mso-height-percent:0;mso-width-relative:margin;mso-height-relative:margin" o:gfxdata="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" strokecolor="red" strokeweight="3.5pt">
                 <v:shadow on="t" color="black" opacity="24903f" origin=",.5" offset="0,.55556mm"/>
                 <o:lock v:ext="edit" shapetype="f"/>
               </v:shape>
@@ -11480,7 +11659,7 @@
           </mc:Choice>
           <mc:Fallback>
             <w:pict>
-              <v:shape w14:anchorId="1716342E" id="Straight Arrow Connector 671579531" o:spid="_x0000_s1026" type="#_x0000_t32" style="position:absolute;margin-left:156pt;margin-top:29.05pt;width:192pt;height:57.75pt;flip:x;z-index:251904000;visibility:visible;mso-wrap-style:square;mso-width-percent:0;mso-height-percent:0;mso-wrap-distance-left:9pt;mso-wrap-distance-top:0;mso-wrap-distance-right:9pt;mso-wrap-distance-bottom:0;mso-position-horizontal:absolute;mso-position-horizontal-relative:margin;mso-position-vertical:absolute;mso-position-vertical-relative:text;mso-width-percent:0;mso-height-percent:0;mso-width-relative:margin;mso-height-relative:margin" o:gfxdata="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" strokecolor="red" strokeweight="2pt">
+              <v:shape w14:anchorId="3C1F0097" id="Straight Arrow Connector 671579531" o:spid="_x0000_s1026" type="#_x0000_t32" style="position:absolute;margin-left:156pt;margin-top:29.05pt;width:192pt;height:57.75pt;flip:x;z-index:251904000;visibility:visible;mso-wrap-style:square;mso-width-percent:0;mso-height-percent:0;mso-wrap-distance-left:9pt;mso-wrap-distance-top:0;mso-wrap-distance-right:9pt;mso-wrap-distance-bottom:0;mso-position-horizontal:absolute;mso-position-horizontal-relative:margin;mso-position-vertical:absolute;mso-position-vertical-relative:text;mso-width-percent:0;mso-height-percent:0;mso-width-relative:margin;mso-height-relative:margin" o:gfxdata="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" strokecolor="red" strokeweight="2pt">
                 <v:stroke endarrow="open"/>
                 <w10:wrap anchorx="margin"/>
               </v:shape>
@@ -11571,7 +11750,7 @@
           </mc:Choice>
           <mc:Fallback>
             <w:pict>
-              <v:shape w14:anchorId="04736255" id="TextBox 63" o:spid="_x0000_s1057" type="#_x0000_t202" style="position:absolute;left:0;text-align:left;margin-left:345.75pt;margin-top:.85pt;width:190.5pt;height:41.2pt;z-index:251902976;visibility:visible;mso-wrap-style:square;mso-width-percent:0;mso-wrap-distance-left:9pt;mso-wrap-distance-top:0;mso-wrap-distance-right:9pt;mso-wrap-distance-bottom:0;mso-position-horizontal:absolute;mso-position-horizontal-relative:text;mso-position-vertical:absolute;mso-position-vertical-relative:text;mso-width-percent:0;mso-width-relative:margin;v-text-anchor:top" o:gfxdata="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" filled="f" stroked="f">
+              <v:shape w14:anchorId="04736255" id="TextBox 63" o:spid="_x0000_s1059" type="#_x0000_t202" style="position:absolute;left:0;text-align:left;margin-left:345.75pt;margin-top:.85pt;width:190.5pt;height:41.2pt;z-index:251902976;visibility:visible;mso-wrap-style:square;mso-width-percent:0;mso-wrap-distance-left:9pt;mso-wrap-distance-top:0;mso-wrap-distance-right:9pt;mso-wrap-distance-bottom:0;mso-position-horizontal:absolute;mso-position-horizontal-relative:text;mso-position-vertical:absolute;mso-position-vertical-relative:text;mso-width-percent:0;mso-width-relative:margin;v-text-anchor:top" o:gfxdata="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" filled="f" stroked="f">
                 <v:textbox style="mso-fit-shape-to-text:t">
                   <w:txbxContent>
                     <w:p>
@@ -12630,6 +12809,96 @@
     </w:lvl>
   </w:abstractNum>
   <w:abstractNum w:abstractNumId="10" w15:restartNumberingAfterBreak="0">
+    <w:nsid w:val="14651EA1"/>
+    <w:multiLevelType w:val="hybridMultilevel"/>
+    <w:tmpl w:val="8620225A"/>
+    <w:lvl w:ilvl="0" w:tplc="000AF762">
+      <w:start w:val="1"/>
+      <w:numFmt w:val="decimal"/>
+      <w:lvlText w:val="%1)"/>
+      <w:lvlJc w:val="left"/>
+      <w:pPr>
+        <w:ind w:left="1080" w:hanging="360"/>
+      </w:pPr>
+      <w:rPr>
+        <w:rFonts w:hint="default"/>
+        <w:color w:val="000000" w:themeColor="text1"/>
+      </w:rPr>
+    </w:lvl>
+    <w:lvl w:ilvl="1" w:tplc="04090019" w:tentative="1">
+      <w:start w:val="1"/>
+      <w:numFmt w:val="lowerLetter"/>
+      <w:lvlText w:val="%2."/>
+      <w:lvlJc w:val="left"/>
+      <w:pPr>
+        <w:ind w:left="1440" w:hanging="360"/>
+      </w:pPr>
+    </w:lvl>
+    <w:lvl w:ilvl="2" w:tplc="0409001B" w:tentative="1">
+      <w:start w:val="1"/>
+      <w:numFmt w:val="lowerRoman"/>
+      <w:lvlText w:val="%3."/>
+      <w:lvlJc w:val="right"/>
+      <w:pPr>
+        <w:ind w:left="2160" w:hanging="180"/>
+      </w:pPr>
+    </w:lvl>
+    <w:lvl w:ilvl="3" w:tplc="0409000F" w:tentative="1">
+      <w:start w:val="1"/>
+      <w:numFmt w:val="decimal"/>
+      <w:lvlText w:val="%4."/>
+      <w:lvlJc w:val="left"/>
+      <w:pPr>
+        <w:ind w:left="2880" w:hanging="360"/>
+      </w:pPr>
+    </w:lvl>
+    <w:lvl w:ilvl="4" w:tplc="04090019" w:tentative="1">
+      <w:start w:val="1"/>
+      <w:numFmt w:val="lowerLetter"/>
+      <w:lvlText w:val="%5."/>
+      <w:lvlJc w:val="left"/>
+      <w:pPr>
+        <w:ind w:left="3600" w:hanging="360"/>
+      </w:pPr>
+    </w:lvl>
+    <w:lvl w:ilvl="5" w:tplc="0409001B" w:tentative="1">
+      <w:start w:val="1"/>
+      <w:numFmt w:val="lowerRoman"/>
+      <w:lvlText w:val="%6."/>
+      <w:lvlJc w:val="right"/>
+      <w:pPr>
+        <w:ind w:left="4320" w:hanging="180"/>
+      </w:pPr>
+    </w:lvl>
+    <w:lvl w:ilvl="6" w:tplc="0409000F" w:tentative="1">
+      <w:start w:val="1"/>
+      <w:numFmt w:val="decimal"/>
+      <w:lvlText w:val="%7."/>
+      <w:lvlJc w:val="left"/>
+      <w:pPr>
+        <w:ind w:left="5040" w:hanging="360"/>
+      </w:pPr>
+    </w:lvl>
+    <w:lvl w:ilvl="7" w:tplc="04090019" w:tentative="1">
+      <w:start w:val="1"/>
+      <w:numFmt w:val="lowerLetter"/>
+      <w:lvlText w:val="%8."/>
+      <w:lvlJc w:val="left"/>
+      <w:pPr>
+        <w:ind w:left="5760" w:hanging="360"/>
+      </w:pPr>
+    </w:lvl>
+    <w:lvl w:ilvl="8" w:tplc="0409001B" w:tentative="1">
+      <w:start w:val="1"/>
+      <w:numFmt w:val="lowerRoman"/>
+      <w:lvlText w:val="%9."/>
+      <w:lvlJc w:val="right"/>
+      <w:pPr>
+        <w:ind w:left="6480" w:hanging="180"/>
+      </w:pPr>
+    </w:lvl>
+  </w:abstractNum>
+  <w:abstractNum w:abstractNumId="11" w15:restartNumberingAfterBreak="0">
     <w:nsid w:val="15D53599"/>
     <w:multiLevelType w:val="hybridMultilevel"/>
     <w:tmpl w:val="02663DF8"/>
@@ -12715,7 +12984,7 @@
       </w:pPr>
     </w:lvl>
   </w:abstractNum>
-  <w:abstractNum w:abstractNumId="11" w15:restartNumberingAfterBreak="0">
+  <w:abstractNum w:abstractNumId="12" w15:restartNumberingAfterBreak="0">
     <w:nsid w:val="181A4146"/>
     <w:multiLevelType w:val="hybridMultilevel"/>
     <w:tmpl w:val="E57C83C8"/>
@@ -12801,7 +13070,7 @@
       </w:pPr>
     </w:lvl>
   </w:abstractNum>
-  <w:abstractNum w:abstractNumId="12" w15:restartNumberingAfterBreak="0">
+  <w:abstractNum w:abstractNumId="13" w15:restartNumberingAfterBreak="0">
     <w:nsid w:val="183152CF"/>
     <w:multiLevelType w:val="hybridMultilevel"/>
     <w:tmpl w:val="2B5A87B8"/>
@@ -12887,7 +13156,7 @@
       </w:pPr>
     </w:lvl>
   </w:abstractNum>
-  <w:abstractNum w:abstractNumId="13" w15:restartNumberingAfterBreak="0">
+  <w:abstractNum w:abstractNumId="14" w15:restartNumberingAfterBreak="0">
     <w:nsid w:val="1BB94F47"/>
     <w:multiLevelType w:val="hybridMultilevel"/>
     <w:tmpl w:val="6D92FF34"/>
@@ -12976,7 +13245,7 @@
       </w:pPr>
     </w:lvl>
   </w:abstractNum>
-  <w:abstractNum w:abstractNumId="14" w15:restartNumberingAfterBreak="0">
+  <w:abstractNum w:abstractNumId="15" w15:restartNumberingAfterBreak="0">
     <w:nsid w:val="219F7B87"/>
     <w:multiLevelType w:val="hybridMultilevel"/>
     <w:tmpl w:val="9FFACB24"/>
@@ -13089,7 +13358,7 @@
       </w:rPr>
     </w:lvl>
   </w:abstractNum>
-  <w:abstractNum w:abstractNumId="15" w15:restartNumberingAfterBreak="0">
+  <w:abstractNum w:abstractNumId="16" w15:restartNumberingAfterBreak="0">
     <w:nsid w:val="23F63E66"/>
     <w:multiLevelType w:val="hybridMultilevel"/>
     <w:tmpl w:val="722C71F6"/>
@@ -13178,7 +13447,7 @@
       </w:pPr>
     </w:lvl>
   </w:abstractNum>
-  <w:abstractNum w:abstractNumId="16" w15:restartNumberingAfterBreak="0">
+  <w:abstractNum w:abstractNumId="17" w15:restartNumberingAfterBreak="0">
     <w:nsid w:val="28434CE8"/>
     <w:multiLevelType w:val="hybridMultilevel"/>
     <w:tmpl w:val="E57C83C8"/>
@@ -13264,7 +13533,7 @@
       </w:pPr>
     </w:lvl>
   </w:abstractNum>
-  <w:abstractNum w:abstractNumId="17" w15:restartNumberingAfterBreak="0">
+  <w:abstractNum w:abstractNumId="18" w15:restartNumberingAfterBreak="0">
     <w:nsid w:val="28895311"/>
     <w:multiLevelType w:val="hybridMultilevel"/>
     <w:tmpl w:val="E57C83C8"/>
@@ -13350,7 +13619,7 @@
       </w:pPr>
     </w:lvl>
   </w:abstractNum>
-  <w:abstractNum w:abstractNumId="18" w15:restartNumberingAfterBreak="0">
+  <w:abstractNum w:abstractNumId="19" w15:restartNumberingAfterBreak="0">
     <w:nsid w:val="2B3547CB"/>
     <w:multiLevelType w:val="hybridMultilevel"/>
     <w:tmpl w:val="5F78F8F0"/>
@@ -13439,7 +13708,7 @@
       </w:pPr>
     </w:lvl>
   </w:abstractNum>
-  <w:abstractNum w:abstractNumId="19" w15:restartNumberingAfterBreak="0">
+  <w:abstractNum w:abstractNumId="20" w15:restartNumberingAfterBreak="0">
     <w:nsid w:val="2DB41C9E"/>
     <w:multiLevelType w:val="hybridMultilevel"/>
     <w:tmpl w:val="2D047BB2"/>
@@ -13525,7 +13794,7 @@
       </w:pPr>
     </w:lvl>
   </w:abstractNum>
-  <w:abstractNum w:abstractNumId="20" w15:restartNumberingAfterBreak="0">
+  <w:abstractNum w:abstractNumId="21" w15:restartNumberingAfterBreak="0">
     <w:nsid w:val="389B5AE9"/>
     <w:multiLevelType w:val="hybridMultilevel"/>
     <w:tmpl w:val="DE5C2E78"/>
@@ -13614,7 +13883,7 @@
       </w:pPr>
     </w:lvl>
   </w:abstractNum>
-  <w:abstractNum w:abstractNumId="21" w15:restartNumberingAfterBreak="0">
+  <w:abstractNum w:abstractNumId="22" w15:restartNumberingAfterBreak="0">
     <w:nsid w:val="38AE30F1"/>
     <w:multiLevelType w:val="hybridMultilevel"/>
     <w:tmpl w:val="6D92FF34"/>
@@ -13703,7 +13972,7 @@
       </w:pPr>
     </w:lvl>
   </w:abstractNum>
-  <w:abstractNum w:abstractNumId="22" w15:restartNumberingAfterBreak="0">
+  <w:abstractNum w:abstractNumId="23" w15:restartNumberingAfterBreak="0">
     <w:nsid w:val="3D1E5C1F"/>
     <w:multiLevelType w:val="hybridMultilevel"/>
     <w:tmpl w:val="9D8453B6"/>
@@ -13792,7 +14061,7 @@
       </w:pPr>
     </w:lvl>
   </w:abstractNum>
-  <w:abstractNum w:abstractNumId="23" w15:restartNumberingAfterBreak="0">
+  <w:abstractNum w:abstractNumId="24" w15:restartNumberingAfterBreak="0">
     <w:nsid w:val="42B00DA7"/>
     <w:multiLevelType w:val="hybridMultilevel"/>
     <w:tmpl w:val="0DBC4120"/>
@@ -13881,7 +14150,7 @@
       </w:pPr>
     </w:lvl>
   </w:abstractNum>
-  <w:abstractNum w:abstractNumId="24" w15:restartNumberingAfterBreak="0">
+  <w:abstractNum w:abstractNumId="25" w15:restartNumberingAfterBreak="0">
     <w:nsid w:val="44A40E1D"/>
     <w:multiLevelType w:val="hybridMultilevel"/>
     <w:tmpl w:val="263E78A0"/>
@@ -13970,7 +14239,7 @@
       </w:pPr>
     </w:lvl>
   </w:abstractNum>
-  <w:abstractNum w:abstractNumId="25" w15:restartNumberingAfterBreak="0">
+  <w:abstractNum w:abstractNumId="26" w15:restartNumberingAfterBreak="0">
     <w:nsid w:val="46DF1933"/>
     <w:multiLevelType w:val="hybridMultilevel"/>
     <w:tmpl w:val="F34099BA"/>
@@ -14060,7 +14329,7 @@
       </w:pPr>
     </w:lvl>
   </w:abstractNum>
-  <w:abstractNum w:abstractNumId="26" w15:restartNumberingAfterBreak="0">
+  <w:abstractNum w:abstractNumId="27" w15:restartNumberingAfterBreak="0">
     <w:nsid w:val="4B4D11A3"/>
     <w:multiLevelType w:val="hybridMultilevel"/>
     <w:tmpl w:val="DB4A312E"/>
@@ -14150,7 +14419,7 @@
       </w:pPr>
     </w:lvl>
   </w:abstractNum>
-  <w:abstractNum w:abstractNumId="27" w15:restartNumberingAfterBreak="0">
+  <w:abstractNum w:abstractNumId="28" w15:restartNumberingAfterBreak="0">
     <w:nsid w:val="4B776872"/>
     <w:multiLevelType w:val="hybridMultilevel"/>
     <w:tmpl w:val="263E78A0"/>
@@ -14239,7 +14508,7 @@
       </w:pPr>
     </w:lvl>
   </w:abstractNum>
-  <w:abstractNum w:abstractNumId="28" w15:restartNumberingAfterBreak="0">
+  <w:abstractNum w:abstractNumId="29" w15:restartNumberingAfterBreak="0">
     <w:nsid w:val="4D6B4AA9"/>
     <w:multiLevelType w:val="hybridMultilevel"/>
     <w:tmpl w:val="055E20F6"/>
@@ -14328,7 +14597,7 @@
       </w:pPr>
     </w:lvl>
   </w:abstractNum>
-  <w:abstractNum w:abstractNumId="29" w15:restartNumberingAfterBreak="0">
+  <w:abstractNum w:abstractNumId="30" w15:restartNumberingAfterBreak="0">
     <w:nsid w:val="54D1185E"/>
     <w:multiLevelType w:val="hybridMultilevel"/>
     <w:tmpl w:val="EA52F962"/>
@@ -14417,7 +14686,7 @@
       </w:pPr>
     </w:lvl>
   </w:abstractNum>
-  <w:abstractNum w:abstractNumId="30" w15:restartNumberingAfterBreak="0">
+  <w:abstractNum w:abstractNumId="31" w15:restartNumberingAfterBreak="0">
     <w:nsid w:val="556B2BC3"/>
     <w:multiLevelType w:val="hybridMultilevel"/>
     <w:tmpl w:val="6D92FF34"/>
@@ -14506,7 +14775,7 @@
       </w:pPr>
     </w:lvl>
   </w:abstractNum>
-  <w:abstractNum w:abstractNumId="31" w15:restartNumberingAfterBreak="0">
+  <w:abstractNum w:abstractNumId="32" w15:restartNumberingAfterBreak="0">
     <w:nsid w:val="55A433FA"/>
     <w:multiLevelType w:val="hybridMultilevel"/>
     <w:tmpl w:val="67605D76"/>
@@ -14596,7 +14865,7 @@
       </w:pPr>
     </w:lvl>
   </w:abstractNum>
-  <w:abstractNum w:abstractNumId="32" w15:restartNumberingAfterBreak="0">
+  <w:abstractNum w:abstractNumId="33" w15:restartNumberingAfterBreak="0">
     <w:nsid w:val="62994731"/>
     <w:multiLevelType w:val="hybridMultilevel"/>
     <w:tmpl w:val="E57C83C8"/>
@@ -14682,7 +14951,7 @@
       </w:pPr>
     </w:lvl>
   </w:abstractNum>
-  <w:abstractNum w:abstractNumId="33" w15:restartNumberingAfterBreak="0">
+  <w:abstractNum w:abstractNumId="34" w15:restartNumberingAfterBreak="0">
     <w:nsid w:val="6BC54134"/>
     <w:multiLevelType w:val="hybridMultilevel"/>
     <w:tmpl w:val="02663DF8"/>
@@ -14768,7 +15037,7 @@
       </w:pPr>
     </w:lvl>
   </w:abstractNum>
-  <w:abstractNum w:abstractNumId="34" w15:restartNumberingAfterBreak="0">
+  <w:abstractNum w:abstractNumId="35" w15:restartNumberingAfterBreak="0">
     <w:nsid w:val="70F96219"/>
     <w:multiLevelType w:val="hybridMultilevel"/>
     <w:tmpl w:val="94A403D6"/>
@@ -14854,7 +15123,7 @@
       </w:pPr>
     </w:lvl>
   </w:abstractNum>
-  <w:abstractNum w:abstractNumId="35" w15:restartNumberingAfterBreak="0">
+  <w:abstractNum w:abstractNumId="36" w15:restartNumberingAfterBreak="0">
     <w:nsid w:val="73CD4973"/>
     <w:multiLevelType w:val="hybridMultilevel"/>
     <w:tmpl w:val="F906F97E"/>
@@ -14944,7 +15213,7 @@
       </w:pPr>
     </w:lvl>
   </w:abstractNum>
-  <w:abstractNum w:abstractNumId="36" w15:restartNumberingAfterBreak="0">
+  <w:abstractNum w:abstractNumId="37" w15:restartNumberingAfterBreak="0">
     <w:nsid w:val="7DFB60AC"/>
     <w:multiLevelType w:val="hybridMultilevel"/>
     <w:tmpl w:val="21D6667A"/>
@@ -15034,37 +15303,37 @@
     </w:lvl>
   </w:abstractNum>
   <w:num w:numId="1" w16cid:durableId="145170614">
-    <w:abstractNumId w:val="32"/>
+    <w:abstractNumId w:val="33"/>
   </w:num>
   <w:num w:numId="2" w16cid:durableId="1738160496">
-    <w:abstractNumId w:val="16"/>
+    <w:abstractNumId w:val="17"/>
   </w:num>
   <w:num w:numId="3" w16cid:durableId="549269067">
-    <w:abstractNumId w:val="12"/>
+    <w:abstractNumId w:val="13"/>
   </w:num>
   <w:num w:numId="4" w16cid:durableId="1588536362">
-    <w:abstractNumId w:val="34"/>
+    <w:abstractNumId w:val="35"/>
   </w:num>
   <w:num w:numId="5" w16cid:durableId="1281954383">
-    <w:abstractNumId w:val="11"/>
+    <w:abstractNumId w:val="12"/>
   </w:num>
   <w:num w:numId="6" w16cid:durableId="745687786">
     <w:abstractNumId w:val="6"/>
   </w:num>
   <w:num w:numId="7" w16cid:durableId="534394980">
-    <w:abstractNumId w:val="33"/>
+    <w:abstractNumId w:val="34"/>
   </w:num>
   <w:num w:numId="8" w16cid:durableId="1242329650">
     <w:abstractNumId w:val="9"/>
   </w:num>
   <w:num w:numId="9" w16cid:durableId="997997268">
-    <w:abstractNumId w:val="27"/>
+    <w:abstractNumId w:val="28"/>
   </w:num>
   <w:num w:numId="10" w16cid:durableId="391393722">
-    <w:abstractNumId w:val="18"/>
+    <w:abstractNumId w:val="19"/>
   </w:num>
   <w:num w:numId="11" w16cid:durableId="1671450287">
-    <w:abstractNumId w:val="10"/>
+    <w:abstractNumId w:val="11"/>
   </w:num>
   <w:num w:numId="12" w16cid:durableId="2102291362">
     <w:abstractNumId w:val="0"/>
@@ -15073,46 +15342,46 @@
     <w:abstractNumId w:val="5"/>
   </w:num>
   <w:num w:numId="14" w16cid:durableId="910699866">
-    <w:abstractNumId w:val="14"/>
+    <w:abstractNumId w:val="15"/>
   </w:num>
   <w:num w:numId="15" w16cid:durableId="1913393189">
-    <w:abstractNumId w:val="19"/>
+    <w:abstractNumId w:val="20"/>
   </w:num>
   <w:num w:numId="16" w16cid:durableId="2084913600">
-    <w:abstractNumId w:val="29"/>
+    <w:abstractNumId w:val="30"/>
   </w:num>
   <w:num w:numId="17" w16cid:durableId="1315140013">
-    <w:abstractNumId w:val="21"/>
+    <w:abstractNumId w:val="22"/>
   </w:num>
   <w:num w:numId="18" w16cid:durableId="676538705">
-    <w:abstractNumId w:val="30"/>
+    <w:abstractNumId w:val="31"/>
   </w:num>
   <w:num w:numId="19" w16cid:durableId="1177886027">
-    <w:abstractNumId w:val="23"/>
+    <w:abstractNumId w:val="24"/>
   </w:num>
   <w:num w:numId="20" w16cid:durableId="1248922024">
-    <w:abstractNumId w:val="15"/>
+    <w:abstractNumId w:val="16"/>
   </w:num>
   <w:num w:numId="21" w16cid:durableId="546844428">
-    <w:abstractNumId w:val="36"/>
+    <w:abstractNumId w:val="37"/>
   </w:num>
   <w:num w:numId="22" w16cid:durableId="2086292481">
-    <w:abstractNumId w:val="26"/>
+    <w:abstractNumId w:val="27"/>
   </w:num>
   <w:num w:numId="23" w16cid:durableId="389888593">
-    <w:abstractNumId w:val="31"/>
+    <w:abstractNumId w:val="32"/>
   </w:num>
   <w:num w:numId="24" w16cid:durableId="1607342676">
-    <w:abstractNumId w:val="17"/>
+    <w:abstractNumId w:val="18"/>
   </w:num>
   <w:num w:numId="25" w16cid:durableId="515534370">
-    <w:abstractNumId w:val="13"/>
+    <w:abstractNumId w:val="14"/>
   </w:num>
   <w:num w:numId="26" w16cid:durableId="1255432161">
     <w:abstractNumId w:val="8"/>
   </w:num>
   <w:num w:numId="27" w16cid:durableId="824201860">
-    <w:abstractNumId w:val="24"/>
+    <w:abstractNumId w:val="25"/>
   </w:num>
   <w:num w:numId="28" w16cid:durableId="1366129535">
     <w:abstractNumId w:val="4"/>
@@ -15121,19 +15390,19 @@
     <w:abstractNumId w:val="7"/>
   </w:num>
   <w:num w:numId="30" w16cid:durableId="1925333359">
-    <w:abstractNumId w:val="25"/>
+    <w:abstractNumId w:val="26"/>
   </w:num>
   <w:num w:numId="31" w16cid:durableId="915479013">
-    <w:abstractNumId w:val="35"/>
+    <w:abstractNumId w:val="36"/>
   </w:num>
   <w:num w:numId="32" w16cid:durableId="764304064">
-    <w:abstractNumId w:val="22"/>
+    <w:abstractNumId w:val="23"/>
   </w:num>
   <w:num w:numId="33" w16cid:durableId="1792167772">
-    <w:abstractNumId w:val="28"/>
+    <w:abstractNumId w:val="29"/>
   </w:num>
   <w:num w:numId="34" w16cid:durableId="1648439787">
-    <w:abstractNumId w:val="20"/>
+    <w:abstractNumId w:val="21"/>
   </w:num>
   <w:num w:numId="35" w16cid:durableId="486015547">
     <w:abstractNumId w:val="2"/>
@@ -15149,6 +15418,9 @@
     <w:lvlOverride w:ilvl="0">
       <w:startOverride w:val="1"/>
     </w:lvlOverride>
+  </w:num>
+  <w:num w:numId="39" w16cid:durableId="155194632">
+    <w:abstractNumId w:val="10"/>
   </w:num>
   <w:numIdMacAtCleanup w:val="12"/>
 </w:numbering>

</xml_diff>

<commit_message>
Assembly and shipping info
</commit_message>
<xml_diff>
--- a/BoardTesting/FireFly_installation_for_TF.docx
+++ b/BoardTesting/FireFly_installation_for_TF.docx
@@ -173,13 +173,37 @@
         <w:t>switch SW</w:t>
       </w:r>
       <w:r>
-        <w:t>6</w:t>
+        <w:t>7</w:t>
       </w:r>
       <w:r>
         <w:t xml:space="preserve"> to the “3.8V” position. This </w:t>
       </w:r>
       <w:r>
-        <w:t>set the transmitter voltage for the FireFly in site “U39”. (FPGA #2 quads 125/126/127)</w:t>
+        <w:t>set the transmitter voltage for the FireFly in site “U</w:t>
+      </w:r>
+      <w:r>
+        <w:t>41</w:t>
+      </w:r>
+      <w:r>
+        <w:t>”. (FPGA #2 quads 12</w:t>
+      </w:r>
+      <w:r>
+        <w:t>8</w:t>
+      </w:r>
+      <w:r>
+        <w:t>/12</w:t>
+      </w:r>
+      <w:r>
+        <w:t>9</w:t>
+      </w:r>
+      <w:r>
+        <w:t>/1</w:t>
+      </w:r>
+      <w:r>
+        <w:t>30</w:t>
+      </w:r>
+      <w:r>
+        <w:t>)</w:t>
       </w:r>
     </w:p>
     <w:p>
@@ -199,16 +223,16 @@
         <mc:AlternateContent>
           <mc:Choice Requires="wps">
             <w:drawing>
-              <wp:anchor distT="0" distB="0" distL="114300" distR="114300" simplePos="0" relativeHeight="251912192" behindDoc="0" locked="0" layoutInCell="1" allowOverlap="1" wp14:anchorId="31623760" wp14:editId="354E77C2">
+              <wp:anchor distT="0" distB="0" distL="114300" distR="114300" simplePos="0" relativeHeight="251912192" behindDoc="0" locked="0" layoutInCell="1" allowOverlap="1" wp14:anchorId="31623760" wp14:editId="0FE0497A">
                 <wp:simplePos x="0" y="0"/>
                 <wp:positionH relativeFrom="margin">
-                  <wp:posOffset>2457449</wp:posOffset>
+                  <wp:posOffset>1571625</wp:posOffset>
                 </wp:positionH>
                 <wp:positionV relativeFrom="paragraph">
-                  <wp:posOffset>498475</wp:posOffset>
+                  <wp:posOffset>499109</wp:posOffset>
                 </wp:positionV>
-                <wp:extent cx="1228725" cy="1838325"/>
-                <wp:effectExtent l="38100" t="38100" r="28575" b="28575"/>
+                <wp:extent cx="2114550" cy="1847850"/>
+                <wp:effectExtent l="38100" t="38100" r="19050" b="19050"/>
                 <wp:wrapNone/>
                 <wp:docPr id="1733874460" name="Straight Arrow Connector 1733874460"/>
                 <wp:cNvGraphicFramePr/>
@@ -219,7 +243,7 @@
                       <wps:spPr>
                         <a:xfrm flipH="1" flipV="1">
                           <a:off x="0" y="0"/>
-                          <a:ext cx="1228725" cy="1838325"/>
+                          <a:ext cx="2114550" cy="1847850"/>
                         </a:xfrm>
                         <a:prstGeom prst="straightConnector1">
                           <a:avLst/>
@@ -260,11 +284,11 @@
           </mc:Choice>
           <mc:Fallback>
             <w:pict>
-              <v:shapetype w14:anchorId="71D5C5FC" id="_x0000_t32" coordsize="21600,21600" o:spt="32" o:oned="t" path="m,l21600,21600e" filled="f">
+              <v:shapetype w14:anchorId="1A8E4E5A" id="_x0000_t32" coordsize="21600,21600" o:spt="32" o:oned="t" path="m,l21600,21600e" filled="f">
                 <v:path arrowok="t" fillok="f" o:connecttype="none"/>
                 <o:lock v:ext="edit" shapetype="t"/>
               </v:shapetype>
-              <v:shape id="Straight Arrow Connector 1733874460" o:spid="_x0000_s1026" type="#_x0000_t32" style="position:absolute;margin-left:193.5pt;margin-top:39.25pt;width:96.75pt;height:144.75pt;flip:x y;z-index:251912192;visibility:visible;mso-wrap-style:square;mso-width-percent:0;mso-height-percent:0;mso-wrap-distance-left:9pt;mso-wrap-distance-top:0;mso-wrap-distance-right:9pt;mso-wrap-distance-bottom:0;mso-position-horizontal:absolute;mso-position-horizontal-relative:margin;mso-position-vertical:absolute;mso-position-vertical-relative:text;mso-width-percent:0;mso-height-percent:0;mso-width-relative:margin;mso-height-relative:margin" o:gfxdata="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" strokecolor="red" strokeweight="2pt">
+              <v:shape id="Straight Arrow Connector 1733874460" o:spid="_x0000_s1026" type="#_x0000_t32" style="position:absolute;margin-left:123.75pt;margin-top:39.3pt;width:166.5pt;height:145.5pt;flip:x y;z-index:251912192;visibility:visible;mso-wrap-style:square;mso-width-percent:0;mso-height-percent:0;mso-wrap-distance-left:9pt;mso-wrap-distance-top:0;mso-wrap-distance-right:9pt;mso-wrap-distance-bottom:0;mso-position-horizontal:absolute;mso-position-horizontal-relative:margin;mso-position-vertical:absolute;mso-position-vertical-relative:text;mso-width-percent:0;mso-height-percent:0;mso-width-relative:margin;mso-height-relative:margin" o:gfxdata="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" strokecolor="red" strokeweight="2pt">
                 <v:stroke endarrow="open"/>
                 <w10:wrap anchorx="margin"/>
               </v:shape>
@@ -610,16 +634,16 @@
         <mc:AlternateContent>
           <mc:Choice Requires="wps">
             <w:drawing>
-              <wp:anchor distT="0" distB="0" distL="114300" distR="114300" simplePos="0" relativeHeight="251799552" behindDoc="0" locked="0" layoutInCell="1" allowOverlap="1" wp14:anchorId="7F2CFD9F" wp14:editId="3994EB5C">
+              <wp:anchor distT="0" distB="0" distL="114300" distR="114300" simplePos="0" relativeHeight="251799552" behindDoc="0" locked="0" layoutInCell="1" allowOverlap="1" wp14:anchorId="7F2CFD9F" wp14:editId="609CED24">
                 <wp:simplePos x="0" y="0"/>
                 <wp:positionH relativeFrom="margin">
-                  <wp:posOffset>1228725</wp:posOffset>
+                  <wp:posOffset>1133475</wp:posOffset>
                 </wp:positionH>
                 <wp:positionV relativeFrom="paragraph">
-                  <wp:posOffset>768350</wp:posOffset>
+                  <wp:posOffset>588645</wp:posOffset>
                 </wp:positionV>
-                <wp:extent cx="2438400" cy="809625"/>
-                <wp:effectExtent l="38100" t="57150" r="19050" b="28575"/>
+                <wp:extent cx="2533650" cy="990600"/>
+                <wp:effectExtent l="38100" t="57150" r="19050" b="19050"/>
                 <wp:wrapNone/>
                 <wp:docPr id="74" name="Straight Arrow Connector 74"/>
                 <wp:cNvGraphicFramePr/>
@@ -630,7 +654,7 @@
                       <wps:spPr>
                         <a:xfrm flipH="1" flipV="1">
                           <a:off x="0" y="0"/>
-                          <a:ext cx="2438400" cy="809625"/>
+                          <a:ext cx="2533650" cy="990600"/>
                         </a:xfrm>
                         <a:prstGeom prst="straightConnector1">
                           <a:avLst/>
@@ -671,7 +695,7 @@
           </mc:Choice>
           <mc:Fallback>
             <w:pict>
-              <v:shape w14:anchorId="3B481DC6" id="Straight Arrow Connector 74" o:spid="_x0000_s1026" type="#_x0000_t32" style="position:absolute;margin-left:96.75pt;margin-top:60.5pt;width:192pt;height:63.75pt;flip:x y;z-index:251799552;visibility:visible;mso-wrap-style:square;mso-width-percent:0;mso-height-percent:0;mso-wrap-distance-left:9pt;mso-wrap-distance-top:0;mso-wrap-distance-right:9pt;mso-wrap-distance-bottom:0;mso-position-horizontal:absolute;mso-position-horizontal-relative:margin;mso-position-vertical:absolute;mso-position-vertical-relative:text;mso-width-percent:0;mso-height-percent:0;mso-width-relative:margin;mso-height-relative:margin" o:gfxdata="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" strokecolor="red" strokeweight="2pt">
+              <v:shape w14:anchorId="53890A5F" id="Straight Arrow Connector 74" o:spid="_x0000_s1026" type="#_x0000_t32" style="position:absolute;margin-left:89.25pt;margin-top:46.35pt;width:199.5pt;height:78pt;flip:x y;z-index:251799552;visibility:visible;mso-wrap-style:square;mso-width-percent:0;mso-height-percent:0;mso-wrap-distance-left:9pt;mso-wrap-distance-top:0;mso-wrap-distance-right:9pt;mso-wrap-distance-bottom:0;mso-position-horizontal:absolute;mso-position-horizontal-relative:margin;mso-position-vertical:absolute;mso-position-vertical-relative:text;mso-width-percent:0;mso-height-percent:0;mso-width-relative:margin;mso-height-relative:margin" o:gfxdata="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" strokecolor="red" strokeweight="2pt">
                 <v:stroke endarrow="open"/>
                 <w10:wrap anchorx="margin"/>
               </v:shape>
@@ -749,7 +773,21 @@
                                 <w:sz w:val="28"/>
                                 <w:szCs w:val="28"/>
                               </w:rPr>
-                              <w:t xml:space="preserve">SW6 </w:t>
+                              <w:t>SW</w:t>
+                            </w:r>
+                            <w:r>
+                              <w:rPr>
+                                <w:sz w:val="28"/>
+                                <w:szCs w:val="28"/>
+                              </w:rPr>
+                              <w:t>7</w:t>
+                            </w:r>
+                            <w:r>
+                              <w:rPr>
+                                <w:sz w:val="28"/>
+                                <w:szCs w:val="28"/>
+                              </w:rPr>
+                              <w:t xml:space="preserve"> </w:t>
                             </w:r>
                             <w:r>
                               <w:rPr>
@@ -839,7 +877,21 @@
                           <w:sz w:val="28"/>
                           <w:szCs w:val="28"/>
                         </w:rPr>
-                        <w:t xml:space="preserve">SW6 </w:t>
+                        <w:t>SW</w:t>
+                      </w:r>
+                      <w:r>
+                        <w:rPr>
+                          <w:sz w:val="28"/>
+                          <w:szCs w:val="28"/>
+                        </w:rPr>
+                        <w:t>7</w:t>
+                      </w:r>
+                      <w:r>
+                        <w:rPr>
+                          <w:sz w:val="28"/>
+                          <w:szCs w:val="28"/>
+                        </w:rPr>
+                        <w:t xml:space="preserve"> </w:t>
                       </w:r>
                       <w:r>
                         <w:rPr>
@@ -968,7 +1020,14 @@
                                 <w:sz w:val="28"/>
                                 <w:szCs w:val="28"/>
                               </w:rPr>
-                              <w:t>SW6</w:t>
+                              <w:t>SW</w:t>
+                            </w:r>
+                            <w:r>
+                              <w:rPr>
+                                <w:sz w:val="28"/>
+                                <w:szCs w:val="28"/>
+                              </w:rPr>
+                              <w:t>7</w:t>
                             </w:r>
                             <w:r>
                               <w:rPr>
@@ -1037,7 +1096,14 @@
                           <w:sz w:val="28"/>
                           <w:szCs w:val="28"/>
                         </w:rPr>
-                        <w:t>SW6</w:t>
+                        <w:t>SW</w:t>
+                      </w:r>
+                      <w:r>
+                        <w:rPr>
+                          <w:sz w:val="28"/>
+                          <w:szCs w:val="28"/>
+                        </w:rPr>
+                        <w:t>7</w:t>
                       </w:r>
                       <w:r>
                         <w:rPr>
@@ -1066,10 +1132,10 @@
           <w:noProof/>
         </w:rPr>
         <w:drawing>
-          <wp:inline distT="0" distB="0" distL="0" distR="0" wp14:anchorId="043B94E8" wp14:editId="4CDE1172">
-            <wp:extent cx="3011722" cy="2257425"/>
-            <wp:effectExtent l="0" t="0" r="0" b="0"/>
-            <wp:docPr id="1302289517" name="Picture 84"/>
+          <wp:inline distT="0" distB="0" distL="0" distR="0" wp14:anchorId="4A4770A9" wp14:editId="576A0038">
+            <wp:extent cx="3286125" cy="1980782"/>
+            <wp:effectExtent l="0" t="0" r="0" b="635"/>
+            <wp:docPr id="1785974030" name="Picture 84"/>
             <wp:cNvGraphicFramePr>
               <a:graphicFrameLocks xmlns:a="http://schemas.openxmlformats.org/drawingml/2006/main" noChangeAspect="1"/>
             </wp:cNvGraphicFramePr>
@@ -1077,7 +1143,7 @@
               <a:graphicData uri="http://schemas.openxmlformats.org/drawingml/2006/picture">
                 <pic:pic xmlns:pic="http://schemas.openxmlformats.org/drawingml/2006/picture">
                   <pic:nvPicPr>
-                    <pic:cNvPr id="1302289517" name="Picture 1302289517"/>
+                    <pic:cNvPr id="1785974030" name="Picture 1785974030"/>
                     <pic:cNvPicPr/>
                   </pic:nvPicPr>
                   <pic:blipFill>
@@ -1095,7 +1161,7 @@
                   <pic:spPr>
                     <a:xfrm>
                       <a:off x="0" y="0"/>
-                      <a:ext cx="3024471" cy="2266981"/>
+                      <a:ext cx="3293678" cy="1985334"/>
                     </a:xfrm>
                     <a:prstGeom prst="rect">
                       <a:avLst/>
@@ -1654,21 +1720,7 @@
                                 <w:sz w:val="28"/>
                                 <w:szCs w:val="28"/>
                               </w:rPr>
-                              <w:t xml:space="preserve">Missing </w:t>
-                            </w:r>
-                            <w:r>
-                              <w:rPr>
-                                <w:sz w:val="28"/>
-                                <w:szCs w:val="28"/>
-                              </w:rPr>
-                              <w:t>FireFly heatsink</w:t>
-                            </w:r>
-                            <w:r>
-                              <w:rPr>
-                                <w:sz w:val="28"/>
-                                <w:szCs w:val="28"/>
-                              </w:rPr>
-                              <w:t xml:space="preserve"> standoffs</w:t>
+                              <w:t>Missing FireFly heatsink standoffs</w:t>
                             </w:r>
                           </w:p>
                           <w:p>
@@ -1725,21 +1777,7 @@
                           <w:sz w:val="28"/>
                           <w:szCs w:val="28"/>
                         </w:rPr>
-                        <w:t xml:space="preserve">Missing </w:t>
-                      </w:r>
-                      <w:r>
-                        <w:rPr>
-                          <w:sz w:val="28"/>
-                          <w:szCs w:val="28"/>
-                        </w:rPr>
-                        <w:t>FireFly heatsink</w:t>
-                      </w:r>
-                      <w:r>
-                        <w:rPr>
-                          <w:sz w:val="28"/>
-                          <w:szCs w:val="28"/>
-                        </w:rPr>
-                        <w:t xml:space="preserve"> standoffs</w:t>
+                        <w:t>Missing FireFly heatsink standoffs</w:t>
                       </w:r>
                     </w:p>
                     <w:p>
@@ -2203,42 +2241,36 @@
         <w:rPr>
           <w:color w:val="000000" w:themeColor="text1"/>
         </w:rPr>
+        <w:t xml:space="preserve"> From the bottom side of the board, insert a Phillips-head M2.5 x </w:t>
+      </w:r>
+      <w:r>
+        <w:rPr>
+          <w:color w:val="000000" w:themeColor="text1"/>
+        </w:rPr>
+        <w:t>6</w:t>
+      </w:r>
+      <w:r>
+        <w:rPr>
+          <w:color w:val="000000" w:themeColor="text1"/>
+        </w:rPr>
+        <w:t xml:space="preserve"> screw and an M2.5 lock-washer through one of the mounting holes H</w:t>
+      </w:r>
+      <w:r>
+        <w:rPr>
+          <w:color w:val="000000" w:themeColor="text1"/>
+        </w:rPr>
+        <w:t>4</w:t>
+      </w:r>
+      <w:r>
+        <w:rPr>
+          <w:color w:val="000000" w:themeColor="text1"/>
+        </w:rPr>
         <w:t xml:space="preserve"> </w:t>
       </w:r>
       <w:r>
         <w:rPr>
           <w:color w:val="000000" w:themeColor="text1"/>
         </w:rPr>
-        <w:t xml:space="preserve">From the bottom side of the board, insert a Phillips-head M2.5 x </w:t>
-      </w:r>
-      <w:r>
-        <w:rPr>
-          <w:color w:val="000000" w:themeColor="text1"/>
-        </w:rPr>
-        <w:t>6</w:t>
-      </w:r>
-      <w:r>
-        <w:rPr>
-          <w:color w:val="000000" w:themeColor="text1"/>
-        </w:rPr>
-        <w:t xml:space="preserve"> screw and an M2.5 lock-washer through one of the mounting holes H</w:t>
-      </w:r>
-      <w:r>
-        <w:rPr>
-          <w:color w:val="000000" w:themeColor="text1"/>
-        </w:rPr>
-        <w:t>4</w:t>
-      </w:r>
-      <w:r>
-        <w:rPr>
-          <w:color w:val="000000" w:themeColor="text1"/>
-        </w:rPr>
-        <w:t xml:space="preserve"> </w:t>
-      </w:r>
-      <w:r>
-        <w:rPr>
-          <w:color w:val="000000" w:themeColor="text1"/>
-        </w:rPr>
         <w:t xml:space="preserve">or </w:t>
       </w:r>
       <w:r>
@@ -2251,19 +2283,7 @@
         <w:rPr>
           <w:color w:val="000000" w:themeColor="text1"/>
         </w:rPr>
-        <w:t>5</w:t>
-      </w:r>
-      <w:r>
-        <w:rPr>
-          <w:color w:val="000000" w:themeColor="text1"/>
-        </w:rPr>
-        <w:t>.</w:t>
-      </w:r>
-      <w:r>
-        <w:rPr>
-          <w:color w:val="000000" w:themeColor="text1"/>
-        </w:rPr>
-        <w:t xml:space="preserve"> (NOTE: The M2.5 x 8 screws are too long for these standoffs)</w:t>
+        <w:t>5. (NOTE: The M2.5 x 8 screws are too long for these standoffs)</w:t>
       </w:r>
       <w:r>
         <w:rPr>
@@ -2838,7 +2858,7 @@
         <w:t xml:space="preserve"> </w:t>
       </w:r>
       <w:r>
-        <w:t>45</w:t>
+        <w:t>30</w:t>
       </w:r>
       <w:r>
         <w:t>-</w:t>
@@ -2922,15 +2942,14 @@
         <w:rPr>
           <w:color w:val="000000" w:themeColor="text1"/>
         </w:rPr>
-        <w:t xml:space="preserve"> from the front side. </w:t>
-      </w:r>
-      <w:r>
-        <w:rPr>
-          <w:color w:val="000000" w:themeColor="text1"/>
-        </w:rPr>
-        <w:t xml:space="preserve">Finger </w:t>
-      </w:r>
-      <w:proofErr w:type="gramStart"/>
+        <w:t xml:space="preserve"> from the front side</w:t>
+      </w:r>
+      <w:r>
+        <w:rPr>
+          <w:color w:val="000000" w:themeColor="text1"/>
+        </w:rPr>
+        <w:t xml:space="preserve"> and </w:t>
+      </w:r>
       <w:r>
         <w:rPr>
           <w:color w:val="000000" w:themeColor="text1"/>
@@ -2943,12 +2962,11 @@
         </w:rPr>
         <w:t>ighten</w:t>
       </w:r>
-      <w:proofErr w:type="gramEnd"/>
-      <w:r>
-        <w:rPr>
-          <w:color w:val="000000" w:themeColor="text1"/>
-        </w:rPr>
-        <w:t xml:space="preserve"> so as to not strip the plastic threads.</w:t>
+      <w:r>
+        <w:rPr>
+          <w:color w:val="000000" w:themeColor="text1"/>
+        </w:rPr>
+        <w:t>.</w:t>
       </w:r>
     </w:p>
     <w:p>
@@ -3578,7 +3596,15 @@
                                 <w:sz w:val="28"/>
                                 <w:szCs w:val="28"/>
                               </w:rPr>
-                              <w:t>45-mm standoffs</w:t>
+                              <w:t>30</w:t>
+                            </w:r>
+                            <w:r>
+                              <w:rPr>
+                                <w:color w:val="002060"/>
+                                <w:sz w:val="28"/>
+                                <w:szCs w:val="28"/>
+                              </w:rPr>
+                              <w:t>-mm standoffs</w:t>
                             </w:r>
                           </w:p>
                         </w:txbxContent>
@@ -3621,7 +3647,15 @@
                           <w:sz w:val="28"/>
                           <w:szCs w:val="28"/>
                         </w:rPr>
-                        <w:t>45-mm standoffs</w:t>
+                        <w:t>30</w:t>
+                      </w:r>
+                      <w:r>
+                        <w:rPr>
+                          <w:color w:val="002060"/>
+                          <w:sz w:val="28"/>
+                          <w:szCs w:val="28"/>
+                        </w:rPr>
+                        <w:t>-mm standoffs</w:t>
                       </w:r>
                     </w:p>
                   </w:txbxContent>
@@ -4066,67 +4100,7 @@
         <w:rPr>
           <w:color w:val="000000" w:themeColor="text1"/>
         </w:rPr>
-        <w:t>F1-FF</w:t>
-      </w:r>
-      <w:r>
-        <w:rPr>
-          <w:color w:val="000000" w:themeColor="text1"/>
-        </w:rPr>
-        <w:t>2</w:t>
-      </w:r>
-      <w:r>
-        <w:rPr>
-          <w:color w:val="000000" w:themeColor="text1"/>
-        </w:rPr>
-        <w:t>-RECV (U</w:t>
-      </w:r>
-      <w:r>
-        <w:rPr>
-          <w:color w:val="000000" w:themeColor="text1"/>
-        </w:rPr>
-        <w:t>30</w:t>
-      </w:r>
-      <w:r>
-        <w:rPr>
-          <w:color w:val="000000" w:themeColor="text1"/>
-        </w:rPr>
-        <w:t>) Quads 12</w:t>
-      </w:r>
-      <w:r>
-        <w:rPr>
-          <w:color w:val="000000" w:themeColor="text1"/>
-        </w:rPr>
-        <w:t>5</w:t>
-      </w:r>
-      <w:r>
-        <w:rPr>
-          <w:color w:val="000000" w:themeColor="text1"/>
-        </w:rPr>
-        <w:t>/12</w:t>
-      </w:r>
-      <w:r>
-        <w:rPr>
-          <w:color w:val="000000" w:themeColor="text1"/>
-        </w:rPr>
-        <w:t>6</w:t>
-      </w:r>
-      <w:r>
-        <w:rPr>
-          <w:color w:val="000000" w:themeColor="text1"/>
-        </w:rPr>
-        <w:t>/12</w:t>
-      </w:r>
-      <w:r>
-        <w:rPr>
-          <w:color w:val="000000" w:themeColor="text1"/>
-        </w:rPr>
-        <w:t>7</w:t>
-      </w:r>
-      <w:r>
-        <w:rPr>
-          <w:color w:val="000000" w:themeColor="text1"/>
-        </w:rPr>
-        <w:t>: 25Gx12 Receiver</w:t>
+        <w:t>F1-FF2-RECV (U30) Quads 125/126/127: 25Gx12 Receiver</w:t>
       </w:r>
     </w:p>
     <w:p>
@@ -4144,67 +4118,7 @@
         <w:rPr>
           <w:color w:val="000000" w:themeColor="text1"/>
         </w:rPr>
-        <w:t>F1-FF</w:t>
-      </w:r>
-      <w:r>
-        <w:rPr>
-          <w:color w:val="000000" w:themeColor="text1"/>
-        </w:rPr>
-        <w:t>3</w:t>
-      </w:r>
-      <w:r>
-        <w:rPr>
-          <w:color w:val="000000" w:themeColor="text1"/>
-        </w:rPr>
-        <w:t>-RECV (U</w:t>
-      </w:r>
-      <w:r>
-        <w:rPr>
-          <w:color w:val="000000" w:themeColor="text1"/>
-        </w:rPr>
-        <w:t>32</w:t>
-      </w:r>
-      <w:r>
-        <w:rPr>
-          <w:color w:val="000000" w:themeColor="text1"/>
-        </w:rPr>
-        <w:t>) Quads 12</w:t>
-      </w:r>
-      <w:r>
-        <w:rPr>
-          <w:color w:val="000000" w:themeColor="text1"/>
-        </w:rPr>
-        <w:t>8</w:t>
-      </w:r>
-      <w:r>
-        <w:rPr>
-          <w:color w:val="000000" w:themeColor="text1"/>
-        </w:rPr>
-        <w:t>/12</w:t>
-      </w:r>
-      <w:r>
-        <w:rPr>
-          <w:color w:val="000000" w:themeColor="text1"/>
-        </w:rPr>
-        <w:t>9</w:t>
-      </w:r>
-      <w:r>
-        <w:rPr>
-          <w:color w:val="000000" w:themeColor="text1"/>
-        </w:rPr>
-        <w:t>/1</w:t>
-      </w:r>
-      <w:r>
-        <w:rPr>
-          <w:color w:val="000000" w:themeColor="text1"/>
-        </w:rPr>
-        <w:t>30</w:t>
-      </w:r>
-      <w:r>
-        <w:rPr>
-          <w:color w:val="000000" w:themeColor="text1"/>
-        </w:rPr>
-        <w:t>: 25Gx12 Receiver</w:t>
+        <w:t>F1-FF3-RECV (U32) Quads 128/129/130: 25Gx12 Receiver</w:t>
       </w:r>
     </w:p>
     <w:p>
@@ -4222,67 +4136,7 @@
         <w:rPr>
           <w:color w:val="000000" w:themeColor="text1"/>
         </w:rPr>
-        <w:t>F1-FF</w:t>
-      </w:r>
-      <w:r>
-        <w:rPr>
-          <w:color w:val="000000" w:themeColor="text1"/>
-        </w:rPr>
-        <w:t>4</w:t>
-      </w:r>
-      <w:r>
-        <w:rPr>
-          <w:color w:val="000000" w:themeColor="text1"/>
-        </w:rPr>
-        <w:t>-RECV (U</w:t>
-      </w:r>
-      <w:r>
-        <w:rPr>
-          <w:color w:val="000000" w:themeColor="text1"/>
-        </w:rPr>
-        <w:t>35</w:t>
-      </w:r>
-      <w:r>
-        <w:rPr>
-          <w:color w:val="000000" w:themeColor="text1"/>
-        </w:rPr>
-        <w:t>) Quads 1</w:t>
-      </w:r>
-      <w:r>
-        <w:rPr>
-          <w:color w:val="000000" w:themeColor="text1"/>
-        </w:rPr>
-        <w:t>32</w:t>
-      </w:r>
-      <w:r>
-        <w:rPr>
-          <w:color w:val="000000" w:themeColor="text1"/>
-        </w:rPr>
-        <w:t>/1</w:t>
-      </w:r>
-      <w:r>
-        <w:rPr>
-          <w:color w:val="000000" w:themeColor="text1"/>
-        </w:rPr>
-        <w:t>33</w:t>
-      </w:r>
-      <w:r>
-        <w:rPr>
-          <w:color w:val="000000" w:themeColor="text1"/>
-        </w:rPr>
-        <w:t>/1</w:t>
-      </w:r>
-      <w:r>
-        <w:rPr>
-          <w:color w:val="000000" w:themeColor="text1"/>
-        </w:rPr>
-        <w:t>34</w:t>
-      </w:r>
-      <w:r>
-        <w:rPr>
-          <w:color w:val="000000" w:themeColor="text1"/>
-        </w:rPr>
-        <w:t>: 25Gx12 Receiver</w:t>
+        <w:t>F1-FF4-RECV (U35) Quads 132/133/134: 25Gx12 Receiver</w:t>
       </w:r>
     </w:p>
     <w:p>
@@ -4300,7 +4154,67 @@
         <w:rPr>
           <w:color w:val="000000" w:themeColor="text1"/>
         </w:rPr>
-        <w:t>F2-FF5-XCVR (U38) Quad 124: 25Gx4 Transceiver</w:t>
+        <w:t>F2-FF</w:t>
+      </w:r>
+      <w:r>
+        <w:rPr>
+          <w:color w:val="000000" w:themeColor="text1"/>
+        </w:rPr>
+        <w:t>3</w:t>
+      </w:r>
+      <w:r>
+        <w:rPr>
+          <w:color w:val="000000" w:themeColor="text1"/>
+        </w:rPr>
+        <w:t>-XMIT (U</w:t>
+      </w:r>
+      <w:r>
+        <w:rPr>
+          <w:color w:val="000000" w:themeColor="text1"/>
+        </w:rPr>
+        <w:t>41</w:t>
+      </w:r>
+      <w:r>
+        <w:rPr>
+          <w:color w:val="000000" w:themeColor="text1"/>
+        </w:rPr>
+        <w:t>) Quads 12</w:t>
+      </w:r>
+      <w:r>
+        <w:rPr>
+          <w:color w:val="000000" w:themeColor="text1"/>
+        </w:rPr>
+        <w:t>8</w:t>
+      </w:r>
+      <w:r>
+        <w:rPr>
+          <w:color w:val="000000" w:themeColor="text1"/>
+        </w:rPr>
+        <w:t>/12</w:t>
+      </w:r>
+      <w:r>
+        <w:rPr>
+          <w:color w:val="000000" w:themeColor="text1"/>
+        </w:rPr>
+        <w:t>9</w:t>
+      </w:r>
+      <w:r>
+        <w:rPr>
+          <w:color w:val="000000" w:themeColor="text1"/>
+        </w:rPr>
+        <w:t>/1</w:t>
+      </w:r>
+      <w:r>
+        <w:rPr>
+          <w:color w:val="000000" w:themeColor="text1"/>
+        </w:rPr>
+        <w:t>30</w:t>
+      </w:r>
+      <w:r>
+        <w:rPr>
+          <w:color w:val="000000" w:themeColor="text1"/>
+        </w:rPr>
+        <w:t>: 25Gx12 Transmitter</w:t>
       </w:r>
     </w:p>
     <w:p>
@@ -4318,7 +4232,31 @@
         <w:rPr>
           <w:color w:val="000000" w:themeColor="text1"/>
         </w:rPr>
-        <w:t>F2-FF2-XMIT (U39) Quads 125/126/127: 25Gx12 Transmitter</w:t>
+        <w:t>F2-FF5-XCVR (U</w:t>
+      </w:r>
+      <w:r>
+        <w:rPr>
+          <w:color w:val="000000" w:themeColor="text1"/>
+        </w:rPr>
+        <w:t>43</w:t>
+      </w:r>
+      <w:r>
+        <w:rPr>
+          <w:color w:val="000000" w:themeColor="text1"/>
+        </w:rPr>
+        <w:t>) Quad 1</w:t>
+      </w:r>
+      <w:r>
+        <w:rPr>
+          <w:color w:val="000000" w:themeColor="text1"/>
+        </w:rPr>
+        <w:t>31</w:t>
+      </w:r>
+      <w:r>
+        <w:rPr>
+          <w:color w:val="000000" w:themeColor="text1"/>
+        </w:rPr>
+        <w:t>: 25Gx4 Transceiver</w:t>
       </w:r>
     </w:p>
     <w:p>
@@ -4335,18 +4273,18 @@
         <mc:AlternateContent>
           <mc:Choice Requires="wps">
             <w:drawing>
-              <wp:anchor distT="0" distB="0" distL="114300" distR="114300" simplePos="0" relativeHeight="251970560" behindDoc="0" locked="0" layoutInCell="1" allowOverlap="1" wp14:anchorId="03F06ACF" wp14:editId="79C647FA">
+              <wp:anchor distT="0" distB="0" distL="114300" distR="114300" simplePos="0" relativeHeight="251962368" behindDoc="0" locked="0" layoutInCell="1" allowOverlap="1" wp14:anchorId="5D0007C4" wp14:editId="3902F402">
                 <wp:simplePos x="0" y="0"/>
                 <wp:positionH relativeFrom="margin">
-                  <wp:posOffset>1304925</wp:posOffset>
+                  <wp:posOffset>3267075</wp:posOffset>
                 </wp:positionH>
                 <wp:positionV relativeFrom="paragraph">
-                  <wp:posOffset>661670</wp:posOffset>
+                  <wp:posOffset>541655</wp:posOffset>
                 </wp:positionV>
-                <wp:extent cx="1695450" cy="1866900"/>
-                <wp:effectExtent l="0" t="38100" r="57150" b="19050"/>
+                <wp:extent cx="1819275" cy="1533525"/>
+                <wp:effectExtent l="0" t="38100" r="47625" b="28575"/>
                 <wp:wrapNone/>
-                <wp:docPr id="1669972961" name="Straight Arrow Connector 1669972961"/>
+                <wp:docPr id="819257572" name="Straight Arrow Connector 819257572"/>
                 <wp:cNvGraphicFramePr/>
                 <a:graphic xmlns:a="http://schemas.openxmlformats.org/drawingml/2006/main">
                   <a:graphicData uri="http://schemas.microsoft.com/office/word/2010/wordprocessingShape">
@@ -4355,7 +4293,7 @@
                       <wps:spPr>
                         <a:xfrm flipV="1">
                           <a:off x="0" y="0"/>
-                          <a:ext cx="1695450" cy="1866900"/>
+                          <a:ext cx="1819275" cy="1533525"/>
                         </a:xfrm>
                         <a:prstGeom prst="straightConnector1">
                           <a:avLst/>
@@ -4396,7 +4334,7 @@
           </mc:Choice>
           <mc:Fallback>
             <w:pict>
-              <v:shape w14:anchorId="75287141" id="Straight Arrow Connector 1669972961" o:spid="_x0000_s1026" type="#_x0000_t32" style="position:absolute;margin-left:102.75pt;margin-top:52.1pt;width:133.5pt;height:147pt;flip:y;z-index:251970560;visibility:visible;mso-wrap-style:square;mso-width-percent:0;mso-height-percent:0;mso-wrap-distance-left:9pt;mso-wrap-distance-top:0;mso-wrap-distance-right:9pt;mso-wrap-distance-bottom:0;mso-position-horizontal:absolute;mso-position-horizontal-relative:margin;mso-position-vertical:absolute;mso-position-vertical-relative:text;mso-width-percent:0;mso-height-percent:0;mso-width-relative:margin;mso-height-relative:margin" o:gfxdata="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" strokecolor="red" strokeweight="2pt">
+              <v:shape w14:anchorId="39CADD25" id="Straight Arrow Connector 819257572" o:spid="_x0000_s1026" type="#_x0000_t32" style="position:absolute;margin-left:257.25pt;margin-top:42.65pt;width:143.25pt;height:120.75pt;flip:y;z-index:251962368;visibility:visible;mso-wrap-style:square;mso-width-percent:0;mso-height-percent:0;mso-wrap-distance-left:9pt;mso-wrap-distance-top:0;mso-wrap-distance-right:9pt;mso-wrap-distance-bottom:0;mso-position-horizontal:absolute;mso-position-horizontal-relative:margin;mso-position-vertical:absolute;mso-position-vertical-relative:text;mso-width-percent:0;mso-height-percent:0;mso-width-relative:margin;mso-height-relative:margin" o:gfxdata="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" strokecolor="red" strokeweight="2pt">
                 <v:stroke endarrow="open"/>
                 <w10:wrap anchorx="margin"/>
               </v:shape>
@@ -4411,18 +4349,18 @@
         <mc:AlternateContent>
           <mc:Choice Requires="wps">
             <w:drawing>
-              <wp:anchor distT="0" distB="0" distL="114300" distR="114300" simplePos="0" relativeHeight="251968512" behindDoc="0" locked="0" layoutInCell="1" allowOverlap="1" wp14:anchorId="5EB20871" wp14:editId="23EC5853">
+              <wp:anchor distT="0" distB="0" distL="114300" distR="114300" simplePos="0" relativeHeight="251960320" behindDoc="0" locked="0" layoutInCell="1" allowOverlap="1" wp14:anchorId="78142146" wp14:editId="72C9FB0B">
                 <wp:simplePos x="0" y="0"/>
                 <wp:positionH relativeFrom="margin">
-                  <wp:posOffset>1304925</wp:posOffset>
+                  <wp:posOffset>5381624</wp:posOffset>
                 </wp:positionH>
                 <wp:positionV relativeFrom="paragraph">
-                  <wp:posOffset>633094</wp:posOffset>
+                  <wp:posOffset>484504</wp:posOffset>
                 </wp:positionV>
-                <wp:extent cx="1047750" cy="1895475"/>
-                <wp:effectExtent l="0" t="38100" r="57150" b="28575"/>
+                <wp:extent cx="314325" cy="1552575"/>
+                <wp:effectExtent l="0" t="38100" r="66675" b="28575"/>
                 <wp:wrapNone/>
-                <wp:docPr id="1109558486" name="Straight Arrow Connector 1109558486"/>
+                <wp:docPr id="1893036515" name="Straight Arrow Connector 1893036515"/>
                 <wp:cNvGraphicFramePr/>
                 <a:graphic xmlns:a="http://schemas.openxmlformats.org/drawingml/2006/main">
                   <a:graphicData uri="http://schemas.microsoft.com/office/word/2010/wordprocessingShape">
@@ -4431,7 +4369,7 @@
                       <wps:spPr>
                         <a:xfrm flipV="1">
                           <a:off x="0" y="0"/>
-                          <a:ext cx="1047750" cy="1895475"/>
+                          <a:ext cx="314325" cy="1552575"/>
                         </a:xfrm>
                         <a:prstGeom prst="straightConnector1">
                           <a:avLst/>
@@ -4472,7 +4410,7 @@
           </mc:Choice>
           <mc:Fallback>
             <w:pict>
-              <v:shape w14:anchorId="71AFB5B0" id="Straight Arrow Connector 1109558486" o:spid="_x0000_s1026" type="#_x0000_t32" style="position:absolute;margin-left:102.75pt;margin-top:49.85pt;width:82.5pt;height:149.25pt;flip:y;z-index:251968512;visibility:visible;mso-wrap-style:square;mso-width-percent:0;mso-height-percent:0;mso-wrap-distance-left:9pt;mso-wrap-distance-top:0;mso-wrap-distance-right:9pt;mso-wrap-distance-bottom:0;mso-position-horizontal:absolute;mso-position-horizontal-relative:margin;mso-position-vertical:absolute;mso-position-vertical-relative:text;mso-width-percent:0;mso-height-percent:0;mso-width-relative:margin;mso-height-relative:margin" o:gfxdata="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" strokecolor="red" strokeweight="2pt">
+              <v:shape w14:anchorId="0AA33EAF" id="Straight Arrow Connector 1893036515" o:spid="_x0000_s1026" type="#_x0000_t32" style="position:absolute;margin-left:423.75pt;margin-top:38.15pt;width:24.75pt;height:122.25pt;flip:y;z-index:251960320;visibility:visible;mso-wrap-style:square;mso-width-percent:0;mso-height-percent:0;mso-wrap-distance-left:9pt;mso-wrap-distance-top:0;mso-wrap-distance-right:9pt;mso-wrap-distance-bottom:0;mso-position-horizontal:absolute;mso-position-horizontal-relative:margin;mso-position-vertical:absolute;mso-position-vertical-relative:text;mso-width-percent:0;mso-height-percent:0;mso-width-relative:margin;mso-height-relative:margin" o:gfxdata="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" strokecolor="red" strokeweight="2pt">
                 <v:stroke endarrow="open"/>
                 <w10:wrap anchorx="margin"/>
               </v:shape>
@@ -4487,18 +4425,18 @@
         <mc:AlternateContent>
           <mc:Choice Requires="wps">
             <w:drawing>
-              <wp:anchor distT="0" distB="0" distL="114300" distR="114300" simplePos="0" relativeHeight="251966464" behindDoc="0" locked="0" layoutInCell="1" allowOverlap="1" wp14:anchorId="71A7C11C" wp14:editId="43BB683C">
+              <wp:anchor distT="0" distB="0" distL="114300" distR="114300" simplePos="0" relativeHeight="251964416" behindDoc="0" locked="0" layoutInCell="1" allowOverlap="1" wp14:anchorId="39626E16" wp14:editId="4DB2FBBF">
                 <wp:simplePos x="0" y="0"/>
                 <wp:positionH relativeFrom="margin">
-                  <wp:posOffset>1276350</wp:posOffset>
+                  <wp:posOffset>1238250</wp:posOffset>
                 </wp:positionH>
                 <wp:positionV relativeFrom="paragraph">
-                  <wp:posOffset>575945</wp:posOffset>
+                  <wp:posOffset>598805</wp:posOffset>
                 </wp:positionV>
-                <wp:extent cx="104775" cy="1962150"/>
-                <wp:effectExtent l="0" t="38100" r="85725" b="19050"/>
+                <wp:extent cx="2066925" cy="1428750"/>
+                <wp:effectExtent l="0" t="38100" r="47625" b="19050"/>
                 <wp:wrapNone/>
-                <wp:docPr id="1651206292" name="Straight Arrow Connector 1651206292"/>
+                <wp:docPr id="1181579635" name="Straight Arrow Connector 1181579635"/>
                 <wp:cNvGraphicFramePr/>
                 <a:graphic xmlns:a="http://schemas.openxmlformats.org/drawingml/2006/main">
                   <a:graphicData uri="http://schemas.microsoft.com/office/word/2010/wordprocessingShape">
@@ -4507,7 +4445,7 @@
                       <wps:spPr>
                         <a:xfrm flipV="1">
                           <a:off x="0" y="0"/>
-                          <a:ext cx="104775" cy="1962150"/>
+                          <a:ext cx="2066925" cy="1428750"/>
                         </a:xfrm>
                         <a:prstGeom prst="straightConnector1">
                           <a:avLst/>
@@ -4548,7 +4486,7 @@
           </mc:Choice>
           <mc:Fallback>
             <w:pict>
-              <v:shape w14:anchorId="7BCC4FA0" id="Straight Arrow Connector 1651206292" o:spid="_x0000_s1026" type="#_x0000_t32" style="position:absolute;margin-left:100.5pt;margin-top:45.35pt;width:8.25pt;height:154.5pt;flip:y;z-index:251966464;visibility:visible;mso-wrap-style:square;mso-width-percent:0;mso-height-percent:0;mso-wrap-distance-left:9pt;mso-wrap-distance-top:0;mso-wrap-distance-right:9pt;mso-wrap-distance-bottom:0;mso-position-horizontal:absolute;mso-position-horizontal-relative:margin;mso-position-vertical:absolute;mso-position-vertical-relative:text;mso-width-percent:0;mso-height-percent:0;mso-width-relative:margin;mso-height-relative:margin" o:gfxdata="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" strokecolor="red" strokeweight="2pt">
+              <v:shape w14:anchorId="0388A18B" id="Straight Arrow Connector 1181579635" o:spid="_x0000_s1026" type="#_x0000_t32" style="position:absolute;margin-left:97.5pt;margin-top:47.15pt;width:162.75pt;height:112.5pt;flip:y;z-index:251964416;visibility:visible;mso-wrap-style:square;mso-width-percent:0;mso-height-percent:0;mso-wrap-distance-left:9pt;mso-wrap-distance-top:0;mso-wrap-distance-right:9pt;mso-wrap-distance-bottom:0;mso-position-horizontal:absolute;mso-position-horizontal-relative:margin;mso-position-vertical:absolute;mso-position-vertical-relative:text;mso-width-percent:0;mso-height-percent:0;mso-width-relative:margin;mso-height-relative:margin" o:gfxdata="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" strokecolor="red" strokeweight="2pt">
                 <v:stroke endarrow="open"/>
                 <w10:wrap anchorx="margin"/>
               </v:shape>
@@ -4563,18 +4501,18 @@
         <mc:AlternateContent>
           <mc:Choice Requires="wps">
             <w:drawing>
-              <wp:anchor distT="0" distB="0" distL="114300" distR="114300" simplePos="0" relativeHeight="251964416" behindDoc="0" locked="0" layoutInCell="1" allowOverlap="1" wp14:anchorId="39626E16" wp14:editId="4420B397">
+              <wp:anchor distT="0" distB="0" distL="114300" distR="114300" simplePos="0" relativeHeight="251970560" behindDoc="0" locked="0" layoutInCell="1" allowOverlap="1" wp14:anchorId="03F06ACF" wp14:editId="43FB9833">
                 <wp:simplePos x="0" y="0"/>
                 <wp:positionH relativeFrom="margin">
-                  <wp:posOffset>1285875</wp:posOffset>
+                  <wp:posOffset>1238250</wp:posOffset>
                 </wp:positionH>
                 <wp:positionV relativeFrom="paragraph">
-                  <wp:posOffset>623570</wp:posOffset>
+                  <wp:posOffset>570230</wp:posOffset>
                 </wp:positionV>
-                <wp:extent cx="2676525" cy="1924050"/>
-                <wp:effectExtent l="0" t="38100" r="47625" b="19050"/>
+                <wp:extent cx="1295400" cy="1457325"/>
+                <wp:effectExtent l="0" t="38100" r="57150" b="28575"/>
                 <wp:wrapNone/>
-                <wp:docPr id="1181579635" name="Straight Arrow Connector 1181579635"/>
+                <wp:docPr id="1669972961" name="Straight Arrow Connector 1669972961"/>
                 <wp:cNvGraphicFramePr/>
                 <a:graphic xmlns:a="http://schemas.openxmlformats.org/drawingml/2006/main">
                   <a:graphicData uri="http://schemas.microsoft.com/office/word/2010/wordprocessingShape">
@@ -4583,7 +4521,7 @@
                       <wps:spPr>
                         <a:xfrm flipV="1">
                           <a:off x="0" y="0"/>
-                          <a:ext cx="2676525" cy="1924050"/>
+                          <a:ext cx="1295400" cy="1457325"/>
                         </a:xfrm>
                         <a:prstGeom prst="straightConnector1">
                           <a:avLst/>
@@ -4624,7 +4562,7 @@
           </mc:Choice>
           <mc:Fallback>
             <w:pict>
-              <v:shape w14:anchorId="3B23748B" id="Straight Arrow Connector 1181579635" o:spid="_x0000_s1026" type="#_x0000_t32" style="position:absolute;margin-left:101.25pt;margin-top:49.1pt;width:210.75pt;height:151.5pt;flip:y;z-index:251964416;visibility:visible;mso-wrap-style:square;mso-width-percent:0;mso-height-percent:0;mso-wrap-distance-left:9pt;mso-wrap-distance-top:0;mso-wrap-distance-right:9pt;mso-wrap-distance-bottom:0;mso-position-horizontal:absolute;mso-position-horizontal-relative:margin;mso-position-vertical:absolute;mso-position-vertical-relative:text;mso-width-percent:0;mso-height-percent:0;mso-width-relative:margin;mso-height-relative:margin" o:gfxdata="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" strokecolor="red" strokeweight="2pt">
+              <v:shape w14:anchorId="306ADFD8" id="Straight Arrow Connector 1669972961" o:spid="_x0000_s1026" type="#_x0000_t32" style="position:absolute;margin-left:97.5pt;margin-top:44.9pt;width:102pt;height:114.75pt;flip:y;z-index:251970560;visibility:visible;mso-wrap-style:square;mso-width-percent:0;mso-height-percent:0;mso-wrap-distance-left:9pt;mso-wrap-distance-top:0;mso-wrap-distance-right:9pt;mso-wrap-distance-bottom:0;mso-position-horizontal:absolute;mso-position-horizontal-relative:margin;mso-position-vertical:absolute;mso-position-vertical-relative:text;mso-width-percent:0;mso-height-percent:0;mso-width-relative:margin;mso-height-relative:margin" o:gfxdata="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" strokecolor="red" strokeweight="2pt">
                 <v:stroke endarrow="open"/>
                 <w10:wrap anchorx="margin"/>
               </v:shape>
@@ -4639,18 +4577,18 @@
         <mc:AlternateContent>
           <mc:Choice Requires="wps">
             <w:drawing>
-              <wp:anchor distT="0" distB="0" distL="114300" distR="114300" simplePos="0" relativeHeight="251962368" behindDoc="0" locked="0" layoutInCell="1" allowOverlap="1" wp14:anchorId="5D0007C4" wp14:editId="53C4DFC3">
+              <wp:anchor distT="0" distB="0" distL="114300" distR="114300" simplePos="0" relativeHeight="251968512" behindDoc="0" locked="0" layoutInCell="1" allowOverlap="1" wp14:anchorId="5EB20871" wp14:editId="6B6E971D">
                 <wp:simplePos x="0" y="0"/>
                 <wp:positionH relativeFrom="margin">
-                  <wp:posOffset>3133725</wp:posOffset>
+                  <wp:posOffset>1219200</wp:posOffset>
                 </wp:positionH>
                 <wp:positionV relativeFrom="paragraph">
-                  <wp:posOffset>642619</wp:posOffset>
+                  <wp:posOffset>570229</wp:posOffset>
                 </wp:positionV>
-                <wp:extent cx="1895475" cy="1943100"/>
-                <wp:effectExtent l="0" t="38100" r="47625" b="19050"/>
+                <wp:extent cx="762000" cy="1457325"/>
+                <wp:effectExtent l="0" t="38100" r="57150" b="28575"/>
                 <wp:wrapNone/>
-                <wp:docPr id="819257572" name="Straight Arrow Connector 819257572"/>
+                <wp:docPr id="1109558486" name="Straight Arrow Connector 1109558486"/>
                 <wp:cNvGraphicFramePr/>
                 <a:graphic xmlns:a="http://schemas.openxmlformats.org/drawingml/2006/main">
                   <a:graphicData uri="http://schemas.microsoft.com/office/word/2010/wordprocessingShape">
@@ -4659,7 +4597,7 @@
                       <wps:spPr>
                         <a:xfrm flipV="1">
                           <a:off x="0" y="0"/>
-                          <a:ext cx="1895475" cy="1943100"/>
+                          <a:ext cx="762000" cy="1457325"/>
                         </a:xfrm>
                         <a:prstGeom prst="straightConnector1">
                           <a:avLst/>
@@ -4700,7 +4638,7 @@
           </mc:Choice>
           <mc:Fallback>
             <w:pict>
-              <v:shape w14:anchorId="42A70ADE" id="Straight Arrow Connector 819257572" o:spid="_x0000_s1026" type="#_x0000_t32" style="position:absolute;margin-left:246.75pt;margin-top:50.6pt;width:149.25pt;height:153pt;flip:y;z-index:251962368;visibility:visible;mso-wrap-style:square;mso-width-percent:0;mso-height-percent:0;mso-wrap-distance-left:9pt;mso-wrap-distance-top:0;mso-wrap-distance-right:9pt;mso-wrap-distance-bottom:0;mso-position-horizontal:absolute;mso-position-horizontal-relative:margin;mso-position-vertical:absolute;mso-position-vertical-relative:text;mso-width-percent:0;mso-height-percent:0;mso-width-relative:margin;mso-height-relative:margin" o:gfxdata="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" strokecolor="red" strokeweight="2pt">
+              <v:shape w14:anchorId="0AC2ADD8" id="Straight Arrow Connector 1109558486" o:spid="_x0000_s1026" type="#_x0000_t32" style="position:absolute;margin-left:96pt;margin-top:44.9pt;width:60pt;height:114.75pt;flip:y;z-index:251968512;visibility:visible;mso-wrap-style:square;mso-width-percent:0;mso-height-percent:0;mso-wrap-distance-left:9pt;mso-wrap-distance-top:0;mso-wrap-distance-right:9pt;mso-wrap-distance-bottom:0;mso-position-horizontal:absolute;mso-position-horizontal-relative:margin;mso-position-vertical:absolute;mso-position-vertical-relative:text;mso-width-percent:0;mso-height-percent:0;mso-width-relative:margin;mso-height-relative:margin" o:gfxdata="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" strokecolor="red" strokeweight="2pt">
                 <v:stroke endarrow="open"/>
                 <w10:wrap anchorx="margin"/>
               </v:shape>
@@ -4715,27 +4653,27 @@
         <mc:AlternateContent>
           <mc:Choice Requires="wps">
             <w:drawing>
-              <wp:anchor distT="0" distB="0" distL="114300" distR="114300" simplePos="0" relativeHeight="251960320" behindDoc="0" locked="0" layoutInCell="1" allowOverlap="1" wp14:anchorId="78142146" wp14:editId="6EF4552A">
+              <wp:anchor distT="0" distB="0" distL="114300" distR="114300" simplePos="0" relativeHeight="251966464" behindDoc="0" locked="0" layoutInCell="1" allowOverlap="1" wp14:anchorId="71A7C11C" wp14:editId="4635A989">
                 <wp:simplePos x="0" y="0"/>
                 <wp:positionH relativeFrom="margin">
-                  <wp:posOffset>4914900</wp:posOffset>
+                  <wp:posOffset>1114425</wp:posOffset>
                 </wp:positionH>
                 <wp:positionV relativeFrom="paragraph">
-                  <wp:posOffset>642619</wp:posOffset>
+                  <wp:posOffset>608329</wp:posOffset>
                 </wp:positionV>
-                <wp:extent cx="476250" cy="1933575"/>
-                <wp:effectExtent l="0" t="38100" r="76200" b="28575"/>
+                <wp:extent cx="114300" cy="1457325"/>
+                <wp:effectExtent l="76200" t="38100" r="19050" b="28575"/>
                 <wp:wrapNone/>
-                <wp:docPr id="1893036515" name="Straight Arrow Connector 1893036515"/>
+                <wp:docPr id="1651206292" name="Straight Arrow Connector 1651206292"/>
                 <wp:cNvGraphicFramePr/>
                 <a:graphic xmlns:a="http://schemas.openxmlformats.org/drawingml/2006/main">
                   <a:graphicData uri="http://schemas.microsoft.com/office/word/2010/wordprocessingShape">
                     <wps:wsp>
                       <wps:cNvCnPr/>
                       <wps:spPr>
-                        <a:xfrm flipV="1">
+                        <a:xfrm flipH="1" flipV="1">
                           <a:off x="0" y="0"/>
-                          <a:ext cx="476250" cy="1933575"/>
+                          <a:ext cx="114300" cy="1457325"/>
                         </a:xfrm>
                         <a:prstGeom prst="straightConnector1">
                           <a:avLst/>
@@ -4776,7 +4714,7 @@
           </mc:Choice>
           <mc:Fallback>
             <w:pict>
-              <v:shape w14:anchorId="3F0136B4" id="Straight Arrow Connector 1893036515" o:spid="_x0000_s1026" type="#_x0000_t32" style="position:absolute;margin-left:387pt;margin-top:50.6pt;width:37.5pt;height:152.25pt;flip:y;z-index:251960320;visibility:visible;mso-wrap-style:square;mso-width-percent:0;mso-height-percent:0;mso-wrap-distance-left:9pt;mso-wrap-distance-top:0;mso-wrap-distance-right:9pt;mso-wrap-distance-bottom:0;mso-position-horizontal:absolute;mso-position-horizontal-relative:margin;mso-position-vertical:absolute;mso-position-vertical-relative:text;mso-width-percent:0;mso-height-percent:0;mso-width-relative:margin;mso-height-relative:margin" o:gfxdata="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" strokecolor="red" strokeweight="2pt">
+              <v:shape w14:anchorId="61DDF30C" id="Straight Arrow Connector 1651206292" o:spid="_x0000_s1026" type="#_x0000_t32" style="position:absolute;margin-left:87.75pt;margin-top:47.9pt;width:9pt;height:114.75pt;flip:x y;z-index:251966464;visibility:visible;mso-wrap-style:square;mso-width-percent:0;mso-height-percent:0;mso-wrap-distance-left:9pt;mso-wrap-distance-top:0;mso-wrap-distance-right:9pt;mso-wrap-distance-bottom:0;mso-position-horizontal:absolute;mso-position-horizontal-relative:margin;mso-position-vertical:absolute;mso-position-vertical-relative:text;mso-width-percent:0;mso-height-percent:0;mso-width-relative:margin;mso-height-relative:margin" o:gfxdata="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" strokecolor="red" strokeweight="2pt">
                 <v:stroke endarrow="open"/>
                 <w10:wrap anchorx="margin"/>
               </v:shape>
@@ -4790,10 +4728,10 @@
           <w:color w:val="000000" w:themeColor="text1"/>
         </w:rPr>
         <w:drawing>
-          <wp:inline distT="0" distB="0" distL="0" distR="0" wp14:anchorId="70A8F0B6" wp14:editId="14E6FB5F">
-            <wp:extent cx="5353050" cy="2034273"/>
-            <wp:effectExtent l="0" t="0" r="0" b="4445"/>
-            <wp:docPr id="1356319302" name="Picture 91"/>
+          <wp:inline distT="0" distB="0" distL="0" distR="0" wp14:anchorId="11746C2D" wp14:editId="4F02505D">
+            <wp:extent cx="5746114" cy="1533525"/>
+            <wp:effectExtent l="0" t="0" r="7620" b="0"/>
+            <wp:docPr id="648522284" name="Picture 85"/>
             <wp:cNvGraphicFramePr>
               <a:graphicFrameLocks xmlns:a="http://schemas.openxmlformats.org/drawingml/2006/main" noChangeAspect="1"/>
             </wp:cNvGraphicFramePr>
@@ -4801,7 +4739,7 @@
               <a:graphicData uri="http://schemas.openxmlformats.org/drawingml/2006/picture">
                 <pic:pic xmlns:pic="http://schemas.openxmlformats.org/drawingml/2006/picture">
                   <pic:nvPicPr>
-                    <pic:cNvPr id="1356319302" name="Picture 1356319302"/>
+                    <pic:cNvPr id="648522284" name="Picture 648522284"/>
                     <pic:cNvPicPr/>
                   </pic:nvPicPr>
                   <pic:blipFill>
@@ -4819,7 +4757,7 @@
                   <pic:spPr>
                     <a:xfrm>
                       <a:off x="0" y="0"/>
-                      <a:ext cx="5365496" cy="2039003"/>
+                      <a:ext cx="5785402" cy="1544010"/>
                     </a:xfrm>
                     <a:prstGeom prst="rect">
                       <a:avLst/>
@@ -4854,147 +4792,13 @@
         <mc:AlternateContent>
           <mc:Choice Requires="wps">
             <w:drawing>
-              <wp:anchor distT="0" distB="0" distL="114300" distR="114300" simplePos="0" relativeHeight="251958272" behindDoc="0" locked="0" layoutInCell="1" allowOverlap="1" wp14:anchorId="1C188E49" wp14:editId="78E6AB2E">
+              <wp:anchor distT="0" distB="0" distL="114300" distR="114300" simplePos="0" relativeHeight="251956224" behindDoc="0" locked="0" layoutInCell="1" allowOverlap="1" wp14:anchorId="7B16F10D" wp14:editId="1555F30E">
                 <wp:simplePos x="0" y="0"/>
                 <wp:positionH relativeFrom="column">
-                  <wp:posOffset>447675</wp:posOffset>
+                  <wp:posOffset>4552950</wp:posOffset>
                 </wp:positionH>
                 <wp:positionV relativeFrom="paragraph">
-                  <wp:posOffset>46990</wp:posOffset>
-                </wp:positionV>
-                <wp:extent cx="1676400" cy="349250"/>
-                <wp:effectExtent l="0" t="0" r="19050" b="69850"/>
-                <wp:wrapNone/>
-                <wp:docPr id="1845244335" name="Rectangular Callout 17"/>
-                <wp:cNvGraphicFramePr/>
-                <a:graphic xmlns:a="http://schemas.openxmlformats.org/drawingml/2006/main">
-                  <a:graphicData uri="http://schemas.microsoft.com/office/word/2010/wordprocessingShape">
-                    <wps:wsp>
-                      <wps:cNvSpPr/>
-                      <wps:spPr>
-                        <a:xfrm>
-                          <a:off x="0" y="0"/>
-                          <a:ext cx="1676400" cy="349250"/>
-                        </a:xfrm>
-                        <a:prstGeom prst="wedgeRectCallout">
-                          <a:avLst/>
-                        </a:prstGeom>
-                        <a:solidFill>
-                          <a:srgbClr val="4F81BD">
-                            <a:lumMod val="40000"/>
-                            <a:lumOff val="60000"/>
-                          </a:srgbClr>
-                        </a:solidFill>
-                        <a:ln w="25400" cap="flat" cmpd="sng" algn="ctr">
-                          <a:solidFill>
-                            <a:srgbClr val="4F81BD">
-                              <a:shade val="50000"/>
-                            </a:srgbClr>
-                          </a:solidFill>
-                          <a:prstDash val="solid"/>
-                        </a:ln>
-                        <a:effectLst/>
-                      </wps:spPr>
-                      <wps:txbx>
-                        <w:txbxContent>
-                          <w:p>
-                            <w:pPr>
-                              <w:jc w:val="center"/>
-                              <w:rPr>
-                                <w:color w:val="002060"/>
-                                <w:sz w:val="28"/>
-                                <w:szCs w:val="28"/>
-                              </w:rPr>
-                            </w:pPr>
-                            <w:r>
-                              <w:rPr>
-                                <w:color w:val="002060"/>
-                                <w:sz w:val="28"/>
-                                <w:szCs w:val="28"/>
-                              </w:rPr>
-                              <w:t xml:space="preserve">25Gx12 </w:t>
-                            </w:r>
-                            <w:r>
-                              <w:rPr>
-                                <w:color w:val="002060"/>
-                                <w:sz w:val="28"/>
-                                <w:szCs w:val="28"/>
-                              </w:rPr>
-                              <w:t>Receiver</w:t>
-                            </w:r>
-                          </w:p>
-                        </w:txbxContent>
-                      </wps:txbx>
-                      <wps:bodyPr rot="0" spcFirstLastPara="0" vertOverflow="overflow" horzOverflow="overflow" vert="horz" wrap="square" lIns="91440" tIns="45720" rIns="91440" bIns="45720" numCol="1" spcCol="0" rtlCol="0" fromWordArt="0" anchor="ctr" anchorCtr="0" forceAA="0" compatLnSpc="1">
-                        <a:prstTxWarp prst="textNoShape">
-                          <a:avLst/>
-                        </a:prstTxWarp>
-                        <a:noAutofit/>
-                      </wps:bodyPr>
-                    </wps:wsp>
-                  </a:graphicData>
-                </a:graphic>
-                <wp14:sizeRelH relativeFrom="margin">
-                  <wp14:pctWidth>0</wp14:pctWidth>
-                </wp14:sizeRelH>
-                <wp14:sizeRelV relativeFrom="margin">
-                  <wp14:pctHeight>0</wp14:pctHeight>
-                </wp14:sizeRelV>
-              </wp:anchor>
-            </w:drawing>
-          </mc:Choice>
-          <mc:Fallback>
-            <w:pict>
-              <v:shape w14:anchorId="1C188E49" id="_x0000_s1036" type="#_x0000_t61" style="position:absolute;left:0;text-align:left;margin-left:35.25pt;margin-top:3.7pt;width:132pt;height:27.5pt;z-index:251958272;visibility:visible;mso-wrap-style:square;mso-width-percent:0;mso-height-percent:0;mso-wrap-distance-left:9pt;mso-wrap-distance-top:0;mso-wrap-distance-right:9pt;mso-wrap-distance-bottom:0;mso-position-horizontal:absolute;mso-position-horizontal-relative:text;mso-position-vertical:absolute;mso-position-vertical-relative:text;mso-width-percent:0;mso-height-percent:0;mso-width-relative:margin;mso-height-relative:margin;v-text-anchor:middle" o:gfxdata="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" adj="6300,24300" fillcolor="#b9cde5" strokecolor="#385d8a" strokeweight="2pt">
-                <v:textbox>
-                  <w:txbxContent>
-                    <w:p>
-                      <w:pPr>
-                        <w:jc w:val="center"/>
-                        <w:rPr>
-                          <w:color w:val="002060"/>
-                          <w:sz w:val="28"/>
-                          <w:szCs w:val="28"/>
-                        </w:rPr>
-                      </w:pPr>
-                      <w:r>
-                        <w:rPr>
-                          <w:color w:val="002060"/>
-                          <w:sz w:val="28"/>
-                          <w:szCs w:val="28"/>
-                        </w:rPr>
-                        <w:t xml:space="preserve">25Gx12 </w:t>
-                      </w:r>
-                      <w:r>
-                        <w:rPr>
-                          <w:color w:val="002060"/>
-                          <w:sz w:val="28"/>
-                          <w:szCs w:val="28"/>
-                        </w:rPr>
-                        <w:t>Receiver</w:t>
-                      </w:r>
-                    </w:p>
-                  </w:txbxContent>
-                </v:textbox>
-              </v:shape>
-            </w:pict>
-          </mc:Fallback>
-        </mc:AlternateContent>
-      </w:r>
-      <w:r>
-        <w:rPr>
-          <w:noProof/>
-        </w:rPr>
-        <mc:AlternateContent>
-          <mc:Choice Requires="wps">
-            <w:drawing>
-              <wp:anchor distT="0" distB="0" distL="114300" distR="114300" simplePos="0" relativeHeight="251956224" behindDoc="0" locked="0" layoutInCell="1" allowOverlap="1" wp14:anchorId="7B16F10D" wp14:editId="403D20B4">
-                <wp:simplePos x="0" y="0"/>
-                <wp:positionH relativeFrom="column">
-                  <wp:posOffset>2276475</wp:posOffset>
-                </wp:positionH>
-                <wp:positionV relativeFrom="paragraph">
-                  <wp:posOffset>81280</wp:posOffset>
+                  <wp:posOffset>62230</wp:posOffset>
                 </wp:positionV>
                 <wp:extent cx="1676400" cy="349250"/>
                 <wp:effectExtent l="0" t="0" r="19050" b="69850"/>
@@ -5046,31 +4850,7 @@
                                 <w:sz w:val="28"/>
                                 <w:szCs w:val="28"/>
                               </w:rPr>
-                              <w:t>25Gx</w:t>
-                            </w:r>
-                            <w:r>
-                              <w:rPr>
-                                <w:color w:val="002060"/>
-                                <w:sz w:val="28"/>
-                                <w:szCs w:val="28"/>
-                              </w:rPr>
-                              <w:t>4</w:t>
-                            </w:r>
-                            <w:r>
-                              <w:rPr>
-                                <w:color w:val="002060"/>
-                                <w:sz w:val="28"/>
-                                <w:szCs w:val="28"/>
-                              </w:rPr>
-                              <w:t xml:space="preserve"> Trans</w:t>
-                            </w:r>
-                            <w:r>
-                              <w:rPr>
-                                <w:color w:val="002060"/>
-                                <w:sz w:val="28"/>
-                                <w:szCs w:val="28"/>
-                              </w:rPr>
-                              <w:t>ceiver</w:t>
+                              <w:t>25Gx4 Transceiver</w:t>
                             </w:r>
                           </w:p>
                         </w:txbxContent>
@@ -5095,7 +4875,7 @@
           </mc:Choice>
           <mc:Fallback>
             <w:pict>
-              <v:shape w14:anchorId="7B16F10D" id="_x0000_s1037" type="#_x0000_t61" style="position:absolute;left:0;text-align:left;margin-left:179.25pt;margin-top:6.4pt;width:132pt;height:27.5pt;z-index:251956224;visibility:visible;mso-wrap-style:square;mso-width-percent:0;mso-height-percent:0;mso-wrap-distance-left:9pt;mso-wrap-distance-top:0;mso-wrap-distance-right:9pt;mso-wrap-distance-bottom:0;mso-position-horizontal:absolute;mso-position-horizontal-relative:text;mso-position-vertical:absolute;mso-position-vertical-relative:text;mso-width-percent:0;mso-height-percent:0;mso-width-relative:margin;mso-height-relative:margin;v-text-anchor:middle" o:gfxdata="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" adj="6300,24300" fillcolor="#b9cde5" strokecolor="#385d8a" strokeweight="2pt">
+              <v:shape w14:anchorId="7B16F10D" id="_x0000_s1036" type="#_x0000_t61" style="position:absolute;left:0;text-align:left;margin-left:358.5pt;margin-top:4.9pt;width:132pt;height:27.5pt;z-index:251956224;visibility:visible;mso-wrap-style:square;mso-width-percent:0;mso-height-percent:0;mso-wrap-distance-left:9pt;mso-wrap-distance-top:0;mso-wrap-distance-right:9pt;mso-wrap-distance-bottom:0;mso-position-horizontal:absolute;mso-position-horizontal-relative:text;mso-position-vertical:absolute;mso-position-vertical-relative:text;mso-width-percent:0;mso-height-percent:0;mso-width-relative:margin;mso-height-relative:margin;v-text-anchor:middle" o:gfxdata="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" adj="6300,24300" fillcolor="#b9cde5" strokecolor="#385d8a" strokeweight="2pt">
                 <v:textbox>
                   <w:txbxContent>
                     <w:p>
@@ -5113,31 +4893,7 @@
                           <w:sz w:val="28"/>
                           <w:szCs w:val="28"/>
                         </w:rPr>
-                        <w:t>25Gx</w:t>
-                      </w:r>
-                      <w:r>
-                        <w:rPr>
-                          <w:color w:val="002060"/>
-                          <w:sz w:val="28"/>
-                          <w:szCs w:val="28"/>
-                        </w:rPr>
-                        <w:t>4</w:t>
-                      </w:r>
-                      <w:r>
-                        <w:rPr>
-                          <w:color w:val="002060"/>
-                          <w:sz w:val="28"/>
-                          <w:szCs w:val="28"/>
-                        </w:rPr>
-                        <w:t xml:space="preserve"> Trans</w:t>
-                      </w:r>
-                      <w:r>
-                        <w:rPr>
-                          <w:color w:val="002060"/>
-                          <w:sz w:val="28"/>
-                          <w:szCs w:val="28"/>
-                        </w:rPr>
-                        <w:t>ceiver</w:t>
+                        <w:t>25Gx4 Transceiver</w:t>
                       </w:r>
                     </w:p>
                   </w:txbxContent>
@@ -5154,10 +4910,10 @@
         <mc:AlternateContent>
           <mc:Choice Requires="wps">
             <w:drawing>
-              <wp:anchor distT="0" distB="0" distL="114300" distR="114300" simplePos="0" relativeHeight="251954176" behindDoc="0" locked="0" layoutInCell="1" allowOverlap="1" wp14:anchorId="54D6CB77" wp14:editId="07F46D56">
+              <wp:anchor distT="0" distB="0" distL="114300" distR="114300" simplePos="0" relativeHeight="251954176" behindDoc="0" locked="0" layoutInCell="1" allowOverlap="1" wp14:anchorId="54D6CB77" wp14:editId="3A41B8BC">
                 <wp:simplePos x="0" y="0"/>
                 <wp:positionH relativeFrom="column">
-                  <wp:posOffset>4171950</wp:posOffset>
+                  <wp:posOffset>2466975</wp:posOffset>
                 </wp:positionH>
                 <wp:positionV relativeFrom="paragraph">
                   <wp:posOffset>75565</wp:posOffset>
@@ -5237,7 +4993,7 @@
           </mc:Choice>
           <mc:Fallback>
             <w:pict>
-              <v:shape w14:anchorId="54D6CB77" id="_x0000_s1038" type="#_x0000_t61" style="position:absolute;left:0;text-align:left;margin-left:328.5pt;margin-top:5.95pt;width:132pt;height:27.5pt;z-index:251954176;visibility:visible;mso-wrap-style:square;mso-width-percent:0;mso-height-percent:0;mso-wrap-distance-left:9pt;mso-wrap-distance-top:0;mso-wrap-distance-right:9pt;mso-wrap-distance-bottom:0;mso-position-horizontal:absolute;mso-position-horizontal-relative:text;mso-position-vertical:absolute;mso-position-vertical-relative:text;mso-width-percent:0;mso-height-percent:0;mso-width-relative:margin;mso-height-relative:margin;v-text-anchor:middle" o:gfxdata="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" adj="6300,24300" fillcolor="#b9cde5" strokecolor="#385d8a" strokeweight="2pt">
+              <v:shape w14:anchorId="54D6CB77" id="_x0000_s1037" type="#_x0000_t61" style="position:absolute;left:0;text-align:left;margin-left:194.25pt;margin-top:5.95pt;width:132pt;height:27.5pt;z-index:251954176;visibility:visible;mso-wrap-style:square;mso-width-percent:0;mso-height-percent:0;mso-wrap-distance-left:9pt;mso-wrap-distance-top:0;mso-wrap-distance-right:9pt;mso-wrap-distance-bottom:0;mso-position-horizontal:absolute;mso-position-horizontal-relative:text;mso-position-vertical:absolute;mso-position-vertical-relative:text;mso-width-percent:0;mso-height-percent:0;mso-width-relative:margin;mso-height-relative:margin;v-text-anchor:middle" o:gfxdata="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" adj="6300,24300" fillcolor="#b9cde5" strokecolor="#385d8a" strokeweight="2pt">
                 <v:textbox>
                   <w:txbxContent>
                     <w:p>
@@ -5265,6 +5021,124 @@
           </mc:Fallback>
         </mc:AlternateContent>
       </w:r>
+      <w:r>
+        <w:rPr>
+          <w:noProof/>
+        </w:rPr>
+        <mc:AlternateContent>
+          <mc:Choice Requires="wps">
+            <w:drawing>
+              <wp:anchor distT="0" distB="0" distL="114300" distR="114300" simplePos="0" relativeHeight="251958272" behindDoc="0" locked="0" layoutInCell="1" allowOverlap="1" wp14:anchorId="1C188E49" wp14:editId="64D4C2C5">
+                <wp:simplePos x="0" y="0"/>
+                <wp:positionH relativeFrom="column">
+                  <wp:posOffset>447675</wp:posOffset>
+                </wp:positionH>
+                <wp:positionV relativeFrom="paragraph">
+                  <wp:posOffset>46990</wp:posOffset>
+                </wp:positionV>
+                <wp:extent cx="1676400" cy="349250"/>
+                <wp:effectExtent l="0" t="0" r="19050" b="69850"/>
+                <wp:wrapNone/>
+                <wp:docPr id="1845244335" name="Rectangular Callout 17"/>
+                <wp:cNvGraphicFramePr/>
+                <a:graphic xmlns:a="http://schemas.openxmlformats.org/drawingml/2006/main">
+                  <a:graphicData uri="http://schemas.microsoft.com/office/word/2010/wordprocessingShape">
+                    <wps:wsp>
+                      <wps:cNvSpPr/>
+                      <wps:spPr>
+                        <a:xfrm>
+                          <a:off x="0" y="0"/>
+                          <a:ext cx="1676400" cy="349250"/>
+                        </a:xfrm>
+                        <a:prstGeom prst="wedgeRectCallout">
+                          <a:avLst/>
+                        </a:prstGeom>
+                        <a:solidFill>
+                          <a:srgbClr val="4F81BD">
+                            <a:lumMod val="40000"/>
+                            <a:lumOff val="60000"/>
+                          </a:srgbClr>
+                        </a:solidFill>
+                        <a:ln w="25400" cap="flat" cmpd="sng" algn="ctr">
+                          <a:solidFill>
+                            <a:srgbClr val="4F81BD">
+                              <a:shade val="50000"/>
+                            </a:srgbClr>
+                          </a:solidFill>
+                          <a:prstDash val="solid"/>
+                        </a:ln>
+                        <a:effectLst/>
+                      </wps:spPr>
+                      <wps:txbx>
+                        <w:txbxContent>
+                          <w:p>
+                            <w:pPr>
+                              <w:jc w:val="center"/>
+                              <w:rPr>
+                                <w:color w:val="002060"/>
+                                <w:sz w:val="28"/>
+                                <w:szCs w:val="28"/>
+                              </w:rPr>
+                            </w:pPr>
+                            <w:r>
+                              <w:rPr>
+                                <w:color w:val="002060"/>
+                                <w:sz w:val="28"/>
+                                <w:szCs w:val="28"/>
+                              </w:rPr>
+                              <w:t>25Gx12 Receiver</w:t>
+                            </w:r>
+                          </w:p>
+                        </w:txbxContent>
+                      </wps:txbx>
+                      <wps:bodyPr rot="0" spcFirstLastPara="0" vertOverflow="overflow" horzOverflow="overflow" vert="horz" wrap="square" lIns="91440" tIns="45720" rIns="91440" bIns="45720" numCol="1" spcCol="0" rtlCol="0" fromWordArt="0" anchor="ctr" anchorCtr="0" forceAA="0" compatLnSpc="1">
+                        <a:prstTxWarp prst="textNoShape">
+                          <a:avLst/>
+                        </a:prstTxWarp>
+                        <a:noAutofit/>
+                      </wps:bodyPr>
+                    </wps:wsp>
+                  </a:graphicData>
+                </a:graphic>
+                <wp14:sizeRelH relativeFrom="margin">
+                  <wp14:pctWidth>0</wp14:pctWidth>
+                </wp14:sizeRelH>
+                <wp14:sizeRelV relativeFrom="margin">
+                  <wp14:pctHeight>0</wp14:pctHeight>
+                </wp14:sizeRelV>
+              </wp:anchor>
+            </w:drawing>
+          </mc:Choice>
+          <mc:Fallback>
+            <w:pict>
+              <v:shape w14:anchorId="1C188E49" id="_x0000_s1038" type="#_x0000_t61" style="position:absolute;left:0;text-align:left;margin-left:35.25pt;margin-top:3.7pt;width:132pt;height:27.5pt;z-index:251958272;visibility:visible;mso-wrap-style:square;mso-width-percent:0;mso-height-percent:0;mso-wrap-distance-left:9pt;mso-wrap-distance-top:0;mso-wrap-distance-right:9pt;mso-wrap-distance-bottom:0;mso-position-horizontal:absolute;mso-position-horizontal-relative:text;mso-position-vertical:absolute;mso-position-vertical-relative:text;mso-width-percent:0;mso-height-percent:0;mso-width-relative:margin;mso-height-relative:margin;v-text-anchor:middle" o:gfxdata="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" adj="6300,24300" fillcolor="#b9cde5" strokecolor="#385d8a" strokeweight="2pt">
+                <v:textbox>
+                  <w:txbxContent>
+                    <w:p>
+                      <w:pPr>
+                        <w:jc w:val="center"/>
+                        <w:rPr>
+                          <w:color w:val="002060"/>
+                          <w:sz w:val="28"/>
+                          <w:szCs w:val="28"/>
+                        </w:rPr>
+                      </w:pPr>
+                      <w:r>
+                        <w:rPr>
+                          <w:color w:val="002060"/>
+                          <w:sz w:val="28"/>
+                          <w:szCs w:val="28"/>
+                        </w:rPr>
+                        <w:t>25Gx12 Receiver</w:t>
+                      </w:r>
+                    </w:p>
+                  </w:txbxContent>
+                </v:textbox>
+              </v:shape>
+            </w:pict>
+          </mc:Fallback>
+        </mc:AlternateContent>
+      </w:r>
     </w:p>
     <w:p>
       <w:pPr>
@@ -5286,28 +5160,7 @@
         </w:rPr>
       </w:pPr>
       <w:r>
-        <w:t xml:space="preserve">Cut </w:t>
-      </w:r>
-      <w:r>
-        <w:t>five 11-mm</w:t>
-      </w:r>
-      <w:r>
-        <w:t xml:space="preserve"> wide </w:t>
-      </w:r>
-      <w:r>
-        <w:t xml:space="preserve">by 15-mm long </w:t>
-      </w:r>
-      <w:r>
-        <w:t>strips of pink 1.78 mm thick Laird Tflex HD300 (DigiKey P/N 926-1594). Apply them to the top of the FireFly</w:t>
-      </w:r>
-      <w:r>
-        <w:t xml:space="preserve"> receivers and transmitter</w:t>
-      </w:r>
-      <w:r>
-        <w:t>.</w:t>
-      </w:r>
-      <w:r>
-        <w:t xml:space="preserve"> Cut one 11-mm square piece and apply it to the top of the FireFly transceiver. Be sure it does </w:t>
+        <w:t xml:space="preserve">Cut five 11-mm wide by 15-mm long strips of pink 1.78 mm thick Laird Tflex HD300 (DigiKey P/N 926-1594). Apply them to the top of the FireFly receivers and transmitter. Cut one 11-mm square piece and apply it to the top of the FireFly transceiver. Be sure it does </w:t>
       </w:r>
       <w:r>
         <w:t>n</w:t>
@@ -5319,13 +5172,7 @@
         <w:t>r</w:t>
       </w:r>
       <w:r>
-        <w:t>lap the latch on this device.</w:t>
-      </w:r>
-      <w:r>
-        <w:t xml:space="preserve"> </w:t>
-      </w:r>
-      <w:r>
-        <w:t>If you have trouble cutting and centering them, cut larger pieces to start with.</w:t>
+        <w:t>lap the latch on this device. If you have trouble cutting and centering them, cut larger pieces to start with.</w:t>
       </w:r>
     </w:p>
     <w:p>
@@ -5353,27 +5200,27 @@
         <mc:AlternateContent>
           <mc:Choice Requires="wps">
             <w:drawing>
-              <wp:anchor distT="0" distB="0" distL="114300" distR="114300" simplePos="0" relativeHeight="251974656" behindDoc="0" locked="0" layoutInCell="1" allowOverlap="1" wp14:anchorId="406027E5" wp14:editId="3374BA1D">
+              <wp:anchor distT="0" distB="0" distL="114300" distR="114300" simplePos="0" relativeHeight="252003328" behindDoc="0" locked="0" layoutInCell="1" allowOverlap="1" wp14:anchorId="0972D54A" wp14:editId="1C61A274">
                 <wp:simplePos x="0" y="0"/>
                 <wp:positionH relativeFrom="margin">
-                  <wp:posOffset>4733925</wp:posOffset>
+                  <wp:posOffset>1428750</wp:posOffset>
                 </wp:positionH>
                 <wp:positionV relativeFrom="paragraph">
-                  <wp:posOffset>812165</wp:posOffset>
+                  <wp:posOffset>507365</wp:posOffset>
                 </wp:positionV>
-                <wp:extent cx="295275" cy="1143000"/>
-                <wp:effectExtent l="57150" t="38100" r="28575" b="19050"/>
+                <wp:extent cx="1600200" cy="962025"/>
+                <wp:effectExtent l="0" t="38100" r="57150" b="28575"/>
                 <wp:wrapNone/>
-                <wp:docPr id="1810396098" name="Straight Arrow Connector 1810396098"/>
+                <wp:docPr id="1894779451" name="Straight Arrow Connector 1894779451"/>
                 <wp:cNvGraphicFramePr/>
                 <a:graphic xmlns:a="http://schemas.openxmlformats.org/drawingml/2006/main">
                   <a:graphicData uri="http://schemas.microsoft.com/office/word/2010/wordprocessingShape">
                     <wps:wsp>
                       <wps:cNvCnPr/>
                       <wps:spPr>
-                        <a:xfrm flipH="1" flipV="1">
+                        <a:xfrm flipV="1">
                           <a:off x="0" y="0"/>
-                          <a:ext cx="295275" cy="1143000"/>
+                          <a:ext cx="1600200" cy="962025"/>
                         </a:xfrm>
                         <a:prstGeom prst="straightConnector1">
                           <a:avLst/>
@@ -5414,7 +5261,7 @@
           </mc:Choice>
           <mc:Fallback>
             <w:pict>
-              <v:shape w14:anchorId="458D2AF1" id="Straight Arrow Connector 1810396098" o:spid="_x0000_s1026" type="#_x0000_t32" style="position:absolute;margin-left:372.75pt;margin-top:63.95pt;width:23.25pt;height:90pt;flip:x y;z-index:251974656;visibility:visible;mso-wrap-style:square;mso-width-percent:0;mso-height-percent:0;mso-wrap-distance-left:9pt;mso-wrap-distance-top:0;mso-wrap-distance-right:9pt;mso-wrap-distance-bottom:0;mso-position-horizontal:absolute;mso-position-horizontal-relative:margin;mso-position-vertical:absolute;mso-position-vertical-relative:text;mso-width-percent:0;mso-height-percent:0;mso-width-relative:margin;mso-height-relative:margin" o:gfxdata="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" strokecolor="red" strokeweight="2pt">
+              <v:shape w14:anchorId="778CF84E" id="Straight Arrow Connector 1894779451" o:spid="_x0000_s1026" type="#_x0000_t32" style="position:absolute;margin-left:112.5pt;margin-top:39.95pt;width:126pt;height:75.75pt;flip:y;z-index:252003328;visibility:visible;mso-wrap-style:square;mso-width-percent:0;mso-height-percent:0;mso-wrap-distance-left:9pt;mso-wrap-distance-top:0;mso-wrap-distance-right:9pt;mso-wrap-distance-bottom:0;mso-position-horizontal:absolute;mso-position-horizontal-relative:margin;mso-position-vertical:absolute;mso-position-vertical-relative:text;mso-width-percent:0;mso-height-percent:0;mso-width-relative:margin;mso-height-relative:margin" o:gfxdata="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" strokecolor="red" strokeweight="2pt">
                 <v:stroke endarrow="open"/>
                 <w10:wrap anchorx="margin"/>
               </v:shape>
@@ -5429,18 +5276,18 @@
         <mc:AlternateContent>
           <mc:Choice Requires="wps">
             <w:drawing>
-              <wp:anchor distT="0" distB="0" distL="114300" distR="114300" simplePos="0" relativeHeight="251978752" behindDoc="0" locked="0" layoutInCell="1" allowOverlap="1" wp14:anchorId="3278DA33" wp14:editId="04F72657">
+              <wp:anchor distT="0" distB="0" distL="114300" distR="114300" simplePos="0" relativeHeight="252001280" behindDoc="0" locked="0" layoutInCell="1" allowOverlap="1" wp14:anchorId="3B2C13CC" wp14:editId="0EF44628">
                 <wp:simplePos x="0" y="0"/>
                 <wp:positionH relativeFrom="margin">
-                  <wp:posOffset>1466850</wp:posOffset>
+                  <wp:posOffset>1409700</wp:posOffset>
                 </wp:positionH>
                 <wp:positionV relativeFrom="paragraph">
-                  <wp:posOffset>688340</wp:posOffset>
+                  <wp:posOffset>469265</wp:posOffset>
                 </wp:positionV>
-                <wp:extent cx="666750" cy="1238250"/>
-                <wp:effectExtent l="0" t="38100" r="57150" b="19050"/>
+                <wp:extent cx="895350" cy="1000125"/>
+                <wp:effectExtent l="0" t="38100" r="57150" b="28575"/>
                 <wp:wrapNone/>
-                <wp:docPr id="1946876270" name="Straight Arrow Connector 1946876270"/>
+                <wp:docPr id="1368467728" name="Straight Arrow Connector 1368467728"/>
                 <wp:cNvGraphicFramePr/>
                 <a:graphic xmlns:a="http://schemas.openxmlformats.org/drawingml/2006/main">
                   <a:graphicData uri="http://schemas.microsoft.com/office/word/2010/wordprocessingShape">
@@ -5449,7 +5296,7 @@
                       <wps:spPr>
                         <a:xfrm flipV="1">
                           <a:off x="0" y="0"/>
-                          <a:ext cx="666750" cy="1238250"/>
+                          <a:ext cx="895350" cy="1000125"/>
                         </a:xfrm>
                         <a:prstGeom prst="straightConnector1">
                           <a:avLst/>
@@ -5490,7 +5337,7 @@
           </mc:Choice>
           <mc:Fallback>
             <w:pict>
-              <v:shape w14:anchorId="60697D2C" id="Straight Arrow Connector 1946876270" o:spid="_x0000_s1026" type="#_x0000_t32" style="position:absolute;margin-left:115.5pt;margin-top:54.2pt;width:52.5pt;height:97.5pt;flip:y;z-index:251978752;visibility:visible;mso-wrap-style:square;mso-width-percent:0;mso-height-percent:0;mso-wrap-distance-left:9pt;mso-wrap-distance-top:0;mso-wrap-distance-right:9pt;mso-wrap-distance-bottom:0;mso-position-horizontal:absolute;mso-position-horizontal-relative:margin;mso-position-vertical:absolute;mso-position-vertical-relative:text;mso-width-percent:0;mso-height-percent:0;mso-width-relative:margin;mso-height-relative:margin" o:gfxdata="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" strokecolor="red" strokeweight="2pt">
+              <v:shape w14:anchorId="0A950F44" id="Straight Arrow Connector 1368467728" o:spid="_x0000_s1026" type="#_x0000_t32" style="position:absolute;margin-left:111pt;margin-top:36.95pt;width:70.5pt;height:78.75pt;flip:y;z-index:252001280;visibility:visible;mso-wrap-style:square;mso-width-percent:0;mso-height-percent:0;mso-wrap-distance-left:9pt;mso-wrap-distance-top:0;mso-wrap-distance-right:9pt;mso-wrap-distance-bottom:0;mso-position-horizontal:absolute;mso-position-horizontal-relative:margin;mso-position-vertical:absolute;mso-position-vertical-relative:text;mso-width-percent:0;mso-height-percent:0;mso-width-relative:margin;mso-height-relative:margin" o:gfxdata="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" strokecolor="red" strokeweight="2pt">
                 <v:stroke endarrow="open"/>
                 <w10:wrap anchorx="margin"/>
               </v:shape>
@@ -5501,13 +5348,317 @@
       <w:r>
         <w:rPr>
           <w:noProof/>
+        </w:rPr>
+        <mc:AlternateContent>
+          <mc:Choice Requires="wps">
+            <w:drawing>
+              <wp:anchor distT="0" distB="0" distL="114300" distR="114300" simplePos="0" relativeHeight="251999232" behindDoc="0" locked="0" layoutInCell="1" allowOverlap="1" wp14:anchorId="7762B8CC" wp14:editId="42B3CA96">
+                <wp:simplePos x="0" y="0"/>
+                <wp:positionH relativeFrom="margin">
+                  <wp:posOffset>1400174</wp:posOffset>
+                </wp:positionH>
+                <wp:positionV relativeFrom="paragraph">
+                  <wp:posOffset>478790</wp:posOffset>
+                </wp:positionV>
+                <wp:extent cx="381000" cy="981075"/>
+                <wp:effectExtent l="0" t="38100" r="57150" b="28575"/>
+                <wp:wrapNone/>
+                <wp:docPr id="1932519491" name="Straight Arrow Connector 1932519491"/>
+                <wp:cNvGraphicFramePr/>
+                <a:graphic xmlns:a="http://schemas.openxmlformats.org/drawingml/2006/main">
+                  <a:graphicData uri="http://schemas.microsoft.com/office/word/2010/wordprocessingShape">
+                    <wps:wsp>
+                      <wps:cNvCnPr/>
+                      <wps:spPr>
+                        <a:xfrm flipV="1">
+                          <a:off x="0" y="0"/>
+                          <a:ext cx="381000" cy="981075"/>
+                        </a:xfrm>
+                        <a:prstGeom prst="straightConnector1">
+                          <a:avLst/>
+                        </a:prstGeom>
+                        <a:ln w="25400">
+                          <a:solidFill>
+                            <a:srgbClr val="FF0000"/>
+                          </a:solidFill>
+                          <a:tailEnd type="arrow"/>
+                        </a:ln>
+                      </wps:spPr>
+                      <wps:style>
+                        <a:lnRef idx="1">
+                          <a:schemeClr val="accent1"/>
+                        </a:lnRef>
+                        <a:fillRef idx="0">
+                          <a:schemeClr val="accent1"/>
+                        </a:fillRef>
+                        <a:effectRef idx="0">
+                          <a:schemeClr val="accent1"/>
+                        </a:effectRef>
+                        <a:fontRef idx="minor">
+                          <a:schemeClr val="tx1"/>
+                        </a:fontRef>
+                      </wps:style>
+                      <wps:bodyPr/>
+                    </wps:wsp>
+                  </a:graphicData>
+                </a:graphic>
+                <wp14:sizeRelH relativeFrom="margin">
+                  <wp14:pctWidth>0</wp14:pctWidth>
+                </wp14:sizeRelH>
+                <wp14:sizeRelV relativeFrom="margin">
+                  <wp14:pctHeight>0</wp14:pctHeight>
+                </wp14:sizeRelV>
+              </wp:anchor>
+            </w:drawing>
+          </mc:Choice>
+          <mc:Fallback>
+            <w:pict>
+              <v:shape w14:anchorId="3C87D1DD" id="Straight Arrow Connector 1932519491" o:spid="_x0000_s1026" type="#_x0000_t32" style="position:absolute;margin-left:110.25pt;margin-top:37.7pt;width:30pt;height:77.25pt;flip:y;z-index:251999232;visibility:visible;mso-wrap-style:square;mso-width-percent:0;mso-height-percent:0;mso-wrap-distance-left:9pt;mso-wrap-distance-top:0;mso-wrap-distance-right:9pt;mso-wrap-distance-bottom:0;mso-position-horizontal:absolute;mso-position-horizontal-relative:margin;mso-position-vertical:absolute;mso-position-vertical-relative:text;mso-width-percent:0;mso-height-percent:0;mso-width-relative:margin;mso-height-relative:margin" o:gfxdata="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" strokecolor="red" strokeweight="2pt">
+                <v:stroke endarrow="open"/>
+                <w10:wrap anchorx="margin"/>
+              </v:shape>
+            </w:pict>
+          </mc:Fallback>
+        </mc:AlternateContent>
+      </w:r>
+      <w:r>
+        <w:rPr>
+          <w:noProof/>
+        </w:rPr>
+        <mc:AlternateContent>
+          <mc:Choice Requires="wps">
+            <w:drawing>
+              <wp:anchor distT="0" distB="0" distL="114300" distR="114300" simplePos="0" relativeHeight="251997184" behindDoc="0" locked="0" layoutInCell="1" allowOverlap="1" wp14:anchorId="72299D3F" wp14:editId="32686CA4">
+                <wp:simplePos x="0" y="0"/>
+                <wp:positionH relativeFrom="margin">
+                  <wp:posOffset>1438275</wp:posOffset>
+                </wp:positionH>
+                <wp:positionV relativeFrom="paragraph">
+                  <wp:posOffset>469264</wp:posOffset>
+                </wp:positionV>
+                <wp:extent cx="3219450" cy="1000125"/>
+                <wp:effectExtent l="0" t="57150" r="0" b="28575"/>
+                <wp:wrapNone/>
+                <wp:docPr id="558094003" name="Straight Arrow Connector 558094003"/>
+                <wp:cNvGraphicFramePr/>
+                <a:graphic xmlns:a="http://schemas.openxmlformats.org/drawingml/2006/main">
+                  <a:graphicData uri="http://schemas.microsoft.com/office/word/2010/wordprocessingShape">
+                    <wps:wsp>
+                      <wps:cNvCnPr/>
+                      <wps:spPr>
+                        <a:xfrm flipV="1">
+                          <a:off x="0" y="0"/>
+                          <a:ext cx="3219450" cy="1000125"/>
+                        </a:xfrm>
+                        <a:prstGeom prst="straightConnector1">
+                          <a:avLst/>
+                        </a:prstGeom>
+                        <a:ln w="25400">
+                          <a:solidFill>
+                            <a:srgbClr val="FF0000"/>
+                          </a:solidFill>
+                          <a:tailEnd type="arrow"/>
+                        </a:ln>
+                      </wps:spPr>
+                      <wps:style>
+                        <a:lnRef idx="1">
+                          <a:schemeClr val="accent1"/>
+                        </a:lnRef>
+                        <a:fillRef idx="0">
+                          <a:schemeClr val="accent1"/>
+                        </a:fillRef>
+                        <a:effectRef idx="0">
+                          <a:schemeClr val="accent1"/>
+                        </a:effectRef>
+                        <a:fontRef idx="minor">
+                          <a:schemeClr val="tx1"/>
+                        </a:fontRef>
+                      </wps:style>
+                      <wps:bodyPr/>
+                    </wps:wsp>
+                  </a:graphicData>
+                </a:graphic>
+                <wp14:sizeRelH relativeFrom="margin">
+                  <wp14:pctWidth>0</wp14:pctWidth>
+                </wp14:sizeRelH>
+                <wp14:sizeRelV relativeFrom="margin">
+                  <wp14:pctHeight>0</wp14:pctHeight>
+                </wp14:sizeRelV>
+              </wp:anchor>
+            </w:drawing>
+          </mc:Choice>
+          <mc:Fallback>
+            <w:pict>
+              <v:shape w14:anchorId="03FA5DFF" id="Straight Arrow Connector 558094003" o:spid="_x0000_s1026" type="#_x0000_t32" style="position:absolute;margin-left:113.25pt;margin-top:36.95pt;width:253.5pt;height:78.75pt;flip:y;z-index:251997184;visibility:visible;mso-wrap-style:square;mso-width-percent:0;mso-height-percent:0;mso-wrap-distance-left:9pt;mso-wrap-distance-top:0;mso-wrap-distance-right:9pt;mso-wrap-distance-bottom:0;mso-position-horizontal:absolute;mso-position-horizontal-relative:margin;mso-position-vertical:absolute;mso-position-vertical-relative:text;mso-width-percent:0;mso-height-percent:0;mso-width-relative:margin;mso-height-relative:margin" o:gfxdata="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" strokecolor="red" strokeweight="2pt">
+                <v:stroke endarrow="open"/>
+                <w10:wrap anchorx="margin"/>
+              </v:shape>
+            </w:pict>
+          </mc:Fallback>
+        </mc:AlternateContent>
+      </w:r>
+      <w:r>
+        <w:rPr>
+          <w:noProof/>
+        </w:rPr>
+        <mc:AlternateContent>
+          <mc:Choice Requires="wps">
+            <w:drawing>
+              <wp:anchor distT="0" distB="0" distL="114300" distR="114300" simplePos="0" relativeHeight="251978752" behindDoc="0" locked="0" layoutInCell="1" allowOverlap="1" wp14:anchorId="3278DA33" wp14:editId="790B918C">
+                <wp:simplePos x="0" y="0"/>
+                <wp:positionH relativeFrom="margin">
+                  <wp:posOffset>1019174</wp:posOffset>
+                </wp:positionH>
+                <wp:positionV relativeFrom="paragraph">
+                  <wp:posOffset>488315</wp:posOffset>
+                </wp:positionV>
+                <wp:extent cx="390525" cy="990600"/>
+                <wp:effectExtent l="57150" t="38100" r="28575" b="19050"/>
+                <wp:wrapNone/>
+                <wp:docPr id="1946876270" name="Straight Arrow Connector 1946876270"/>
+                <wp:cNvGraphicFramePr/>
+                <a:graphic xmlns:a="http://schemas.openxmlformats.org/drawingml/2006/main">
+                  <a:graphicData uri="http://schemas.microsoft.com/office/word/2010/wordprocessingShape">
+                    <wps:wsp>
+                      <wps:cNvCnPr/>
+                      <wps:spPr>
+                        <a:xfrm flipH="1" flipV="1">
+                          <a:off x="0" y="0"/>
+                          <a:ext cx="390525" cy="990600"/>
+                        </a:xfrm>
+                        <a:prstGeom prst="straightConnector1">
+                          <a:avLst/>
+                        </a:prstGeom>
+                        <a:ln w="25400">
+                          <a:solidFill>
+                            <a:srgbClr val="FF0000"/>
+                          </a:solidFill>
+                          <a:tailEnd type="arrow"/>
+                        </a:ln>
+                      </wps:spPr>
+                      <wps:style>
+                        <a:lnRef idx="1">
+                          <a:schemeClr val="accent1"/>
+                        </a:lnRef>
+                        <a:fillRef idx="0">
+                          <a:schemeClr val="accent1"/>
+                        </a:fillRef>
+                        <a:effectRef idx="0">
+                          <a:schemeClr val="accent1"/>
+                        </a:effectRef>
+                        <a:fontRef idx="minor">
+                          <a:schemeClr val="tx1"/>
+                        </a:fontRef>
+                      </wps:style>
+                      <wps:bodyPr/>
+                    </wps:wsp>
+                  </a:graphicData>
+                </a:graphic>
+                <wp14:sizeRelH relativeFrom="margin">
+                  <wp14:pctWidth>0</wp14:pctWidth>
+                </wp14:sizeRelH>
+                <wp14:sizeRelV relativeFrom="margin">
+                  <wp14:pctHeight>0</wp14:pctHeight>
+                </wp14:sizeRelV>
+              </wp:anchor>
+            </w:drawing>
+          </mc:Choice>
+          <mc:Fallback>
+            <w:pict>
+              <v:shape w14:anchorId="70275A25" id="Straight Arrow Connector 1946876270" o:spid="_x0000_s1026" type="#_x0000_t32" style="position:absolute;margin-left:80.25pt;margin-top:38.45pt;width:30.75pt;height:78pt;flip:x y;z-index:251978752;visibility:visible;mso-wrap-style:square;mso-width-percent:0;mso-height-percent:0;mso-wrap-distance-left:9pt;mso-wrap-distance-top:0;mso-wrap-distance-right:9pt;mso-wrap-distance-bottom:0;mso-position-horizontal:absolute;mso-position-horizontal-relative:margin;mso-position-vertical:absolute;mso-position-vertical-relative:text;mso-width-percent:0;mso-height-percent:0;mso-width-relative:margin;mso-height-relative:margin" o:gfxdata="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" strokecolor="red" strokeweight="2pt">
+                <v:stroke endarrow="open"/>
+                <w10:wrap anchorx="margin"/>
+              </v:shape>
+            </w:pict>
+          </mc:Fallback>
+        </mc:AlternateContent>
+      </w:r>
+      <w:r>
+        <w:rPr>
+          <w:noProof/>
+        </w:rPr>
+        <mc:AlternateContent>
+          <mc:Choice Requires="wps">
+            <w:drawing>
+              <wp:anchor distT="0" distB="0" distL="114300" distR="114300" simplePos="0" relativeHeight="251974656" behindDoc="0" locked="0" layoutInCell="1" allowOverlap="1" wp14:anchorId="406027E5" wp14:editId="1D145454">
+                <wp:simplePos x="0" y="0"/>
+                <wp:positionH relativeFrom="margin">
+                  <wp:posOffset>4781549</wp:posOffset>
+                </wp:positionH>
+                <wp:positionV relativeFrom="paragraph">
+                  <wp:posOffset>383540</wp:posOffset>
+                </wp:positionV>
+                <wp:extent cx="390525" cy="1095375"/>
+                <wp:effectExtent l="0" t="38100" r="66675" b="28575"/>
+                <wp:wrapNone/>
+                <wp:docPr id="1810396098" name="Straight Arrow Connector 1810396098"/>
+                <wp:cNvGraphicFramePr/>
+                <a:graphic xmlns:a="http://schemas.openxmlformats.org/drawingml/2006/main">
+                  <a:graphicData uri="http://schemas.microsoft.com/office/word/2010/wordprocessingShape">
+                    <wps:wsp>
+                      <wps:cNvCnPr/>
+                      <wps:spPr>
+                        <a:xfrm flipV="1">
+                          <a:off x="0" y="0"/>
+                          <a:ext cx="390525" cy="1095375"/>
+                        </a:xfrm>
+                        <a:prstGeom prst="straightConnector1">
+                          <a:avLst/>
+                        </a:prstGeom>
+                        <a:ln w="25400">
+                          <a:solidFill>
+                            <a:srgbClr val="FF0000"/>
+                          </a:solidFill>
+                          <a:tailEnd type="arrow"/>
+                        </a:ln>
+                      </wps:spPr>
+                      <wps:style>
+                        <a:lnRef idx="1">
+                          <a:schemeClr val="accent1"/>
+                        </a:lnRef>
+                        <a:fillRef idx="0">
+                          <a:schemeClr val="accent1"/>
+                        </a:fillRef>
+                        <a:effectRef idx="0">
+                          <a:schemeClr val="accent1"/>
+                        </a:effectRef>
+                        <a:fontRef idx="minor">
+                          <a:schemeClr val="tx1"/>
+                        </a:fontRef>
+                      </wps:style>
+                      <wps:bodyPr/>
+                    </wps:wsp>
+                  </a:graphicData>
+                </a:graphic>
+                <wp14:sizeRelH relativeFrom="margin">
+                  <wp14:pctWidth>0</wp14:pctWidth>
+                </wp14:sizeRelH>
+                <wp14:sizeRelV relativeFrom="margin">
+                  <wp14:pctHeight>0</wp14:pctHeight>
+                </wp14:sizeRelV>
+              </wp:anchor>
+            </w:drawing>
+          </mc:Choice>
+          <mc:Fallback>
+            <w:pict>
+              <v:shape w14:anchorId="32561A1E" id="Straight Arrow Connector 1810396098" o:spid="_x0000_s1026" type="#_x0000_t32" style="position:absolute;margin-left:376.5pt;margin-top:30.2pt;width:30.75pt;height:86.25pt;flip:y;z-index:251974656;visibility:visible;mso-wrap-style:square;mso-width-percent:0;mso-height-percent:0;mso-wrap-distance-left:9pt;mso-wrap-distance-top:0;mso-wrap-distance-right:9pt;mso-wrap-distance-bottom:0;mso-position-horizontal:absolute;mso-position-horizontal-relative:margin;mso-position-vertical:absolute;mso-position-vertical-relative:text;mso-width-percent:0;mso-height-percent:0;mso-width-relative:margin;mso-height-relative:margin" o:gfxdata="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" strokecolor="red" strokeweight="2pt">
+                <v:stroke endarrow="open"/>
+                <w10:wrap anchorx="margin"/>
+              </v:shape>
+            </w:pict>
+          </mc:Fallback>
+        </mc:AlternateContent>
+      </w:r>
+      <w:r>
+        <w:rPr>
+          <w:noProof/>
           <w:color w:val="FF0000"/>
         </w:rPr>
         <w:drawing>
-          <wp:inline distT="0" distB="0" distL="0" distR="0" wp14:anchorId="2545F267" wp14:editId="7D6B3541">
-            <wp:extent cx="5524500" cy="1765361"/>
-            <wp:effectExtent l="0" t="0" r="0" b="6350"/>
-            <wp:docPr id="1045980044" name="Picture 92"/>
+          <wp:inline distT="0" distB="0" distL="0" distR="0" wp14:anchorId="0CB55317" wp14:editId="68F30B38">
+            <wp:extent cx="5619750" cy="1304070"/>
+            <wp:effectExtent l="0" t="0" r="0" b="0"/>
+            <wp:docPr id="630592250" name="Picture 86"/>
             <wp:cNvGraphicFramePr>
               <a:graphicFrameLocks xmlns:a="http://schemas.openxmlformats.org/drawingml/2006/main" noChangeAspect="1"/>
             </wp:cNvGraphicFramePr>
@@ -5515,7 +5666,7 @@
               <a:graphicData uri="http://schemas.openxmlformats.org/drawingml/2006/picture">
                 <pic:pic xmlns:pic="http://schemas.openxmlformats.org/drawingml/2006/picture">
                   <pic:nvPicPr>
-                    <pic:cNvPr id="1045980044" name="Picture 1045980044"/>
+                    <pic:cNvPr id="630592250" name="Picture 630592250"/>
                     <pic:cNvPicPr/>
                   </pic:nvPicPr>
                   <pic:blipFill>
@@ -5533,7 +5684,7 @@
                   <pic:spPr>
                     <a:xfrm>
                       <a:off x="0" y="0"/>
-                      <a:ext cx="5528744" cy="1766717"/>
+                      <a:ext cx="5635915" cy="1307821"/>
                     </a:xfrm>
                     <a:prstGeom prst="rect">
                       <a:avLst/>
@@ -5549,6 +5700,17 @@
     <w:p>
       <w:pPr>
         <w:pStyle w:val="NoSpacing"/>
+        <w:ind w:left="720"/>
+        <w:rPr>
+          <w:color w:val="FF0000"/>
+          <w:highlight w:val="lightGray"/>
+        </w:rPr>
+      </w:pPr>
+    </w:p>
+    <w:p>
+      <w:pPr>
+        <w:pStyle w:val="NoSpacing"/>
+        <w:ind w:left="720"/>
         <w:rPr>
           <w:color w:val="FF0000"/>
           <w:highlight w:val="lightGray"/>
@@ -5561,241 +5723,13 @@
         <mc:AlternateContent>
           <mc:Choice Requires="wps">
             <w:drawing>
-              <wp:anchor distT="0" distB="0" distL="114300" distR="114300" simplePos="0" relativeHeight="251976704" behindDoc="0" locked="0" layoutInCell="1" allowOverlap="1" wp14:anchorId="3E8631B8" wp14:editId="7D2F73DB">
+              <wp:anchor distT="0" distB="0" distL="114300" distR="114300" simplePos="0" relativeHeight="251972608" behindDoc="0" locked="0" layoutInCell="1" allowOverlap="1" wp14:anchorId="2EF7C989" wp14:editId="448EFA2D">
                 <wp:simplePos x="0" y="0"/>
                 <wp:positionH relativeFrom="margin">
-                  <wp:posOffset>657225</wp:posOffset>
+                  <wp:posOffset>4000500</wp:posOffset>
                 </wp:positionH>
                 <wp:positionV relativeFrom="paragraph">
-                  <wp:posOffset>177800</wp:posOffset>
-                </wp:positionV>
-                <wp:extent cx="1590675" cy="571500"/>
-                <wp:effectExtent l="0" t="0" r="28575" b="95250"/>
-                <wp:wrapNone/>
-                <wp:docPr id="213655005" name="Rectangular Callout 17"/>
-                <wp:cNvGraphicFramePr/>
-                <a:graphic xmlns:a="http://schemas.openxmlformats.org/drawingml/2006/main">
-                  <a:graphicData uri="http://schemas.microsoft.com/office/word/2010/wordprocessingShape">
-                    <wps:wsp>
-                      <wps:cNvSpPr/>
-                      <wps:spPr>
-                        <a:xfrm>
-                          <a:off x="0" y="0"/>
-                          <a:ext cx="1590675" cy="571500"/>
-                        </a:xfrm>
-                        <a:prstGeom prst="wedgeRectCallout">
-                          <a:avLst/>
-                        </a:prstGeom>
-                        <a:solidFill>
-                          <a:srgbClr val="4F81BD">
-                            <a:lumMod val="40000"/>
-                            <a:lumOff val="60000"/>
-                          </a:srgbClr>
-                        </a:solidFill>
-                        <a:ln w="25400" cap="flat" cmpd="sng" algn="ctr">
-                          <a:solidFill>
-                            <a:srgbClr val="4F81BD">
-                              <a:shade val="50000"/>
-                            </a:srgbClr>
-                          </a:solidFill>
-                          <a:prstDash val="solid"/>
-                        </a:ln>
-                        <a:effectLst/>
-                      </wps:spPr>
-                      <wps:txbx>
-                        <w:txbxContent>
-                          <w:p>
-                            <w:pPr>
-                              <w:jc w:val="center"/>
-                              <w:rPr>
-                                <w:color w:val="002060"/>
-                                <w:sz w:val="28"/>
-                                <w:szCs w:val="28"/>
-                              </w:rPr>
-                            </w:pPr>
-                            <w:r>
-                              <w:rPr>
-                                <w:color w:val="002060"/>
-                                <w:sz w:val="28"/>
-                                <w:szCs w:val="28"/>
-                              </w:rPr>
-                              <w:t xml:space="preserve">11-mm </w:t>
-                            </w:r>
-                            <w:r>
-                              <w:rPr>
-                                <w:color w:val="002060"/>
-                                <w:sz w:val="28"/>
-                                <w:szCs w:val="28"/>
-                              </w:rPr>
-                              <w:t xml:space="preserve">by 15-mm </w:t>
-                            </w:r>
-                            <w:proofErr w:type="gramStart"/>
-                            <w:r>
-                              <w:rPr>
-                                <w:color w:val="002060"/>
-                                <w:sz w:val="28"/>
-                                <w:szCs w:val="28"/>
-                              </w:rPr>
-                              <w:t>(</w:t>
-                            </w:r>
-                            <w:r>
-                              <w:rPr>
-                                <w:color w:val="002060"/>
-                                <w:sz w:val="28"/>
-                                <w:szCs w:val="28"/>
-                              </w:rPr>
-                              <w:t xml:space="preserve"> </w:t>
-                            </w:r>
-                            <w:r>
-                              <w:rPr>
-                                <w:color w:val="002060"/>
-                                <w:sz w:val="28"/>
-                                <w:szCs w:val="28"/>
-                              </w:rPr>
-                              <w:t>5</w:t>
-                            </w:r>
-                            <w:proofErr w:type="gramEnd"/>
-                            <w:r>
-                              <w:rPr>
-                                <w:color w:val="002060"/>
-                                <w:sz w:val="28"/>
-                                <w:szCs w:val="28"/>
-                              </w:rPr>
-                              <w:t xml:space="preserve"> places</w:t>
-                            </w:r>
-                            <w:r>
-                              <w:rPr>
-                                <w:color w:val="002060"/>
-                                <w:sz w:val="28"/>
-                                <w:szCs w:val="28"/>
-                              </w:rPr>
-                              <w:t>)</w:t>
-                            </w:r>
-                          </w:p>
-                        </w:txbxContent>
-                      </wps:txbx>
-                      <wps:bodyPr rot="0" spcFirstLastPara="0" vertOverflow="overflow" horzOverflow="overflow" vert="horz" wrap="square" lIns="91440" tIns="45720" rIns="91440" bIns="45720" numCol="1" spcCol="0" rtlCol="0" fromWordArt="0" anchor="ctr" anchorCtr="0" forceAA="0" compatLnSpc="1">
-                        <a:prstTxWarp prst="textNoShape">
-                          <a:avLst/>
-                        </a:prstTxWarp>
-                        <a:noAutofit/>
-                      </wps:bodyPr>
-                    </wps:wsp>
-                  </a:graphicData>
-                </a:graphic>
-                <wp14:sizeRelH relativeFrom="margin">
-                  <wp14:pctWidth>0</wp14:pctWidth>
-                </wp14:sizeRelH>
-                <wp14:sizeRelV relativeFrom="margin">
-                  <wp14:pctHeight>0</wp14:pctHeight>
-                </wp14:sizeRelV>
-              </wp:anchor>
-            </w:drawing>
-          </mc:Choice>
-          <mc:Fallback>
-            <w:pict>
-              <v:shape w14:anchorId="3E8631B8" id="_x0000_s1039" type="#_x0000_t61" style="position:absolute;margin-left:51.75pt;margin-top:14pt;width:125.25pt;height:45pt;z-index:251976704;visibility:visible;mso-wrap-style:square;mso-width-percent:0;mso-height-percent:0;mso-wrap-distance-left:9pt;mso-wrap-distance-top:0;mso-wrap-distance-right:9pt;mso-wrap-distance-bottom:0;mso-position-horizontal:absolute;mso-position-horizontal-relative:margin;mso-position-vertical:absolute;mso-position-vertical-relative:text;mso-width-percent:0;mso-height-percent:0;mso-width-relative:margin;mso-height-relative:margin;v-text-anchor:middle" o:gfxdata="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" adj="6300,24300" fillcolor="#b9cde5" strokecolor="#385d8a" strokeweight="2pt">
-                <v:textbox>
-                  <w:txbxContent>
-                    <w:p>
-                      <w:pPr>
-                        <w:jc w:val="center"/>
-                        <w:rPr>
-                          <w:color w:val="002060"/>
-                          <w:sz w:val="28"/>
-                          <w:szCs w:val="28"/>
-                        </w:rPr>
-                      </w:pPr>
-                      <w:r>
-                        <w:rPr>
-                          <w:color w:val="002060"/>
-                          <w:sz w:val="28"/>
-                          <w:szCs w:val="28"/>
-                        </w:rPr>
-                        <w:t xml:space="preserve">11-mm </w:t>
-                      </w:r>
-                      <w:r>
-                        <w:rPr>
-                          <w:color w:val="002060"/>
-                          <w:sz w:val="28"/>
-                          <w:szCs w:val="28"/>
-                        </w:rPr>
-                        <w:t xml:space="preserve">by 15-mm </w:t>
-                      </w:r>
-                      <w:proofErr w:type="gramStart"/>
-                      <w:r>
-                        <w:rPr>
-                          <w:color w:val="002060"/>
-                          <w:sz w:val="28"/>
-                          <w:szCs w:val="28"/>
-                        </w:rPr>
-                        <w:t>(</w:t>
-                      </w:r>
-                      <w:r>
-                        <w:rPr>
-                          <w:color w:val="002060"/>
-                          <w:sz w:val="28"/>
-                          <w:szCs w:val="28"/>
-                        </w:rPr>
-                        <w:t xml:space="preserve"> </w:t>
-                      </w:r>
-                      <w:r>
-                        <w:rPr>
-                          <w:color w:val="002060"/>
-                          <w:sz w:val="28"/>
-                          <w:szCs w:val="28"/>
-                        </w:rPr>
-                        <w:t>5</w:t>
-                      </w:r>
-                      <w:proofErr w:type="gramEnd"/>
-                      <w:r>
-                        <w:rPr>
-                          <w:color w:val="002060"/>
-                          <w:sz w:val="28"/>
-                          <w:szCs w:val="28"/>
-                        </w:rPr>
-                        <w:t xml:space="preserve"> places</w:t>
-                      </w:r>
-                      <w:r>
-                        <w:rPr>
-                          <w:color w:val="002060"/>
-                          <w:sz w:val="28"/>
-                          <w:szCs w:val="28"/>
-                        </w:rPr>
-                        <w:t>)</w:t>
-                      </w:r>
-                    </w:p>
-                  </w:txbxContent>
-                </v:textbox>
-                <w10:wrap anchorx="margin"/>
-              </v:shape>
-            </w:pict>
-          </mc:Fallback>
-        </mc:AlternateContent>
-      </w:r>
-    </w:p>
-    <w:p>
-      <w:pPr>
-        <w:pStyle w:val="NoSpacing"/>
-        <w:rPr>
-          <w:color w:val="FF0000"/>
-          <w:highlight w:val="lightGray"/>
-        </w:rPr>
-      </w:pPr>
-      <w:r>
-        <w:rPr>
-          <w:noProof/>
-        </w:rPr>
-        <mc:AlternateContent>
-          <mc:Choice Requires="wps">
-            <w:drawing>
-              <wp:anchor distT="0" distB="0" distL="114300" distR="114300" simplePos="0" relativeHeight="251972608" behindDoc="0" locked="0" layoutInCell="1" allowOverlap="1" wp14:anchorId="2EF7C989" wp14:editId="13C0E47B">
-                <wp:simplePos x="0" y="0"/>
-                <wp:positionH relativeFrom="margin">
-                  <wp:posOffset>4181475</wp:posOffset>
-                </wp:positionH>
-                <wp:positionV relativeFrom="paragraph">
-                  <wp:posOffset>35560</wp:posOffset>
+                  <wp:posOffset>14605</wp:posOffset>
                 </wp:positionV>
                 <wp:extent cx="1695450" cy="571500"/>
                 <wp:effectExtent l="0" t="0" r="19050" b="95250"/>
@@ -5872,7 +5806,7 @@
           </mc:Choice>
           <mc:Fallback>
             <w:pict>
-              <v:shape w14:anchorId="2EF7C989" id="_x0000_s1040" type="#_x0000_t61" style="position:absolute;margin-left:329.25pt;margin-top:2.8pt;width:133.5pt;height:45pt;z-index:251972608;visibility:visible;mso-wrap-style:square;mso-width-percent:0;mso-height-percent:0;mso-wrap-distance-left:9pt;mso-wrap-distance-top:0;mso-wrap-distance-right:9pt;mso-wrap-distance-bottom:0;mso-position-horizontal:absolute;mso-position-horizontal-relative:margin;mso-position-vertical:absolute;mso-position-vertical-relative:text;mso-width-percent:0;mso-height-percent:0;mso-width-relative:margin;mso-height-relative:margin;v-text-anchor:middle" o:gfxdata="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" adj="6300,24300" fillcolor="#b9cde5" strokecolor="#385d8a" strokeweight="2pt">
+              <v:shape w14:anchorId="2EF7C989" id="_x0000_s1039" type="#_x0000_t61" style="position:absolute;left:0;text-align:left;margin-left:315pt;margin-top:1.15pt;width:133.5pt;height:45pt;z-index:251972608;visibility:visible;mso-wrap-style:square;mso-width-percent:0;mso-height-percent:0;mso-wrap-distance-left:9pt;mso-wrap-distance-top:0;mso-wrap-distance-right:9pt;mso-wrap-distance-bottom:0;mso-position-horizontal:absolute;mso-position-horizontal-relative:margin;mso-position-vertical:absolute;mso-position-vertical-relative:text;mso-width-percent:0;mso-height-percent:0;mso-width-relative:margin;mso-height-relative:margin;v-text-anchor:middle" o:gfxdata="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" adj="6300,24300" fillcolor="#b9cde5" strokecolor="#385d8a" strokeweight="2pt">
                 <v:textbox>
                   <w:txbxContent>
                     <w:p>
@@ -5901,6 +5835,195 @@
           </mc:Fallback>
         </mc:AlternateContent>
       </w:r>
+      <w:r>
+        <w:rPr>
+          <w:noProof/>
+        </w:rPr>
+        <mc:AlternateContent>
+          <mc:Choice Requires="wps">
+            <w:drawing>
+              <wp:anchor distT="0" distB="0" distL="114300" distR="114300" simplePos="0" relativeHeight="251976704" behindDoc="0" locked="0" layoutInCell="1" allowOverlap="1" wp14:anchorId="3E8631B8" wp14:editId="328F2FF7">
+                <wp:simplePos x="0" y="0"/>
+                <wp:positionH relativeFrom="margin">
+                  <wp:posOffset>657225</wp:posOffset>
+                </wp:positionH>
+                <wp:positionV relativeFrom="paragraph">
+                  <wp:posOffset>14605</wp:posOffset>
+                </wp:positionV>
+                <wp:extent cx="1590675" cy="571500"/>
+                <wp:effectExtent l="0" t="0" r="28575" b="95250"/>
+                <wp:wrapNone/>
+                <wp:docPr id="213655005" name="Rectangular Callout 17"/>
+                <wp:cNvGraphicFramePr/>
+                <a:graphic xmlns:a="http://schemas.openxmlformats.org/drawingml/2006/main">
+                  <a:graphicData uri="http://schemas.microsoft.com/office/word/2010/wordprocessingShape">
+                    <wps:wsp>
+                      <wps:cNvSpPr/>
+                      <wps:spPr>
+                        <a:xfrm>
+                          <a:off x="0" y="0"/>
+                          <a:ext cx="1590675" cy="571500"/>
+                        </a:xfrm>
+                        <a:prstGeom prst="wedgeRectCallout">
+                          <a:avLst/>
+                        </a:prstGeom>
+                        <a:solidFill>
+                          <a:srgbClr val="4F81BD">
+                            <a:lumMod val="40000"/>
+                            <a:lumOff val="60000"/>
+                          </a:srgbClr>
+                        </a:solidFill>
+                        <a:ln w="25400" cap="flat" cmpd="sng" algn="ctr">
+                          <a:solidFill>
+                            <a:srgbClr val="4F81BD">
+                              <a:shade val="50000"/>
+                            </a:srgbClr>
+                          </a:solidFill>
+                          <a:prstDash val="solid"/>
+                        </a:ln>
+                        <a:effectLst/>
+                      </wps:spPr>
+                      <wps:txbx>
+                        <w:txbxContent>
+                          <w:p>
+                            <w:pPr>
+                              <w:jc w:val="center"/>
+                              <w:rPr>
+                                <w:color w:val="002060"/>
+                                <w:sz w:val="28"/>
+                                <w:szCs w:val="28"/>
+                              </w:rPr>
+                            </w:pPr>
+                            <w:r>
+                              <w:rPr>
+                                <w:color w:val="002060"/>
+                                <w:sz w:val="28"/>
+                                <w:szCs w:val="28"/>
+                              </w:rPr>
+                              <w:t xml:space="preserve">11-mm by 15-mm </w:t>
+                            </w:r>
+                            <w:proofErr w:type="gramStart"/>
+                            <w:r>
+                              <w:rPr>
+                                <w:color w:val="002060"/>
+                                <w:sz w:val="28"/>
+                                <w:szCs w:val="28"/>
+                              </w:rPr>
+                              <w:t xml:space="preserve">( </w:t>
+                            </w:r>
+                            <w:r>
+                              <w:rPr>
+                                <w:color w:val="002060"/>
+                                <w:sz w:val="28"/>
+                                <w:szCs w:val="28"/>
+                              </w:rPr>
+                              <w:t>5</w:t>
+                            </w:r>
+                            <w:proofErr w:type="gramEnd"/>
+                            <w:r>
+                              <w:rPr>
+                                <w:color w:val="002060"/>
+                                <w:sz w:val="28"/>
+                                <w:szCs w:val="28"/>
+                              </w:rPr>
+                              <w:t xml:space="preserve"> places)</w:t>
+                            </w:r>
+                          </w:p>
+                        </w:txbxContent>
+                      </wps:txbx>
+                      <wps:bodyPr rot="0" spcFirstLastPara="0" vertOverflow="overflow" horzOverflow="overflow" vert="horz" wrap="square" lIns="91440" tIns="45720" rIns="91440" bIns="45720" numCol="1" spcCol="0" rtlCol="0" fromWordArt="0" anchor="ctr" anchorCtr="0" forceAA="0" compatLnSpc="1">
+                        <a:prstTxWarp prst="textNoShape">
+                          <a:avLst/>
+                        </a:prstTxWarp>
+                        <a:noAutofit/>
+                      </wps:bodyPr>
+                    </wps:wsp>
+                  </a:graphicData>
+                </a:graphic>
+                <wp14:sizeRelH relativeFrom="margin">
+                  <wp14:pctWidth>0</wp14:pctWidth>
+                </wp14:sizeRelH>
+                <wp14:sizeRelV relativeFrom="margin">
+                  <wp14:pctHeight>0</wp14:pctHeight>
+                </wp14:sizeRelV>
+              </wp:anchor>
+            </w:drawing>
+          </mc:Choice>
+          <mc:Fallback>
+            <w:pict>
+              <v:shape w14:anchorId="3E8631B8" id="_x0000_s1040" type="#_x0000_t61" style="position:absolute;left:0;text-align:left;margin-left:51.75pt;margin-top:1.15pt;width:125.25pt;height:45pt;z-index:251976704;visibility:visible;mso-wrap-style:square;mso-width-percent:0;mso-height-percent:0;mso-wrap-distance-left:9pt;mso-wrap-distance-top:0;mso-wrap-distance-right:9pt;mso-wrap-distance-bottom:0;mso-position-horizontal:absolute;mso-position-horizontal-relative:margin;mso-position-vertical:absolute;mso-position-vertical-relative:text;mso-width-percent:0;mso-height-percent:0;mso-width-relative:margin;mso-height-relative:margin;v-text-anchor:middle" o:gfxdata="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" adj="6300,24300" fillcolor="#b9cde5" strokecolor="#385d8a" strokeweight="2pt">
+                <v:textbox>
+                  <w:txbxContent>
+                    <w:p>
+                      <w:pPr>
+                        <w:jc w:val="center"/>
+                        <w:rPr>
+                          <w:color w:val="002060"/>
+                          <w:sz w:val="28"/>
+                          <w:szCs w:val="28"/>
+                        </w:rPr>
+                      </w:pPr>
+                      <w:r>
+                        <w:rPr>
+                          <w:color w:val="002060"/>
+                          <w:sz w:val="28"/>
+                          <w:szCs w:val="28"/>
+                        </w:rPr>
+                        <w:t xml:space="preserve">11-mm by 15-mm </w:t>
+                      </w:r>
+                      <w:proofErr w:type="gramStart"/>
+                      <w:r>
+                        <w:rPr>
+                          <w:color w:val="002060"/>
+                          <w:sz w:val="28"/>
+                          <w:szCs w:val="28"/>
+                        </w:rPr>
+                        <w:t xml:space="preserve">( </w:t>
+                      </w:r>
+                      <w:r>
+                        <w:rPr>
+                          <w:color w:val="002060"/>
+                          <w:sz w:val="28"/>
+                          <w:szCs w:val="28"/>
+                        </w:rPr>
+                        <w:t>5</w:t>
+                      </w:r>
+                      <w:proofErr w:type="gramEnd"/>
+                      <w:r>
+                        <w:rPr>
+                          <w:color w:val="002060"/>
+                          <w:sz w:val="28"/>
+                          <w:szCs w:val="28"/>
+                        </w:rPr>
+                        <w:t xml:space="preserve"> places)</w:t>
+                      </w:r>
+                    </w:p>
+                  </w:txbxContent>
+                </v:textbox>
+                <w10:wrap anchorx="margin"/>
+              </v:shape>
+            </w:pict>
+          </mc:Fallback>
+        </mc:AlternateContent>
+      </w:r>
+    </w:p>
+    <w:p>
+      <w:pPr>
+        <w:pStyle w:val="NoSpacing"/>
+        <w:rPr>
+          <w:color w:val="FF0000"/>
+          <w:highlight w:val="lightGray"/>
+        </w:rPr>
+      </w:pPr>
+    </w:p>
+    <w:p>
+      <w:pPr>
+        <w:pStyle w:val="NoSpacing"/>
+        <w:rPr>
+          <w:color w:val="FF0000"/>
+          <w:highlight w:val="lightGray"/>
+        </w:rPr>
+      </w:pPr>
     </w:p>
     <w:p>
       <w:pPr>
@@ -5925,7 +6048,6 @@
         <w:rPr>
           <w:color w:val="000000" w:themeColor="text1"/>
         </w:rPr>
-        <w:lastRenderedPageBreak/>
         <w:t>Mount</w:t>
       </w:r>
       <w:r>
@@ -5975,6 +6097,7 @@
           <w:noProof/>
           <w:color w:val="000000" w:themeColor="text1"/>
         </w:rPr>
+        <w:lastRenderedPageBreak/>
         <w:drawing>
           <wp:inline distT="0" distB="0" distL="0" distR="0" wp14:anchorId="34345EF6" wp14:editId="7E19219A">
             <wp:extent cx="4810125" cy="1283214"/>
@@ -6598,7 +6721,6 @@
         </w:numPr>
       </w:pPr>
       <w:r>
-        <w:lastRenderedPageBreak/>
         <w:t xml:space="preserve">Label </w:t>
       </w:r>
       <w:r>
@@ -6647,10 +6769,7 @@
         <w:ind w:left="1080"/>
       </w:pPr>
       <w:r>
-        <w:t>OT-DTC</w:t>
-      </w:r>
-      <w:r>
-        <w:t>^^^^OT-DTC^^^^OT-DTC^^^^OT-DTC^^^^^^DTH^^^^^^^^L1T</w:t>
+        <w:t>TF block #1 (LABEL PRINTER FILE 03)</w:t>
       </w:r>
     </w:p>
     <w:p>
@@ -6659,7 +6778,19 @@
         <w:ind w:left="1080"/>
       </w:pPr>
       <w:r>
-        <w:t>^RECV^^^^^^RECV^^^^^^RECV^^^^^^RECV^^^^^^^XCVR^^^^^^^XMIT</w:t>
+        <w:t>OT-DTC</w:t>
+      </w:r>
+      <w:r>
+        <w:t>^^^^OT-DTC^^^^OT-DTC^^^^OT-DTC^^^^^^</w:t>
+      </w:r>
+      <w:r>
+        <w:t>L1T</w:t>
+      </w:r>
+      <w:r>
+        <w:t>^^^^^^^^</w:t>
+      </w:r>
+      <w:r>
+        <w:t>DTH</w:t>
       </w:r>
     </w:p>
     <w:p>
@@ -6668,8 +6799,156 @@
         <w:ind w:left="1080"/>
       </w:pPr>
       <w:r>
+        <w:lastRenderedPageBreak/>
+        <w:t>^RECV^^^^^^RECV^^^^^^RECV^^^^^^RECV^^^^^^^X</w:t>
+      </w:r>
+      <w:r>
+        <w:t>MIT</w:t>
+      </w:r>
+      <w:r>
+        <w:t>^^^^^^^X</w:t>
+      </w:r>
+      <w:r>
+        <w:t>CVR</w:t>
+      </w:r>
+    </w:p>
+    <w:p>
+      <w:pPr>
+        <w:pStyle w:val="NoSpacing"/>
+        <w:ind w:left="1080"/>
+      </w:pPr>
+      <w:r>
         <w:t>^^#1^^^^^^^^^#2^^^^^^^^^#3^^^^^^^^^#4</w:t>
       </w:r>
+    </w:p>
+    <w:p>
+      <w:pPr>
+        <w:pStyle w:val="NoSpacing"/>
+        <w:ind w:left="1080"/>
+      </w:pPr>
+    </w:p>
+    <w:p>
+      <w:pPr>
+        <w:pStyle w:val="NoSpacing"/>
+        <w:ind w:left="1080"/>
+      </w:pPr>
+      <w:r>
+        <w:t>IT-DTC block #1 (LABEL PRINTER FILE 04)</w:t>
+      </w:r>
+    </w:p>
+    <w:p>
+      <w:pPr>
+        <w:pStyle w:val="NoSpacing"/>
+        <w:ind w:left="1080"/>
+      </w:pPr>
+      <w:r>
+        <w:t>LUMI^1-1^^DTH^1-1^^^^^FE^1-1^^^^FE^1-2^^^^DTH^1-2^^^^FE^1-3</w:t>
+      </w:r>
+    </w:p>
+    <w:p>
+      <w:pPr>
+        <w:pStyle w:val="NoSpacing"/>
+        <w:ind w:left="1080"/>
+      </w:pPr>
+      <w:r>
+        <w:t>^^^^^^^^^^^^^^^^^^^^^^^^EMP^^^^^^^EMP^^^^^^^^^^^^^^^^^^EMP</w:t>
+      </w:r>
+    </w:p>
+    <w:p>
+      <w:pPr>
+        <w:pStyle w:val="NoSpacing"/>
+        <w:ind w:left="1080"/>
+      </w:pPr>
+      <w:r>
+        <w:t>^^^^^^^^^^^^^^^^^^^^^^^96-107^^^^^84-95^^^^^^^^^^^^^^^^^68-79</w:t>
+      </w:r>
+    </w:p>
+    <w:p>
+      <w:pPr>
+        <w:pStyle w:val="NoSpacing"/>
+        <w:ind w:left="1080"/>
+      </w:pPr>
+    </w:p>
+    <w:p>
+      <w:pPr>
+        <w:pStyle w:val="NoSpacing"/>
+        <w:ind w:left="1080"/>
+      </w:pPr>
+      <w:r>
+        <w:t>IT-DTC block #</w:t>
+      </w:r>
+      <w:r>
+        <w:t>2 (LABEL PRINTER FILE 05)</w:t>
+      </w:r>
+    </w:p>
+    <w:p>
+      <w:pPr>
+        <w:pStyle w:val="NoSpacing"/>
+        <w:ind w:left="1080"/>
+      </w:pPr>
+      <w:r>
+        <w:t>DTH^</w:t>
+      </w:r>
+      <w:r>
+        <w:t>2</w:t>
+      </w:r>
+      <w:r>
+        <w:t>-1^^^^^FE^</w:t>
+      </w:r>
+      <w:r>
+        <w:t>2</w:t>
+      </w:r>
+      <w:r>
+        <w:t>-1^^^^FE^</w:t>
+      </w:r>
+      <w:r>
+        <w:t>2</w:t>
+      </w:r>
+      <w:r>
+        <w:t>-2^^^^DTH^</w:t>
+      </w:r>
+      <w:r>
+        <w:t>2</w:t>
+      </w:r>
+      <w:r>
+        <w:t>-2^^^^FE^</w:t>
+      </w:r>
+      <w:r>
+        <w:t>2</w:t>
+      </w:r>
+      <w:r>
+        <w:t>-3</w:t>
+      </w:r>
+    </w:p>
+    <w:p>
+      <w:pPr>
+        <w:pStyle w:val="NoSpacing"/>
+        <w:ind w:left="1080"/>
+      </w:pPr>
+      <w:r>
+        <w:t>^^^^^^^^^^^^^^EMP^^^^^^^EMP^^^^^^^^^^^^^^^^^^EMP</w:t>
+      </w:r>
+    </w:p>
+    <w:p>
+      <w:pPr>
+        <w:pStyle w:val="NoSpacing"/>
+        <w:ind w:left="1080"/>
+      </w:pPr>
+      <w:r>
+        <w:t>^^^^^^^^^^^^^96-107^^^^^84-95^^^^^^^^^^^^^^^^^68-79</w:t>
+      </w:r>
+    </w:p>
+    <w:p>
+      <w:pPr>
+        <w:pStyle w:val="NoSpacing"/>
+        <w:ind w:left="1080"/>
+      </w:pPr>
+    </w:p>
+    <w:p>
+      <w:pPr>
+        <w:pStyle w:val="NoSpacing"/>
+        <w:ind w:left="1080"/>
+      </w:pPr>
     </w:p>
     <w:p>
       <w:pPr>
@@ -6718,16 +6997,16 @@
         <mc:AlternateContent>
           <mc:Choice Requires="wps">
             <w:drawing>
-              <wp:anchor distT="0" distB="0" distL="114300" distR="114300" simplePos="0" relativeHeight="251984896" behindDoc="0" locked="0" layoutInCell="1" allowOverlap="1" wp14:anchorId="1F4F43C5" wp14:editId="79E577AB">
+              <wp:anchor distT="0" distB="0" distL="114300" distR="114300" simplePos="0" relativeHeight="251984896" behindDoc="0" locked="0" layoutInCell="1" allowOverlap="1" wp14:anchorId="1F4F43C5" wp14:editId="4CCE0E48">
                 <wp:simplePos x="0" y="0"/>
                 <wp:positionH relativeFrom="margin">
-                  <wp:posOffset>2781300</wp:posOffset>
+                  <wp:posOffset>2914649</wp:posOffset>
                 </wp:positionH>
                 <wp:positionV relativeFrom="paragraph">
-                  <wp:posOffset>627379</wp:posOffset>
+                  <wp:posOffset>766444</wp:posOffset>
                 </wp:positionV>
-                <wp:extent cx="1038225" cy="142875"/>
-                <wp:effectExtent l="38100" t="76200" r="28575" b="28575"/>
+                <wp:extent cx="904875" cy="45719"/>
+                <wp:effectExtent l="38100" t="38100" r="28575" b="107315"/>
                 <wp:wrapNone/>
                 <wp:docPr id="2091075354" name="Straight Arrow Connector 2091075354"/>
                 <wp:cNvGraphicFramePr/>
@@ -6736,9 +7015,9 @@
                     <wps:wsp>
                       <wps:cNvCnPr/>
                       <wps:spPr>
-                        <a:xfrm flipH="1" flipV="1">
+                        <a:xfrm flipH="1">
                           <a:off x="0" y="0"/>
-                          <a:ext cx="1038225" cy="142875"/>
+                          <a:ext cx="904875" cy="45719"/>
                         </a:xfrm>
                         <a:prstGeom prst="straightConnector1">
                           <a:avLst/>
@@ -6779,7 +7058,7 @@
           </mc:Choice>
           <mc:Fallback>
             <w:pict>
-              <v:shape w14:anchorId="5512AEF5" id="Straight Arrow Connector 2091075354" o:spid="_x0000_s1026" type="#_x0000_t32" style="position:absolute;margin-left:219pt;margin-top:49.4pt;width:81.75pt;height:11.25pt;flip:x y;z-index:251984896;visibility:visible;mso-wrap-style:square;mso-width-percent:0;mso-height-percent:0;mso-wrap-distance-left:9pt;mso-wrap-distance-top:0;mso-wrap-distance-right:9pt;mso-wrap-distance-bottom:0;mso-position-horizontal:absolute;mso-position-horizontal-relative:margin;mso-position-vertical:absolute;mso-position-vertical-relative:text;mso-width-percent:0;mso-height-percent:0;mso-width-relative:margin;mso-height-relative:margin" o:gfxdata="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" strokecolor="red" strokeweight="2pt">
+              <v:shape w14:anchorId="4647A576" id="Straight Arrow Connector 2091075354" o:spid="_x0000_s1026" type="#_x0000_t32" style="position:absolute;margin-left:229.5pt;margin-top:60.35pt;width:71.25pt;height:3.6pt;flip:x;z-index:251984896;visibility:visible;mso-wrap-style:square;mso-width-percent:0;mso-height-percent:0;mso-wrap-distance-left:9pt;mso-wrap-distance-top:0;mso-wrap-distance-right:9pt;mso-wrap-distance-bottom:0;mso-position-horizontal:absolute;mso-position-horizontal-relative:margin;mso-position-vertical:absolute;mso-position-vertical-relative:text;mso-width-percent:0;mso-height-percent:0;mso-width-relative:margin;mso-height-relative:margin" o:gfxdata="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" strokecolor="red" strokeweight="2pt">
                 <v:stroke endarrow="open"/>
                 <w10:wrap anchorx="margin"/>
               </v:shape>
@@ -6911,10 +7190,10 @@
           <w:noProof/>
         </w:rPr>
         <w:drawing>
-          <wp:inline distT="0" distB="0" distL="0" distR="0" wp14:anchorId="70AE2C79" wp14:editId="4138CBF8">
-            <wp:extent cx="2971800" cy="2073910"/>
-            <wp:effectExtent l="0" t="0" r="0" b="2540"/>
-            <wp:docPr id="2077385870" name="Picture 96"/>
+          <wp:inline distT="0" distB="0" distL="0" distR="0" wp14:anchorId="54959007" wp14:editId="41FB8390">
+            <wp:extent cx="3113835" cy="2533650"/>
+            <wp:effectExtent l="0" t="0" r="0" b="0"/>
+            <wp:docPr id="1568429758" name="Picture 87"/>
             <wp:cNvGraphicFramePr>
               <a:graphicFrameLocks xmlns:a="http://schemas.openxmlformats.org/drawingml/2006/main" noChangeAspect="1"/>
             </wp:cNvGraphicFramePr>
@@ -6922,7 +7201,7 @@
               <a:graphicData uri="http://schemas.openxmlformats.org/drawingml/2006/picture">
                 <pic:pic xmlns:pic="http://schemas.openxmlformats.org/drawingml/2006/picture">
                   <pic:nvPicPr>
-                    <pic:cNvPr id="2077385870" name="Picture 2077385870"/>
+                    <pic:cNvPr id="1568429758" name="Picture 1568429758"/>
                     <pic:cNvPicPr/>
                   </pic:nvPicPr>
                   <pic:blipFill>
@@ -6940,7 +7219,7 @@
                   <pic:spPr>
                     <a:xfrm>
                       <a:off x="0" y="0"/>
-                      <a:ext cx="2976244" cy="2077011"/>
+                      <a:ext cx="3123818" cy="2541773"/>
                     </a:xfrm>
                     <a:prstGeom prst="rect">
                       <a:avLst/>
@@ -6979,19 +7258,20 @@
         <w:rPr>
           <w:noProof/>
         </w:rPr>
+        <w:lastRenderedPageBreak/>
         <mc:AlternateContent>
           <mc:Choice Requires="wps">
             <w:drawing>
-              <wp:anchor distT="0" distB="0" distL="114300" distR="114300" simplePos="0" relativeHeight="251986944" behindDoc="0" locked="0" layoutInCell="1" allowOverlap="1" wp14:anchorId="67E4B923" wp14:editId="7EBA47CB">
+              <wp:anchor distT="0" distB="0" distL="114300" distR="114300" simplePos="0" relativeHeight="251986944" behindDoc="0" locked="0" layoutInCell="1" allowOverlap="1" wp14:anchorId="67E4B923" wp14:editId="7186EC6C">
                 <wp:simplePos x="0" y="0"/>
                 <wp:positionH relativeFrom="margin">
-                  <wp:posOffset>2771774</wp:posOffset>
+                  <wp:posOffset>2933699</wp:posOffset>
                 </wp:positionH>
                 <wp:positionV relativeFrom="paragraph">
-                  <wp:posOffset>447039</wp:posOffset>
+                  <wp:posOffset>615314</wp:posOffset>
                 </wp:positionV>
-                <wp:extent cx="1095375" cy="409575"/>
-                <wp:effectExtent l="38100" t="57150" r="28575" b="28575"/>
+                <wp:extent cx="933450" cy="238125"/>
+                <wp:effectExtent l="38100" t="57150" r="19050" b="28575"/>
                 <wp:wrapNone/>
                 <wp:docPr id="859267153" name="Straight Arrow Connector 859267153"/>
                 <wp:cNvGraphicFramePr/>
@@ -7002,7 +7282,7 @@
                       <wps:spPr>
                         <a:xfrm flipH="1" flipV="1">
                           <a:off x="0" y="0"/>
-                          <a:ext cx="1095375" cy="409575"/>
+                          <a:ext cx="933450" cy="238125"/>
                         </a:xfrm>
                         <a:prstGeom prst="straightConnector1">
                           <a:avLst/>
@@ -7043,7 +7323,7 @@
           </mc:Choice>
           <mc:Fallback>
             <w:pict>
-              <v:shape w14:anchorId="50361BAA" id="Straight Arrow Connector 859267153" o:spid="_x0000_s1026" type="#_x0000_t32" style="position:absolute;margin-left:218.25pt;margin-top:35.2pt;width:86.25pt;height:32.25pt;flip:x y;z-index:251986944;visibility:visible;mso-wrap-style:square;mso-width-percent:0;mso-height-percent:0;mso-wrap-distance-left:9pt;mso-wrap-distance-top:0;mso-wrap-distance-right:9pt;mso-wrap-distance-bottom:0;mso-position-horizontal:absolute;mso-position-horizontal-relative:margin;mso-position-vertical:absolute;mso-position-vertical-relative:text;mso-width-percent:0;mso-height-percent:0;mso-width-relative:margin;mso-height-relative:margin" o:gfxdata="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" strokecolor="red" strokeweight="2pt">
+              <v:shape w14:anchorId="71C85DD9" id="Straight Arrow Connector 859267153" o:spid="_x0000_s1026" type="#_x0000_t32" style="position:absolute;margin-left:231pt;margin-top:48.45pt;width:73.5pt;height:18.75pt;flip:x y;z-index:251986944;visibility:visible;mso-wrap-style:square;mso-width-percent:0;mso-height-percent:0;mso-wrap-distance-left:9pt;mso-wrap-distance-top:0;mso-wrap-distance-right:9pt;mso-wrap-distance-bottom:0;mso-position-horizontal:absolute;mso-position-horizontal-relative:margin;mso-position-vertical:absolute;mso-position-vertical-relative:text;mso-width-percent:0;mso-height-percent:0;mso-width-relative:margin;mso-height-relative:margin" o:gfxdata="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" strokecolor="red" strokeweight="2pt">
                 <v:stroke endarrow="open"/>
                 <w10:wrap anchorx="margin"/>
               </v:shape>
@@ -7116,23 +7396,7 @@
                                 <w:sz w:val="28"/>
                                 <w:szCs w:val="28"/>
                               </w:rPr>
-                              <w:t xml:space="preserve">Viewed from </w:t>
-                            </w:r>
-                            <w:r>
-                              <w:rPr>
-                                <w:color w:val="002060"/>
-                                <w:sz w:val="28"/>
-                                <w:szCs w:val="28"/>
-                              </w:rPr>
-                              <w:t>bottom</w:t>
-                            </w:r>
-                            <w:r>
-                              <w:rPr>
-                                <w:color w:val="002060"/>
-                                <w:sz w:val="28"/>
-                                <w:szCs w:val="28"/>
-                              </w:rPr>
-                              <w:t xml:space="preserve"> side of CM</w:t>
+                              <w:t>Viewed from bottom side of CM</w:t>
                             </w:r>
                           </w:p>
                         </w:txbxContent>
@@ -7175,23 +7439,7 @@
                           <w:sz w:val="28"/>
                           <w:szCs w:val="28"/>
                         </w:rPr>
-                        <w:t xml:space="preserve">Viewed from </w:t>
-                      </w:r>
-                      <w:r>
-                        <w:rPr>
-                          <w:color w:val="002060"/>
-                          <w:sz w:val="28"/>
-                          <w:szCs w:val="28"/>
-                        </w:rPr>
-                        <w:t>bottom</w:t>
-                      </w:r>
-                      <w:r>
-                        <w:rPr>
-                          <w:color w:val="002060"/>
-                          <w:sz w:val="28"/>
-                          <w:szCs w:val="28"/>
-                        </w:rPr>
-                        <w:t xml:space="preserve"> side of CM</w:t>
+                        <w:t>Viewed from bottom side of CM</w:t>
                       </w:r>
                     </w:p>
                   </w:txbxContent>
@@ -7207,10 +7455,10 @@
           <w:noProof/>
         </w:rPr>
         <w:drawing>
-          <wp:inline distT="0" distB="0" distL="0" distR="0" wp14:anchorId="3764291A" wp14:editId="3945AE34">
-            <wp:extent cx="2989128" cy="1971675"/>
-            <wp:effectExtent l="0" t="0" r="1905" b="0"/>
-            <wp:docPr id="1837915855" name="Picture 97"/>
+          <wp:inline distT="0" distB="0" distL="0" distR="0" wp14:anchorId="49A5AB4A" wp14:editId="0AA6F46C">
+            <wp:extent cx="3114675" cy="2562286"/>
+            <wp:effectExtent l="0" t="0" r="0" b="9525"/>
+            <wp:docPr id="494508205" name="Picture 88"/>
             <wp:cNvGraphicFramePr>
               <a:graphicFrameLocks xmlns:a="http://schemas.openxmlformats.org/drawingml/2006/main" noChangeAspect="1"/>
             </wp:cNvGraphicFramePr>
@@ -7218,7 +7466,7 @@
               <a:graphicData uri="http://schemas.openxmlformats.org/drawingml/2006/picture">
                 <pic:pic xmlns:pic="http://schemas.openxmlformats.org/drawingml/2006/picture">
                   <pic:nvPicPr>
-                    <pic:cNvPr id="1837915855" name="Picture 1837915855"/>
+                    <pic:cNvPr id="494508205" name="Picture 494508205"/>
                     <pic:cNvPicPr/>
                   </pic:nvPicPr>
                   <pic:blipFill>
@@ -7236,7 +7484,7 @@
                   <pic:spPr>
                     <a:xfrm>
                       <a:off x="0" y="0"/>
-                      <a:ext cx="2996979" cy="1976854"/>
+                      <a:ext cx="3124191" cy="2570114"/>
                     </a:xfrm>
                     <a:prstGeom prst="rect">
                       <a:avLst/>
@@ -7525,6 +7773,7 @@
         <w:rPr>
           <w:noProof/>
         </w:rPr>
+        <w:lastRenderedPageBreak/>
         <mc:AlternateContent>
           <mc:Choice Requires="wps">
             <w:drawing>
@@ -8131,27 +8380,14 @@
       <w:r>
         <w:t xml:space="preserve">Figure </w:t>
       </w:r>
-      <w:r>
-        <w:fldChar w:fldCharType="begin"/>
-      </w:r>
-      <w:r>
-        <w:instrText xml:space="preserve"> SEQ Figure \* ARABIC </w:instrText>
-      </w:r>
-      <w:r>
-        <w:fldChar w:fldCharType="separate"/>
-      </w:r>
-      <w:r>
-        <w:rPr>
-          <w:noProof/>
-        </w:rPr>
-        <w:t>1</w:t>
-      </w:r>
-      <w:r>
-        <w:rPr>
-          <w:noProof/>
-        </w:rPr>
-        <w:fldChar w:fldCharType="end"/>
-      </w:r>
+      <w:fldSimple w:instr=" SEQ Figure \* ARABIC ">
+        <w:r>
+          <w:rPr>
+            <w:noProof/>
+          </w:rPr>
+          <w:t>1</w:t>
+        </w:r>
+      </w:fldSimple>
       <w:r>
         <w:t xml:space="preserve"> Correct alignment of the Retaining Clip for Insertion</w:t>
       </w:r>
@@ -8190,7 +8426,6 @@
         <w:rPr>
           <w:noProof/>
         </w:rPr>
-        <w:lastRenderedPageBreak/>
         <mc:AlternateContent>
           <mc:Choice Requires="wps">
             <w:drawing>
@@ -8435,7 +8670,7 @@
                 <wp:effectExtent l="0" t="0" r="0" b="0"/>
                 <wp:wrapNone/>
                 <wp:docPr id="915758012" name="TextBox 27"/>
-                <wp:cNvGraphicFramePr xmlns:a="http://schemas.openxmlformats.org/drawingml/2006/main"/>
+                <wp:cNvGraphicFramePr/>
                 <a:graphic xmlns:a="http://schemas.openxmlformats.org/drawingml/2006/main">
                   <a:graphicData uri="http://schemas.microsoft.com/office/word/2010/wordprocessingShape">
                     <wps:wsp>
@@ -8639,7 +8874,7 @@
                 <wp:effectExtent l="0" t="0" r="0" b="0"/>
                 <wp:wrapNone/>
                 <wp:docPr id="1773623729" name="TextBox 24"/>
-                <wp:cNvGraphicFramePr xmlns:a="http://schemas.openxmlformats.org/drawingml/2006/main"/>
+                <wp:cNvGraphicFramePr/>
                 <a:graphic xmlns:a="http://schemas.openxmlformats.org/drawingml/2006/main">
                   <a:graphicData uri="http://schemas.microsoft.com/office/word/2010/wordprocessingShape">
                     <wps:wsp>
@@ -8793,27 +9028,14 @@
       <w:r>
         <w:t xml:space="preserve">Figure </w:t>
       </w:r>
-      <w:r>
-        <w:fldChar w:fldCharType="begin"/>
-      </w:r>
-      <w:r>
-        <w:instrText xml:space="preserve"> SEQ Figure \* ARABIC </w:instrText>
-      </w:r>
-      <w:r>
-        <w:fldChar w:fldCharType="separate"/>
-      </w:r>
-      <w:r>
-        <w:rPr>
-          <w:noProof/>
-        </w:rPr>
-        <w:t>2</w:t>
-      </w:r>
-      <w:r>
-        <w:rPr>
-          <w:noProof/>
-        </w:rPr>
-        <w:fldChar w:fldCharType="end"/>
-      </w:r>
+      <w:fldSimple w:instr=" SEQ Figure \* ARABIC ">
+        <w:r>
+          <w:rPr>
+            <w:noProof/>
+          </w:rPr>
+          <w:t>2</w:t>
+        </w:r>
+      </w:fldSimple>
       <w:r>
         <w:t xml:space="preserve"> Incorrect positioning of the Retaining Clip</w:t>
       </w:r>
@@ -8837,6 +9059,7 @@
         <w:rPr>
           <w:noProof/>
         </w:rPr>
+        <w:lastRenderedPageBreak/>
         <mc:AlternateContent>
           <mc:Choice Requires="wps">
             <w:drawing>
@@ -9004,7 +9227,7 @@
                 <wp:effectExtent l="0" t="0" r="0" b="0"/>
                 <wp:wrapNone/>
                 <wp:docPr id="1014526562" name="TextBox 34"/>
-                <wp:cNvGraphicFramePr xmlns:a="http://schemas.openxmlformats.org/drawingml/2006/main"/>
+                <wp:cNvGraphicFramePr/>
                 <a:graphic xmlns:a="http://schemas.openxmlformats.org/drawingml/2006/main">
                   <a:graphicData uri="http://schemas.microsoft.com/office/word/2010/wordprocessingShape">
                     <wps:wsp>
@@ -9105,7 +9328,7 @@
                 <wp:effectExtent l="0" t="0" r="0" b="0"/>
                 <wp:wrapNone/>
                 <wp:docPr id="1408507827" name="TextBox 35"/>
-                <wp:cNvGraphicFramePr xmlns:a="http://schemas.openxmlformats.org/drawingml/2006/main"/>
+                <wp:cNvGraphicFramePr/>
                 <a:graphic xmlns:a="http://schemas.openxmlformats.org/drawingml/2006/main">
                   <a:graphicData uri="http://schemas.microsoft.com/office/word/2010/wordprocessingShape">
                     <wps:wsp>
@@ -9283,27 +9506,14 @@
       <w:r>
         <w:t xml:space="preserve">Figure </w:t>
       </w:r>
-      <w:r>
-        <w:fldChar w:fldCharType="begin"/>
-      </w:r>
-      <w:r>
-        <w:instrText xml:space="preserve"> SEQ Figure \* ARABIC </w:instrText>
-      </w:r>
-      <w:r>
-        <w:fldChar w:fldCharType="separate"/>
-      </w:r>
-      <w:r>
-        <w:rPr>
-          <w:noProof/>
-        </w:rPr>
-        <w:t>3</w:t>
-      </w:r>
-      <w:r>
-        <w:rPr>
-          <w:noProof/>
-        </w:rPr>
-        <w:fldChar w:fldCharType="end"/>
-      </w:r>
+      <w:fldSimple w:instr=" SEQ Figure \* ARABIC ">
+        <w:r>
+          <w:rPr>
+            <w:noProof/>
+          </w:rPr>
+          <w:t>3</w:t>
+        </w:r>
+      </w:fldSimple>
       <w:r>
         <w:t xml:space="preserve"> Bent Retaining Clip Receiver</w:t>
       </w:r>
@@ -9404,7 +9614,6 @@
         <w:rPr>
           <w:color w:val="000000" w:themeColor="text1"/>
         </w:rPr>
-        <w:lastRenderedPageBreak/>
         <w:t>Some incorrect alignment issues are shown below. They may be slightly exaggerated.</w:t>
       </w:r>
     </w:p>
@@ -9667,7 +9876,7 @@
                 <wp:effectExtent l="0" t="0" r="0" b="0"/>
                 <wp:wrapNone/>
                 <wp:docPr id="1758225179" name="TextBox 9"/>
-                <wp:cNvGraphicFramePr xmlns:a="http://schemas.openxmlformats.org/drawingml/2006/main"/>
+                <wp:cNvGraphicFramePr/>
                 <a:graphic xmlns:a="http://schemas.openxmlformats.org/drawingml/2006/main">
                   <a:graphicData uri="http://schemas.microsoft.com/office/word/2010/wordprocessingShape">
                     <wps:wsp>
@@ -9912,6 +10121,7 @@
         <w:rPr>
           <w:noProof/>
         </w:rPr>
+        <w:lastRenderedPageBreak/>
         <mc:AlternateContent>
           <mc:Choice Requires="wps">
             <w:drawing>
@@ -10004,7 +10214,7 @@
                 <wp:effectExtent l="0" t="0" r="0" b="0"/>
                 <wp:wrapNone/>
                 <wp:docPr id="2115547542" name="TextBox 18"/>
-                <wp:cNvGraphicFramePr xmlns:a="http://schemas.openxmlformats.org/drawingml/2006/main"/>
+                <wp:cNvGraphicFramePr/>
                 <a:graphic xmlns:a="http://schemas.openxmlformats.org/drawingml/2006/main">
                   <a:graphicData uri="http://schemas.microsoft.com/office/word/2010/wordprocessingShape">
                     <wps:wsp>
@@ -10603,7 +10813,6 @@
           <w:noProof/>
           <w:color w:val="000000" w:themeColor="text1"/>
         </w:rPr>
-        <w:lastRenderedPageBreak/>
         <mc:AlternateContent>
           <mc:Choice Requires="wps">
             <w:drawing>
@@ -10619,7 +10828,7 @@
                 <wp:effectExtent l="0" t="0" r="0" b="0"/>
                 <wp:wrapNone/>
                 <wp:docPr id="2081983714" name="TextBox 39"/>
-                <wp:cNvGraphicFramePr xmlns:a="http://schemas.openxmlformats.org/drawingml/2006/main"/>
+                <wp:cNvGraphicFramePr/>
                 <a:graphic xmlns:a="http://schemas.openxmlformats.org/drawingml/2006/main">
                   <a:graphicData uri="http://schemas.microsoft.com/office/word/2010/wordprocessingShape">
                     <wps:wsp>
@@ -10806,7 +11015,7 @@
                 <wp:effectExtent l="57150" t="38100" r="71755" b="83820"/>
                 <wp:wrapNone/>
                 <wp:docPr id="1785434201" name="Straight Arrow Connector 22"/>
-                <wp:cNvGraphicFramePr xmlns:a="http://schemas.openxmlformats.org/drawingml/2006/main">
+                <wp:cNvGraphicFramePr>
                   <a:graphicFrameLocks xmlns:a="http://schemas.openxmlformats.org/drawingml/2006/main"/>
                 </wp:cNvGraphicFramePr>
                 <a:graphic xmlns:a="http://schemas.openxmlformats.org/drawingml/2006/main">
@@ -11182,6 +11391,7 @@
         <w:rPr>
           <w:noProof/>
         </w:rPr>
+        <w:lastRenderedPageBreak/>
         <mc:AlternateContent>
           <mc:Choice Requires="wps">
             <w:drawing>
@@ -11274,7 +11484,7 @@
                 <wp:effectExtent l="0" t="0" r="0" b="0"/>
                 <wp:wrapNone/>
                 <wp:docPr id="580237914" name="TextBox 57"/>
-                <wp:cNvGraphicFramePr xmlns:a="http://schemas.openxmlformats.org/drawingml/2006/main"/>
+                <wp:cNvGraphicFramePr/>
                 <a:graphic xmlns:a="http://schemas.openxmlformats.org/drawingml/2006/main">
                   <a:graphicData uri="http://schemas.microsoft.com/office/word/2010/wordprocessingShape">
                     <wps:wsp>
@@ -11696,7 +11906,7 @@
                 <wp:effectExtent l="0" t="0" r="0" b="0"/>
                 <wp:wrapNone/>
                 <wp:docPr id="1841412356" name="TextBox 63"/>
-                <wp:cNvGraphicFramePr xmlns:a="http://schemas.openxmlformats.org/drawingml/2006/main"/>
+                <wp:cNvGraphicFramePr/>
                 <a:graphic xmlns:a="http://schemas.openxmlformats.org/drawingml/2006/main">
                   <a:graphicData uri="http://schemas.microsoft.com/office/word/2010/wordprocessingShape">
                     <wps:wsp>

</xml_diff>